<commit_message>
Analisi del Dominio completata
</commit_message>
<xml_diff>
--- a/3_Documentazione/Documentazione.docx
+++ b/3_Documentazione/Documentazione.docx
@@ -67,7 +67,7 @@
       <w:pPr>
         <w:pStyle w:val="Titolo1"/>
       </w:pPr>
-      <w:bookmarkStart w:id="0" w:name="_Toc239751091"/>
+      <w:bookmarkStart w:id="0" w:name="_Toc239861543"/>
       <w:r>
         <w:lastRenderedPageBreak/>
         <w:t>Indice</w:t>
@@ -140,7 +140,7 @@
         <w:rPr>
           <w:noProof/>
         </w:rPr>
-        <w:instrText xml:space="preserve"> PAGEREF _Toc239751091 \h </w:instrText>
+        <w:instrText xml:space="preserve"> PAGEREF _Toc239861543 \h </w:instrText>
       </w:r>
       <w:r>
         <w:rPr>
@@ -223,7 +223,7 @@
         <w:rPr>
           <w:noProof/>
         </w:rPr>
-        <w:instrText xml:space="preserve"> PAGEREF _Toc239751092 \h </w:instrText>
+        <w:instrText xml:space="preserve"> PAGEREF _Toc239861544 \h </w:instrText>
       </w:r>
       <w:r>
         <w:rPr>
@@ -306,7 +306,7 @@
         <w:rPr>
           <w:noProof/>
         </w:rPr>
-        <w:instrText xml:space="preserve"> PAGEREF _Toc239751093 \h </w:instrText>
+        <w:instrText xml:space="preserve"> PAGEREF _Toc239861545 \h </w:instrText>
       </w:r>
       <w:r>
         <w:rPr>
@@ -389,7 +389,7 @@
         <w:rPr>
           <w:noProof/>
         </w:rPr>
-        <w:instrText xml:space="preserve"> PAGEREF _Toc239751094 \h </w:instrText>
+        <w:instrText xml:space="preserve"> PAGEREF _Toc239861546 \h </w:instrText>
       </w:r>
       <w:r>
         <w:rPr>
@@ -472,7 +472,7 @@
         <w:rPr>
           <w:noProof/>
         </w:rPr>
-        <w:instrText xml:space="preserve"> PAGEREF _Toc239751095 \h </w:instrText>
+        <w:instrText xml:space="preserve"> PAGEREF _Toc239861547 \h </w:instrText>
       </w:r>
       <w:r>
         <w:rPr>
@@ -555,7 +555,7 @@
         <w:rPr>
           <w:noProof/>
         </w:rPr>
-        <w:instrText xml:space="preserve"> PAGEREF _Toc239751096 \h </w:instrText>
+        <w:instrText xml:space="preserve"> PAGEREF _Toc239861548 \h </w:instrText>
       </w:r>
       <w:r>
         <w:rPr>
@@ -638,7 +638,7 @@
         <w:rPr>
           <w:noProof/>
         </w:rPr>
-        <w:instrText xml:space="preserve"> PAGEREF _Toc239751097 \h </w:instrText>
+        <w:instrText xml:space="preserve"> PAGEREF _Toc239861549 \h </w:instrText>
       </w:r>
       <w:r>
         <w:rPr>
@@ -721,7 +721,7 @@
         <w:rPr>
           <w:noProof/>
         </w:rPr>
-        <w:instrText xml:space="preserve"> PAGEREF _Toc239751098 \h </w:instrText>
+        <w:instrText xml:space="preserve"> PAGEREF _Toc239861550 \h </w:instrText>
       </w:r>
       <w:r>
         <w:rPr>
@@ -768,7 +768,7 @@
         <w:rPr>
           <w:noProof/>
         </w:rPr>
-        <w:t>3.4</w:t>
+        <w:t>3.5</w:t>
       </w:r>
       <w:r>
         <w:rPr>
@@ -786,7 +786,7 @@
         <w:rPr>
           <w:noProof/>
         </w:rPr>
-        <w:t>Use case</w:t>
+        <w:t>Sprint Planning</w:t>
       </w:r>
       <w:r>
         <w:rPr>
@@ -804,7 +804,7 @@
         <w:rPr>
           <w:noProof/>
         </w:rPr>
-        <w:instrText xml:space="preserve"> PAGEREF _Toc239751099 \h </w:instrText>
+        <w:instrText xml:space="preserve"> PAGEREF _Toc239861551 \h </w:instrText>
       </w:r>
       <w:r>
         <w:rPr>
@@ -851,7 +851,7 @@
         <w:rPr>
           <w:noProof/>
         </w:rPr>
-        <w:t>3.5</w:t>
+        <w:t>3.6</w:t>
       </w:r>
       <w:r>
         <w:rPr>
@@ -869,7 +869,7 @@
         <w:rPr>
           <w:noProof/>
         </w:rPr>
-        <w:t>Pianificazione</w:t>
+        <w:t>Use case</w:t>
       </w:r>
       <w:r>
         <w:rPr>
@@ -887,7 +887,7 @@
         <w:rPr>
           <w:noProof/>
         </w:rPr>
-        <w:instrText xml:space="preserve"> PAGEREF _Toc239751100 \h </w:instrText>
+        <w:instrText xml:space="preserve"> PAGEREF _Toc239861552 \h </w:instrText>
       </w:r>
       <w:r>
         <w:rPr>
@@ -934,7 +934,7 @@
         <w:rPr>
           <w:noProof/>
         </w:rPr>
-        <w:t>3.6</w:t>
+        <w:t>3.7</w:t>
       </w:r>
       <w:r>
         <w:rPr>
@@ -952,6 +952,89 @@
         <w:rPr>
           <w:noProof/>
         </w:rPr>
+        <w:t>Pianificazione</w:t>
+      </w:r>
+      <w:r>
+        <w:rPr>
+          <w:noProof/>
+        </w:rPr>
+        <w:tab/>
+      </w:r>
+      <w:r>
+        <w:rPr>
+          <w:noProof/>
+        </w:rPr>
+        <w:fldChar w:fldCharType="begin"/>
+      </w:r>
+      <w:r>
+        <w:rPr>
+          <w:noProof/>
+        </w:rPr>
+        <w:instrText xml:space="preserve"> PAGEREF _Toc239861553 \h </w:instrText>
+      </w:r>
+      <w:r>
+        <w:rPr>
+          <w:noProof/>
+        </w:rPr>
+      </w:r>
+      <w:r>
+        <w:rPr>
+          <w:noProof/>
+        </w:rPr>
+        <w:fldChar w:fldCharType="separate"/>
+      </w:r>
+      <w:r>
+        <w:rPr>
+          <w:noProof/>
+        </w:rPr>
+        <w:t>10</w:t>
+      </w:r>
+      <w:r>
+        <w:rPr>
+          <w:noProof/>
+        </w:rPr>
+        <w:fldChar w:fldCharType="end"/>
+      </w:r>
+    </w:p>
+    <w:p>
+      <w:pPr>
+        <w:pStyle w:val="Sommario2"/>
+        <w:tabs>
+          <w:tab w:val="left" w:pos="800"/>
+          <w:tab w:val="right" w:leader="dot" w:pos="9628"/>
+        </w:tabs>
+        <w:rPr>
+          <w:rFonts w:asciiTheme="minorHAnsi" w:eastAsiaTheme="minorEastAsia" w:hAnsiTheme="minorHAnsi" w:cstheme="minorBidi"/>
+          <w:noProof/>
+          <w:kern w:val="2"/>
+          <w:sz w:val="24"/>
+          <w:szCs w:val="24"/>
+          <w:lang w:eastAsia="it-CH"/>
+          <w14:ligatures w14:val="standardContextual"/>
+        </w:rPr>
+      </w:pPr>
+      <w:r>
+        <w:rPr>
+          <w:noProof/>
+        </w:rPr>
+        <w:t>3.8</w:t>
+      </w:r>
+      <w:r>
+        <w:rPr>
+          <w:rFonts w:asciiTheme="minorHAnsi" w:eastAsiaTheme="minorEastAsia" w:hAnsiTheme="minorHAnsi" w:cstheme="minorBidi"/>
+          <w:noProof/>
+          <w:kern w:val="2"/>
+          <w:sz w:val="24"/>
+          <w:szCs w:val="24"/>
+          <w:lang w:eastAsia="it-CH"/>
+          <w14:ligatures w14:val="standardContextual"/>
+        </w:rPr>
+        <w:tab/>
+      </w:r>
+      <w:r>
+        <w:rPr>
+          <w:noProof/>
+        </w:rPr>
         <w:t>Analisi dei mezzi</w:t>
       </w:r>
       <w:r>
@@ -970,7 +1053,7 @@
         <w:rPr>
           <w:noProof/>
         </w:rPr>
-        <w:instrText xml:space="preserve"> PAGEREF _Toc239751101 \h </w:instrText>
+        <w:instrText xml:space="preserve"> PAGEREF _Toc239861554 \h </w:instrText>
       </w:r>
       <w:r>
         <w:rPr>
@@ -987,13 +1070,7 @@
         <w:rPr>
           <w:noProof/>
         </w:rPr>
-        <w:t>1</w:t>
-      </w:r>
-      <w:r>
-        <w:rPr>
-          <w:noProof/>
-        </w:rPr>
-        <w:t>2</w:t>
+        <w:t>13</w:t>
       </w:r>
       <w:r>
         <w:rPr>
@@ -1023,7 +1100,7 @@
         <w:rPr>
           <w:noProof/>
         </w:rPr>
-        <w:t>3.6.1</w:t>
+        <w:t>3.8.1</w:t>
       </w:r>
       <w:r>
         <w:rPr>
@@ -1059,7 +1136,7 @@
         <w:rPr>
           <w:noProof/>
         </w:rPr>
-        <w:instrText xml:space="preserve"> PAGEREF _Toc239751102 \h </w:instrText>
+        <w:instrText xml:space="preserve"> PAGEREF _Toc239861555 \h </w:instrText>
       </w:r>
       <w:r>
         <w:rPr>
@@ -1076,7 +1153,7 @@
         <w:rPr>
           <w:noProof/>
         </w:rPr>
-        <w:t>12</w:t>
+        <w:t>13</w:t>
       </w:r>
       <w:r>
         <w:rPr>
@@ -1106,7 +1183,7 @@
         <w:rPr>
           <w:noProof/>
         </w:rPr>
-        <w:t>3.6.2</w:t>
+        <w:t>3.8.2</w:t>
       </w:r>
       <w:r>
         <w:rPr>
@@ -1142,7 +1219,7 @@
         <w:rPr>
           <w:noProof/>
         </w:rPr>
-        <w:instrText xml:space="preserve"> PAGEREF _Toc239751103 \h </w:instrText>
+        <w:instrText xml:space="preserve"> PAGEREF _Toc239861556 \h </w:instrText>
       </w:r>
       <w:r>
         <w:rPr>
@@ -1159,7 +1236,7 @@
         <w:rPr>
           <w:noProof/>
         </w:rPr>
-        <w:t>12</w:t>
+        <w:t>13</w:t>
       </w:r>
       <w:r>
         <w:rPr>
@@ -1225,7 +1302,7 @@
         <w:rPr>
           <w:noProof/>
         </w:rPr>
-        <w:instrText xml:space="preserve"> PAGEREF _Toc239751104 \h </w:instrText>
+        <w:instrText xml:space="preserve"> PAGEREF _Toc239861557 \h </w:instrText>
       </w:r>
       <w:r>
         <w:rPr>
@@ -1242,7 +1319,7 @@
         <w:rPr>
           <w:noProof/>
         </w:rPr>
-        <w:t>12</w:t>
+        <w:t>13</w:t>
       </w:r>
       <w:r>
         <w:rPr>
@@ -1308,7 +1385,7 @@
         <w:rPr>
           <w:noProof/>
         </w:rPr>
-        <w:instrText xml:space="preserve"> PAGEREF _Toc239751105 \h </w:instrText>
+        <w:instrText xml:space="preserve"> PAGEREF _Toc239861558 \h </w:instrText>
       </w:r>
       <w:r>
         <w:rPr>
@@ -1325,7 +1402,7 @@
         <w:rPr>
           <w:noProof/>
         </w:rPr>
-        <w:t>12</w:t>
+        <w:t>13</w:t>
       </w:r>
       <w:r>
         <w:rPr>
@@ -1391,7 +1468,7 @@
         <w:rPr>
           <w:noProof/>
         </w:rPr>
-        <w:instrText xml:space="preserve"> PAGEREF _Toc239751106 \h </w:instrText>
+        <w:instrText xml:space="preserve"> PAGEREF _Toc239861559 \h </w:instrText>
       </w:r>
       <w:r>
         <w:rPr>
@@ -1408,7 +1485,7 @@
         <w:rPr>
           <w:noProof/>
         </w:rPr>
-        <w:t>12</w:t>
+        <w:t>13</w:t>
       </w:r>
       <w:r>
         <w:rPr>
@@ -1474,7 +1551,7 @@
         <w:rPr>
           <w:noProof/>
         </w:rPr>
-        <w:instrText xml:space="preserve"> PAGEREF _Toc239751107 \h </w:instrText>
+        <w:instrText xml:space="preserve"> PAGEREF _Toc239861560 \h </w:instrText>
       </w:r>
       <w:r>
         <w:rPr>
@@ -1491,7 +1568,7 @@
         <w:rPr>
           <w:noProof/>
         </w:rPr>
-        <w:t>15</w:t>
+        <w:t>16</w:t>
       </w:r>
       <w:r>
         <w:rPr>
@@ -1557,7 +1634,7 @@
         <w:rPr>
           <w:noProof/>
         </w:rPr>
-        <w:instrText xml:space="preserve"> PAGEREF _Toc239751108 \h </w:instrText>
+        <w:instrText xml:space="preserve"> PAGEREF _Toc239861561 \h </w:instrText>
       </w:r>
       <w:r>
         <w:rPr>
@@ -1574,7 +1651,7 @@
         <w:rPr>
           <w:noProof/>
         </w:rPr>
-        <w:t>15</w:t>
+        <w:t>16</w:t>
       </w:r>
       <w:r>
         <w:rPr>
@@ -1640,7 +1717,7 @@
         <w:rPr>
           <w:noProof/>
         </w:rPr>
-        <w:instrText xml:space="preserve"> PAGEREF _Toc239751109 \h </w:instrText>
+        <w:instrText xml:space="preserve"> PAGEREF _Toc239861562 \h </w:instrText>
       </w:r>
       <w:r>
         <w:rPr>
@@ -1657,7 +1734,7 @@
         <w:rPr>
           <w:noProof/>
         </w:rPr>
-        <w:t>16</w:t>
+        <w:t>17</w:t>
       </w:r>
       <w:r>
         <w:rPr>
@@ -1723,7 +1800,7 @@
         <w:rPr>
           <w:noProof/>
         </w:rPr>
-        <w:instrText xml:space="preserve"> PAGEREF _Toc239751110 \h </w:instrText>
+        <w:instrText xml:space="preserve"> PAGEREF _Toc239861563 \h </w:instrText>
       </w:r>
       <w:r>
         <w:rPr>
@@ -1740,7 +1817,7 @@
         <w:rPr>
           <w:noProof/>
         </w:rPr>
-        <w:t>16</w:t>
+        <w:t>17</w:t>
       </w:r>
       <w:r>
         <w:rPr>
@@ -1806,7 +1883,7 @@
         <w:rPr>
           <w:noProof/>
         </w:rPr>
-        <w:instrText xml:space="preserve"> PAGEREF _Toc239751111 \h </w:instrText>
+        <w:instrText xml:space="preserve"> PAGEREF _Toc239861564 \h </w:instrText>
       </w:r>
       <w:r>
         <w:rPr>
@@ -1823,7 +1900,7 @@
         <w:rPr>
           <w:noProof/>
         </w:rPr>
-        <w:t>16</w:t>
+        <w:t>17</w:t>
       </w:r>
       <w:r>
         <w:rPr>
@@ -1889,7 +1966,7 @@
         <w:rPr>
           <w:noProof/>
         </w:rPr>
-        <w:instrText xml:space="preserve"> PAGEREF _Toc239751112 \h </w:instrText>
+        <w:instrText xml:space="preserve"> PAGEREF _Toc239861565 \h </w:instrText>
       </w:r>
       <w:r>
         <w:rPr>
@@ -1906,7 +1983,7 @@
         <w:rPr>
           <w:noProof/>
         </w:rPr>
-        <w:t>18</w:t>
+        <w:t>19</w:t>
       </w:r>
       <w:r>
         <w:rPr>
@@ -1972,7 +2049,7 @@
         <w:rPr>
           <w:noProof/>
         </w:rPr>
-        <w:instrText xml:space="preserve"> PAGEREF _Toc239751113 \h </w:instrText>
+        <w:instrText xml:space="preserve"> PAGEREF _Toc239861566 \h </w:instrText>
       </w:r>
       <w:r>
         <w:rPr>
@@ -1989,7 +2066,7 @@
         <w:rPr>
           <w:noProof/>
         </w:rPr>
-        <w:t>18</w:t>
+        <w:t>19</w:t>
       </w:r>
       <w:r>
         <w:rPr>
@@ -2055,7 +2132,7 @@
         <w:rPr>
           <w:noProof/>
         </w:rPr>
-        <w:instrText xml:space="preserve"> PAGEREF _Toc239751114 \h </w:instrText>
+        <w:instrText xml:space="preserve"> PAGEREF _Toc239861567 \h </w:instrText>
       </w:r>
       <w:r>
         <w:rPr>
@@ -2072,7 +2149,7 @@
         <w:rPr>
           <w:noProof/>
         </w:rPr>
-        <w:t>18</w:t>
+        <w:t>19</w:t>
       </w:r>
       <w:r>
         <w:rPr>
@@ -2138,7 +2215,7 @@
         <w:rPr>
           <w:noProof/>
         </w:rPr>
-        <w:instrText xml:space="preserve"> PAGEREF _Toc239751115 \h </w:instrText>
+        <w:instrText xml:space="preserve"> PAGEREF _Toc239861568 \h </w:instrText>
       </w:r>
       <w:r>
         <w:rPr>
@@ -2155,7 +2232,7 @@
         <w:rPr>
           <w:noProof/>
         </w:rPr>
-        <w:t>20</w:t>
+        <w:t>21</w:t>
       </w:r>
       <w:r>
         <w:rPr>
@@ -2221,7 +2298,7 @@
         <w:rPr>
           <w:noProof/>
         </w:rPr>
-        <w:instrText xml:space="preserve"> PAGEREF _Toc239751116 \h </w:instrText>
+        <w:instrText xml:space="preserve"> PAGEREF _Toc239861569 \h </w:instrText>
       </w:r>
       <w:r>
         <w:rPr>
@@ -2238,7 +2315,7 @@
         <w:rPr>
           <w:noProof/>
         </w:rPr>
-        <w:t>20</w:t>
+        <w:t>21</w:t>
       </w:r>
       <w:r>
         <w:rPr>
@@ -2304,7 +2381,7 @@
         <w:rPr>
           <w:noProof/>
         </w:rPr>
-        <w:instrText xml:space="preserve"> PAGEREF _Toc239751117 \h </w:instrText>
+        <w:instrText xml:space="preserve"> PAGEREF _Toc239861570 \h </w:instrText>
       </w:r>
       <w:r>
         <w:rPr>
@@ -2321,7 +2398,7 @@
         <w:rPr>
           <w:noProof/>
         </w:rPr>
-        <w:t>20</w:t>
+        <w:t>21</w:t>
       </w:r>
       <w:r>
         <w:rPr>
@@ -2387,7 +2464,7 @@
         <w:rPr>
           <w:noProof/>
         </w:rPr>
-        <w:instrText xml:space="preserve"> PAGEREF _Toc239751118 \h </w:instrText>
+        <w:instrText xml:space="preserve"> PAGEREF _Toc239861571 \h </w:instrText>
       </w:r>
       <w:r>
         <w:rPr>
@@ -2404,7 +2481,7 @@
         <w:rPr>
           <w:noProof/>
         </w:rPr>
-        <w:t>21</w:t>
+        <w:t>22</w:t>
       </w:r>
       <w:r>
         <w:rPr>
@@ -2470,7 +2547,7 @@
         <w:rPr>
           <w:noProof/>
         </w:rPr>
-        <w:instrText xml:space="preserve"> PAGEREF _Toc239751119 \h </w:instrText>
+        <w:instrText xml:space="preserve"> PAGEREF _Toc239861572 \h </w:instrText>
       </w:r>
       <w:r>
         <w:rPr>
@@ -2487,7 +2564,7 @@
         <w:rPr>
           <w:noProof/>
         </w:rPr>
-        <w:t>21</w:t>
+        <w:t>22</w:t>
       </w:r>
       <w:r>
         <w:rPr>
@@ -2553,7 +2630,7 @@
         <w:rPr>
           <w:noProof/>
         </w:rPr>
-        <w:instrText xml:space="preserve"> PAGEREF _Toc239751120 \h </w:instrText>
+        <w:instrText xml:space="preserve"> PAGEREF _Toc239861573 \h </w:instrText>
       </w:r>
       <w:r>
         <w:rPr>
@@ -2570,7 +2647,7 @@
         <w:rPr>
           <w:noProof/>
         </w:rPr>
-        <w:t>21</w:t>
+        <w:t>22</w:t>
       </w:r>
       <w:r>
         <w:rPr>
@@ -2636,7 +2713,7 @@
         <w:rPr>
           <w:noProof/>
         </w:rPr>
-        <w:instrText xml:space="preserve"> PAGEREF _Toc239751121 \h </w:instrText>
+        <w:instrText xml:space="preserve"> PAGEREF _Toc239861574 \h </w:instrText>
       </w:r>
       <w:r>
         <w:rPr>
@@ -2653,7 +2730,7 @@
         <w:rPr>
           <w:noProof/>
         </w:rPr>
-        <w:t>21</w:t>
+        <w:t>22</w:t>
       </w:r>
       <w:r>
         <w:rPr>
@@ -2719,7 +2796,7 @@
         <w:rPr>
           <w:noProof/>
         </w:rPr>
-        <w:instrText xml:space="preserve"> PAGEREF _Toc239751122 \h </w:instrText>
+        <w:instrText xml:space="preserve"> PAGEREF _Toc239861575 \h </w:instrText>
       </w:r>
       <w:r>
         <w:rPr>
@@ -2736,7 +2813,7 @@
         <w:rPr>
           <w:noProof/>
         </w:rPr>
-        <w:t>22</w:t>
+        <w:t>23</w:t>
       </w:r>
       <w:r>
         <w:rPr>
@@ -2802,7 +2879,7 @@
         <w:rPr>
           <w:noProof/>
         </w:rPr>
-        <w:instrText xml:space="preserve"> PAGEREF _Toc239751123 \h </w:instrText>
+        <w:instrText xml:space="preserve"> PAGEREF _Toc239861576 \h </w:instrText>
       </w:r>
       <w:r>
         <w:rPr>
@@ -2819,7 +2896,7 @@
         <w:rPr>
           <w:noProof/>
         </w:rPr>
-        <w:t>22</w:t>
+        <w:t>23</w:t>
       </w:r>
       <w:r>
         <w:rPr>
@@ -2885,7 +2962,7 @@
         <w:rPr>
           <w:noProof/>
         </w:rPr>
-        <w:instrText xml:space="preserve"> PAGEREF _Toc239751124 \h </w:instrText>
+        <w:instrText xml:space="preserve"> PAGEREF _Toc239861577 \h </w:instrText>
       </w:r>
       <w:r>
         <w:rPr>
@@ -2902,7 +2979,7 @@
         <w:rPr>
           <w:noProof/>
         </w:rPr>
-        <w:t>22</w:t>
+        <w:t>23</w:t>
       </w:r>
       <w:r>
         <w:rPr>
@@ -2923,7 +3000,7 @@
       <w:r>
         <w:br w:type="page"/>
       </w:r>
-      <w:bookmarkStart w:id="1" w:name="_Toc239751092"/>
+      <w:bookmarkStart w:id="1" w:name="_Toc239861544"/>
       <w:r>
         <w:lastRenderedPageBreak/>
         <w:t>Introduzione</w:t>
@@ -2937,7 +3014,7 @@
           <w:lang w:val="it-CH"/>
         </w:rPr>
       </w:pPr>
-      <w:bookmarkStart w:id="2" w:name="_Toc239751093"/>
+      <w:bookmarkStart w:id="2" w:name="_Toc239861545"/>
       <w:r>
         <w:rPr>
           <w:lang w:val="it-CH"/>
@@ -3020,7 +3097,7 @@
           <w:lang w:val="it-CH"/>
         </w:rPr>
       </w:pPr>
-      <w:bookmarkStart w:id="3" w:name="_Toc239751094"/>
+      <w:bookmarkStart w:id="3" w:name="_Toc239861546"/>
       <w:r>
         <w:rPr>
           <w:lang w:val="it-CH"/>
@@ -3053,7 +3130,7 @@
       <w:r>
         <w:br w:type="page"/>
       </w:r>
-      <w:bookmarkStart w:id="4" w:name="_Toc239751095"/>
+      <w:bookmarkStart w:id="4" w:name="_Toc239861547"/>
       <w:r>
         <w:lastRenderedPageBreak/>
         <w:t>Analisi</w:t>
@@ -3067,7 +3144,7 @@
           <w:lang w:val="it-CH"/>
         </w:rPr>
       </w:pPr>
-      <w:bookmarkStart w:id="5" w:name="_Toc239751096"/>
+      <w:bookmarkStart w:id="5" w:name="_Toc239861548"/>
       <w:r>
         <w:rPr>
           <w:lang w:val="it-CH"/>
@@ -3078,112 +3155,119 @@
     </w:p>
     <w:p>
       <w:r>
-        <w:t>Questo capitolo dovrebbe descrivere il contesto in cui il prodotto verrà utilizzato, da questa analisi dovrebbero scaturire le risposte a quesiti quali ad esempio:</w:t>
+        <w:t>Il progetto "</w:t>
+      </w:r>
+      <w:proofErr w:type="spellStart"/>
+      <w:r>
+        <w:t>Brutal</w:t>
+      </w:r>
+      <w:proofErr w:type="spellEnd"/>
+      <w:r>
+        <w:t xml:space="preserve"> Bumper Cars" è un videogioco 3D dove ci si scontra con gli autoscontri. Il gioco non si svolge in una normale pista da luna park, ma in una grande arena piena di ostacoli, rampe e salite. Lo scopo del gioco è distruggere le auto nemiche e rimanere l'ultimo in gara. </w:t>
+      </w:r>
+    </w:p>
+    <w:p>
+      <w:r>
+        <w:t xml:space="preserve">Il giocatore gioca da solo contro il computer (modalità single player). Nel menu principale è possibile modificare il proprio autoscontro, iniziare a giocare e guardare i propri risultati, come il numero di vittorie fatte. </w:t>
+      </w:r>
+    </w:p>
+    <w:p/>
+    <w:p>
+      <w:r>
+        <w:t>Il gioco si basa sulle azioni di questi elementi:</w:t>
       </w:r>
     </w:p>
     <w:p>
       <w:pPr>
         <w:numPr>
           <w:ilvl w:val="0"/>
-          <w:numId w:val="4"/>
+          <w:numId w:val="28"/>
         </w:numPr>
       </w:pPr>
       <w:r>
-        <w:t>Background/Situazione iniziale</w:t>
+        <w:rPr>
+          <w:b/>
+          <w:bCs/>
+        </w:rPr>
+        <w:t>Il Giocatore:</w:t>
+      </w:r>
+      <w:r>
+        <w:t xml:space="preserve"> Guida il suo autoscontro. Può fare derapate (drift) per prendere bene le curve e usare uno scatto veloce (</w:t>
+      </w:r>
+      <w:proofErr w:type="spellStart"/>
+      <w:r>
+        <w:t>boost</w:t>
+      </w:r>
+      <w:proofErr w:type="spellEnd"/>
+      <w:r>
+        <w:t xml:space="preserve">) che si ricarica nel tempo, utile per scappare o attaccare. </w:t>
       </w:r>
     </w:p>
     <w:p>
       <w:pPr>
         <w:numPr>
           <w:ilvl w:val="0"/>
-          <w:numId w:val="4"/>
+          <w:numId w:val="28"/>
         </w:numPr>
       </w:pPr>
       <w:r>
-        <w:t>Quale è e come è organizzato il contesto in cui il prodotto dovrà funzionare?</w:t>
+        <w:rPr>
+          <w:b/>
+          <w:bCs/>
+        </w:rPr>
+        <w:t>I Nemici (IA):</w:t>
+      </w:r>
+      <w:r>
+        <w:t xml:space="preserve"> Sono i veicoli guidati dal computer che cercano di eliminare gli altri. </w:t>
       </w:r>
     </w:p>
     <w:p>
       <w:pPr>
         <w:numPr>
           <w:ilvl w:val="0"/>
-          <w:numId w:val="3"/>
+          <w:numId w:val="28"/>
         </w:numPr>
       </w:pPr>
       <w:r>
-        <w:t>Come viene risolto attualmente il problema?</w:t>
-      </w:r>
-      <w:r>
-        <w:t xml:space="preserve"> Esiste già un prodotto </w:t>
-      </w:r>
-      <w:r>
-        <w:t>simile</w:t>
-      </w:r>
-      <w:r>
-        <w:t>?</w:t>
+        <w:rPr>
+          <w:b/>
+          <w:bCs/>
+        </w:rPr>
+        <w:t>I Danni:</w:t>
+      </w:r>
+      <w:r>
+        <w:t xml:space="preserve"> Quando due auto sbattono, i danni calcolati sono realistici e dipendono dalla velocità e dal punto in cui ci si colpisce (ad esempio sul lato o da dietro). </w:t>
       </w:r>
     </w:p>
     <w:p>
       <w:pPr>
         <w:numPr>
           <w:ilvl w:val="0"/>
-          <w:numId w:val="3"/>
+          <w:numId w:val="28"/>
         </w:numPr>
       </w:pPr>
       <w:r>
-        <w:t>Chi sono gli utenti? Che bisogni hanno? Come e dove lavorano?</w:t>
-      </w:r>
-    </w:p>
-    <w:p>
-      <w:pPr>
-        <w:numPr>
-          <w:ilvl w:val="0"/>
-          <w:numId w:val="3"/>
-        </w:numPr>
-      </w:pPr>
-      <w:r>
-        <w:t>Che competenze/conoscenze/cultura posseggono gli utenti in relazione con il problema?</w:t>
-      </w:r>
-    </w:p>
-    <w:p>
-      <w:pPr>
-        <w:numPr>
-          <w:ilvl w:val="0"/>
-          <w:numId w:val="3"/>
-        </w:numPr>
-      </w:pPr>
-      <w:r>
-        <w:t>Esistono convenzioni/standard applicati nel dominio?</w:t>
-      </w:r>
-    </w:p>
-    <w:p>
-      <w:pPr>
-        <w:numPr>
-          <w:ilvl w:val="0"/>
-          <w:numId w:val="3"/>
-        </w:numPr>
-      </w:pPr>
-      <w:r>
-        <w:t>Che conoscenze teoriche bisogna avere/acquisire per poter operare efficacemente nel dominio?</w:t>
-      </w:r>
-    </w:p>
-    <w:p>
-      <w:pPr>
-        <w:numPr>
-          <w:ilvl w:val="0"/>
-          <w:numId w:val="3"/>
-        </w:numPr>
-      </w:pPr>
-      <w:r>
-        <w:t>…</w:t>
+        <w:rPr>
+          <w:b/>
+          <w:bCs/>
+        </w:rPr>
+        <w:t>Gli Oggetti Speciali (Power-up):</w:t>
+      </w:r>
+      <w:r>
+        <w:t xml:space="preserve"> Sono oggetti sparsi nell'arena che si possono raccogliere. Permettono di usare granate, mine o banane per dare fastidio e bloccare i nemici. </w:t>
       </w:r>
     </w:p>
     <w:p/>
     <w:p>
+      <w:r>
+        <w:t xml:space="preserve">All'inizio, gli autoscontri sono posizionati e fermi sui bordi dell'arena. Dopo il conto alla rovescia, per i primi secondi nessuno può subire danni. Questo periodo di sicurezza serve per dare a tutti il tempo di allontanarsi e trovare una buona posizione senza essere colpiti subito. </w:t>
+      </w:r>
+    </w:p>
+    <w:p>
       <w:pPr>
         <w:pStyle w:val="Titolo2"/>
       </w:pPr>
-      <w:bookmarkStart w:id="6" w:name="_Toc239751097"/>
+      <w:bookmarkStart w:id="6" w:name="_Toc239861549"/>
       <w:r>
         <w:t>User Stories</w:t>
       </w:r>
@@ -3281,19 +3365,7 @@
         </w:numPr>
       </w:pPr>
       <w:r>
-        <w:t xml:space="preserve">Come giocatore voglio vedere </w:t>
-      </w:r>
-      <w:r>
-        <w:t>le statistiche personali</w:t>
-      </w:r>
-      <w:r>
-        <w:t xml:space="preserve"> per poter </w:t>
-      </w:r>
-      <w:r>
-        <w:t>capire i propri progressi</w:t>
-      </w:r>
-      <w:r>
-        <w:t>.</w:t>
+        <w:t>Come giocatore voglio vedere le statistiche personali per poter capire i propri progressi.</w:t>
       </w:r>
     </w:p>
     <w:p>
@@ -3410,6 +3482,7 @@
         </w:numPr>
       </w:pPr>
       <w:r>
+        <w:lastRenderedPageBreak/>
         <w:t>Dalle impostazioni di gioco voglio poter cambiare le impostazioni di gioco.</w:t>
       </w:r>
     </w:p>
@@ -4145,19 +4218,7 @@
       </w:pPr>
       <w:r>
         <w:lastRenderedPageBreak/>
-        <w:t xml:space="preserve">Come sistema voglio </w:t>
-      </w:r>
-      <w:r>
-        <w:t>creare la mappa</w:t>
-      </w:r>
-      <w:r>
-        <w:t xml:space="preserve"> per permettere al giocatore di avere </w:t>
-      </w:r>
-      <w:r>
-        <w:t>un campo di gioco</w:t>
-      </w:r>
-      <w:r>
-        <w:t>.</w:t>
+        <w:t>Come sistema voglio creare la mappa per permettere al giocatore di avere un campo di gioco.</w:t>
       </w:r>
     </w:p>
     <w:p>
@@ -4232,7 +4293,7 @@
           <w:lang w:val="it-CH"/>
         </w:rPr>
       </w:pPr>
-      <w:bookmarkStart w:id="7" w:name="_Toc239751098"/>
+      <w:bookmarkStart w:id="7" w:name="_Toc239861550"/>
       <w:r>
         <w:rPr>
           <w:lang w:val="it-CH"/>
@@ -8118,10 +8179,12 @@
       <w:pPr>
         <w:pStyle w:val="Titolo2"/>
       </w:pPr>
+      <w:bookmarkStart w:id="8" w:name="_Toc239861551"/>
       <w:r>
         <w:lastRenderedPageBreak/>
         <w:t>Sprint Planning</w:t>
       </w:r>
+      <w:bookmarkEnd w:id="8"/>
     </w:p>
     <w:p>
       <w:pPr>
@@ -8316,13 +8379,7 @@
               <w:rPr>
                 <w:lang w:val="it-IT"/>
               </w:rPr>
-              <w:t xml:space="preserve">User Story </w:t>
-            </w:r>
-            <w:r>
-              <w:rPr>
-                <w:lang w:val="it-IT"/>
-              </w:rPr>
-              <w:t>4</w:t>
+              <w:t>User Story 4</w:t>
             </w:r>
           </w:p>
         </w:tc>
@@ -8360,13 +8417,7 @@
               <w:rPr>
                 <w:lang w:val="it-IT"/>
               </w:rPr>
-              <w:t>User Story 1</w:t>
-            </w:r>
-            <w:r>
-              <w:rPr>
-                <w:lang w:val="it-IT"/>
-              </w:rPr>
-              <w:t>1</w:t>
+              <w:t>User Story 11</w:t>
             </w:r>
           </w:p>
         </w:tc>
@@ -8456,13 +8507,7 @@
               <w:rPr>
                 <w:lang w:val="it-IT"/>
               </w:rPr>
-              <w:t xml:space="preserve">User Story </w:t>
-            </w:r>
-            <w:r>
-              <w:rPr>
-                <w:lang w:val="it-IT"/>
-              </w:rPr>
-              <w:t>5</w:t>
+              <w:t>User Story 5</w:t>
             </w:r>
           </w:p>
         </w:tc>
@@ -8552,13 +8597,7 @@
               <w:rPr>
                 <w:lang w:val="it-IT"/>
               </w:rPr>
-              <w:t xml:space="preserve">User Story </w:t>
-            </w:r>
-            <w:r>
-              <w:rPr>
-                <w:lang w:val="it-IT"/>
-              </w:rPr>
-              <w:t>10</w:t>
+              <w:t>User Story 10</w:t>
             </w:r>
           </w:p>
         </w:tc>
@@ -8744,13 +8783,7 @@
               <w:rPr>
                 <w:lang w:val="it-IT"/>
               </w:rPr>
-              <w:t xml:space="preserve">User Story </w:t>
-            </w:r>
-            <w:r>
-              <w:rPr>
-                <w:lang w:val="it-IT"/>
-              </w:rPr>
-              <w:t>6</w:t>
+              <w:t>User Story 6</w:t>
             </w:r>
           </w:p>
         </w:tc>
@@ -8790,13 +8823,7 @@
               <w:rPr>
                 <w:lang w:val="it-IT"/>
               </w:rPr>
-              <w:t xml:space="preserve">User Story </w:t>
-            </w:r>
-            <w:r>
-              <w:rPr>
-                <w:lang w:val="it-IT"/>
-              </w:rPr>
-              <w:t>7</w:t>
+              <w:t>User Story 7</w:t>
             </w:r>
           </w:p>
         </w:tc>
@@ -8886,13 +8913,7 @@
               <w:rPr>
                 <w:lang w:val="it-IT"/>
               </w:rPr>
-              <w:t xml:space="preserve">User Story </w:t>
-            </w:r>
-            <w:r>
-              <w:rPr>
-                <w:lang w:val="it-IT"/>
-              </w:rPr>
-              <w:t>9</w:t>
+              <w:t>User Story 9</w:t>
             </w:r>
           </w:p>
         </w:tc>
@@ -8982,13 +9003,7 @@
               <w:rPr>
                 <w:lang w:val="it-IT"/>
               </w:rPr>
-              <w:t xml:space="preserve">User Story </w:t>
-            </w:r>
-            <w:r>
-              <w:rPr>
-                <w:lang w:val="it-IT"/>
-              </w:rPr>
-              <w:t>2</w:t>
+              <w:t>User Story 2</w:t>
             </w:r>
           </w:p>
         </w:tc>
@@ -9026,13 +9041,7 @@
               <w:rPr>
                 <w:lang w:val="it-IT"/>
               </w:rPr>
-              <w:t xml:space="preserve">User Story </w:t>
-            </w:r>
-            <w:r>
-              <w:rPr>
-                <w:lang w:val="it-IT"/>
-              </w:rPr>
-              <w:t>3</w:t>
+              <w:t>User Story 3</w:t>
             </w:r>
           </w:p>
         </w:tc>
@@ -9071,14 +9080,14 @@
           <w:lang w:val="it-CH"/>
         </w:rPr>
       </w:pPr>
-      <w:bookmarkStart w:id="8" w:name="_Toc239751099"/>
+      <w:bookmarkStart w:id="9" w:name="_Toc239861552"/>
       <w:r>
         <w:rPr>
           <w:lang w:val="it-CH"/>
         </w:rPr>
         <w:t>Use case</w:t>
       </w:r>
-      <w:bookmarkEnd w:id="8"/>
+      <w:bookmarkEnd w:id="9"/>
     </w:p>
     <w:p>
       <w:r>
@@ -9101,14 +9110,14 @@
           <w:lang w:val="it-CH"/>
         </w:rPr>
       </w:pPr>
-      <w:bookmarkStart w:id="9" w:name="_Toc239751100"/>
+      <w:bookmarkStart w:id="10" w:name="_Toc239861553"/>
       <w:r>
         <w:rPr>
           <w:lang w:val="it-CH"/>
         </w:rPr>
         <w:t>Pianificazione</w:t>
       </w:r>
-      <w:bookmarkEnd w:id="9"/>
+      <w:bookmarkEnd w:id="10"/>
     </w:p>
     <w:p>
       <w:r>
@@ -9202,7 +9211,7 @@
       <w:pPr>
         <w:pStyle w:val="Didascalia"/>
       </w:pPr>
-      <w:bookmarkStart w:id="10" w:name="_Toc124775984"/>
+      <w:bookmarkStart w:id="11" w:name="_Toc124775984"/>
       <w:r>
         <w:t xml:space="preserve">Figura </w:t>
       </w:r>
@@ -9237,7 +9246,7 @@
       <w:r>
         <w:t>Gantt</w:t>
       </w:r>
-      <w:bookmarkEnd w:id="10"/>
+      <w:bookmarkEnd w:id="11"/>
       <w:proofErr w:type="spellEnd"/>
     </w:p>
     <w:p>
@@ -9357,7 +9366,7 @@
       <w:pPr>
         <w:pStyle w:val="Didascalia"/>
       </w:pPr>
-      <w:bookmarkStart w:id="11" w:name="_Toc124775985"/>
+      <w:bookmarkStart w:id="12" w:name="_Toc124775985"/>
       <w:r>
         <w:t xml:space="preserve">Figura </w:t>
       </w:r>
@@ -9392,7 +9401,7 @@
       <w:r>
         <w:t>Gantt</w:t>
       </w:r>
-      <w:bookmarkEnd w:id="11"/>
+      <w:bookmarkEnd w:id="12"/>
       <w:proofErr w:type="spellEnd"/>
     </w:p>
     <w:p/>
@@ -9417,7 +9426,7 @@
           <w:lang w:val="it-CH"/>
         </w:rPr>
       </w:pPr>
-      <w:bookmarkStart w:id="12" w:name="_Toc239751101"/>
+      <w:bookmarkStart w:id="13" w:name="_Toc239861554"/>
       <w:r>
         <w:rPr>
           <w:lang w:val="it-CH"/>
@@ -9425,7 +9434,7 @@
         <w:lastRenderedPageBreak/>
         <w:t>Analisi dei mezzi</w:t>
       </w:r>
-      <w:bookmarkEnd w:id="12"/>
+      <w:bookmarkEnd w:id="13"/>
     </w:p>
     <w:p>
       <w:r>
@@ -9445,16 +9454,16 @@
           <w:lang w:val="it-CH"/>
         </w:rPr>
       </w:pPr>
-      <w:bookmarkStart w:id="13" w:name="_Toc413411419"/>
-      <w:bookmarkStart w:id="14" w:name="_Toc239751102"/>
+      <w:bookmarkStart w:id="14" w:name="_Toc413411419"/>
+      <w:bookmarkStart w:id="15" w:name="_Toc239861555"/>
       <w:r>
         <w:rPr>
           <w:lang w:val="it-CH"/>
         </w:rPr>
         <w:t>Software</w:t>
       </w:r>
-      <w:bookmarkEnd w:id="13"/>
       <w:bookmarkEnd w:id="14"/>
+      <w:bookmarkEnd w:id="15"/>
     </w:p>
     <w:p>
       <w:r>
@@ -9477,16 +9486,16 @@
           <w:lang w:val="it-CH"/>
         </w:rPr>
       </w:pPr>
-      <w:bookmarkStart w:id="15" w:name="_Toc413411420"/>
-      <w:bookmarkStart w:id="16" w:name="_Toc239751103"/>
+      <w:bookmarkStart w:id="16" w:name="_Toc413411420"/>
+      <w:bookmarkStart w:id="17" w:name="_Toc239861556"/>
       <w:r>
         <w:rPr>
           <w:lang w:val="it-CH"/>
         </w:rPr>
         <w:t>Hardware</w:t>
       </w:r>
-      <w:bookmarkEnd w:id="15"/>
       <w:bookmarkEnd w:id="16"/>
+      <w:bookmarkEnd w:id="17"/>
     </w:p>
     <w:p>
       <w:r>
@@ -9503,13 +9512,13 @@
       <w:pPr>
         <w:pStyle w:val="Titolo1"/>
       </w:pPr>
-      <w:bookmarkStart w:id="17" w:name="_Toc429059808"/>
-      <w:bookmarkStart w:id="18" w:name="_Toc239751104"/>
+      <w:bookmarkStart w:id="18" w:name="_Toc429059808"/>
+      <w:bookmarkStart w:id="19" w:name="_Toc239861557"/>
       <w:r>
         <w:t>Progettazione</w:t>
       </w:r>
-      <w:bookmarkEnd w:id="17"/>
       <w:bookmarkEnd w:id="18"/>
+      <w:bookmarkEnd w:id="19"/>
     </w:p>
     <w:p>
       <w:r>
@@ -9524,16 +9533,16 @@
           <w:lang w:val="it-CH"/>
         </w:rPr>
       </w:pPr>
-      <w:bookmarkStart w:id="19" w:name="_Toc429059809"/>
-      <w:bookmarkStart w:id="20" w:name="_Toc239751105"/>
+      <w:bookmarkStart w:id="20" w:name="_Toc429059809"/>
+      <w:bookmarkStart w:id="21" w:name="_Toc239861558"/>
       <w:r>
         <w:rPr>
           <w:lang w:val="it-CH"/>
         </w:rPr>
         <w:t>Design dell’architettura del sistema</w:t>
       </w:r>
-      <w:bookmarkEnd w:id="19"/>
       <w:bookmarkEnd w:id="20"/>
+      <w:bookmarkEnd w:id="21"/>
     </w:p>
     <w:p>
       <w:r>
@@ -9605,16 +9614,16 @@
           <w:lang w:val="it-CH"/>
         </w:rPr>
       </w:pPr>
-      <w:bookmarkStart w:id="21" w:name="_Toc429059810"/>
-      <w:bookmarkStart w:id="22" w:name="_Toc239751106"/>
+      <w:bookmarkStart w:id="22" w:name="_Toc429059810"/>
+      <w:bookmarkStart w:id="23" w:name="_Toc239861559"/>
       <w:r>
         <w:rPr>
           <w:lang w:val="it-CH"/>
         </w:rPr>
         <w:t>Design dei dati e database</w:t>
       </w:r>
-      <w:bookmarkEnd w:id="21"/>
       <w:bookmarkEnd w:id="22"/>
+      <w:bookmarkEnd w:id="23"/>
     </w:p>
     <w:p>
       <w:r>
@@ -9704,7 +9713,7 @@
       <w:pPr>
         <w:pStyle w:val="Didascalia"/>
       </w:pPr>
-      <w:bookmarkStart w:id="23" w:name="_Toc124775986"/>
+      <w:bookmarkStart w:id="24" w:name="_Toc124775986"/>
       <w:r>
         <w:t xml:space="preserve">Figura </w:t>
       </w:r>
@@ -9732,7 +9741,7 @@
       <w:r>
         <w:t xml:space="preserve"> Diagramma ER Chen</w:t>
       </w:r>
-      <w:bookmarkEnd w:id="23"/>
+      <w:bookmarkEnd w:id="24"/>
     </w:p>
     <w:p/>
     <w:p>
@@ -9814,7 +9823,7 @@
       <w:pPr>
         <w:pStyle w:val="Didascalia"/>
       </w:pPr>
-      <w:bookmarkStart w:id="24" w:name="_Toc124775987"/>
+      <w:bookmarkStart w:id="25" w:name="_Toc124775987"/>
       <w:r>
         <w:t xml:space="preserve">Figura </w:t>
       </w:r>
@@ -9845,7 +9854,7 @@
       <w:r>
         <w:t>Diagramma ER Barker</w:t>
       </w:r>
-      <w:bookmarkEnd w:id="24"/>
+      <w:bookmarkEnd w:id="25"/>
     </w:p>
     <w:p/>
     <w:p>
@@ -9860,8 +9869,8 @@
           <w:lang w:val="it-CH"/>
         </w:rPr>
       </w:pPr>
-      <w:bookmarkStart w:id="25" w:name="_Toc429059811"/>
-      <w:bookmarkStart w:id="26" w:name="_Toc239751107"/>
+      <w:bookmarkStart w:id="26" w:name="_Toc429059811"/>
+      <w:bookmarkStart w:id="27" w:name="_Toc239861560"/>
       <w:r>
         <w:rPr>
           <w:lang w:val="it-CH"/>
@@ -9869,8 +9878,8 @@
         <w:lastRenderedPageBreak/>
         <w:t>Design delle interfacce</w:t>
       </w:r>
-      <w:bookmarkEnd w:id="25"/>
       <w:bookmarkEnd w:id="26"/>
+      <w:bookmarkEnd w:id="27"/>
     </w:p>
     <w:p>
       <w:r>
@@ -9892,16 +9901,16 @@
           <w:lang w:val="it-CH"/>
         </w:rPr>
       </w:pPr>
-      <w:bookmarkStart w:id="27" w:name="_Toc429059812"/>
-      <w:bookmarkStart w:id="28" w:name="_Toc239751108"/>
+      <w:bookmarkStart w:id="28" w:name="_Toc429059812"/>
+      <w:bookmarkStart w:id="29" w:name="_Toc239861561"/>
       <w:r>
         <w:rPr>
           <w:lang w:val="it-CH"/>
         </w:rPr>
         <w:t>Design procedurale</w:t>
       </w:r>
-      <w:bookmarkEnd w:id="27"/>
       <w:bookmarkEnd w:id="28"/>
+      <w:bookmarkEnd w:id="29"/>
     </w:p>
     <w:p>
       <w:r>
@@ -9984,14 +9993,14 @@
       <w:pPr>
         <w:pStyle w:val="Titolo1"/>
       </w:pPr>
-      <w:bookmarkStart w:id="29" w:name="_Toc461179222"/>
-      <w:bookmarkStart w:id="30" w:name="_Toc239751109"/>
+      <w:bookmarkStart w:id="30" w:name="_Toc461179222"/>
+      <w:bookmarkStart w:id="31" w:name="_Toc239861562"/>
       <w:r>
         <w:lastRenderedPageBreak/>
         <w:t>Implementazione</w:t>
       </w:r>
-      <w:bookmarkEnd w:id="29"/>
       <w:bookmarkEnd w:id="30"/>
+      <w:bookmarkEnd w:id="31"/>
     </w:p>
     <w:p>
       <w:r>
@@ -10051,13 +10060,13 @@
       <w:pPr>
         <w:pStyle w:val="Titolo1"/>
       </w:pPr>
-      <w:bookmarkStart w:id="31" w:name="_Toc461179223"/>
-      <w:bookmarkStart w:id="32" w:name="_Toc239751110"/>
+      <w:bookmarkStart w:id="32" w:name="_Toc461179223"/>
+      <w:bookmarkStart w:id="33" w:name="_Toc239861563"/>
       <w:r>
         <w:t>Test</w:t>
       </w:r>
-      <w:bookmarkEnd w:id="31"/>
       <w:bookmarkEnd w:id="32"/>
+      <w:bookmarkEnd w:id="33"/>
     </w:p>
     <w:p>
       <w:pPr>
@@ -10066,16 +10075,16 @@
           <w:lang w:val="it-CH"/>
         </w:rPr>
       </w:pPr>
-      <w:bookmarkStart w:id="33" w:name="_Toc461179224"/>
-      <w:bookmarkStart w:id="34" w:name="_Toc239751111"/>
+      <w:bookmarkStart w:id="34" w:name="_Toc461179224"/>
+      <w:bookmarkStart w:id="35" w:name="_Toc239861564"/>
       <w:r>
         <w:rPr>
           <w:lang w:val="it-CH"/>
         </w:rPr>
         <w:t>Protocollo di test</w:t>
       </w:r>
-      <w:bookmarkEnd w:id="33"/>
       <w:bookmarkEnd w:id="34"/>
+      <w:bookmarkEnd w:id="35"/>
     </w:p>
     <w:p>
       <w:r>
@@ -11559,7 +11568,7 @@
           <w:b/>
         </w:rPr>
       </w:pPr>
-      <w:bookmarkStart w:id="35" w:name="_Toc461179225"/>
+      <w:bookmarkStart w:id="36" w:name="_Toc461179225"/>
       <w:r>
         <w:br w:type="page"/>
       </w:r>
@@ -11571,7 +11580,7 @@
           <w:lang w:val="it-CH"/>
         </w:rPr>
       </w:pPr>
-      <w:bookmarkStart w:id="36" w:name="_Toc239751112"/>
+      <w:bookmarkStart w:id="37" w:name="_Toc239861565"/>
       <w:r>
         <w:rPr>
           <w:lang w:val="it-CH"/>
@@ -11579,8 +11588,8 @@
         <w:lastRenderedPageBreak/>
         <w:t>Risultati test</w:t>
       </w:r>
-      <w:bookmarkEnd w:id="35"/>
       <w:bookmarkEnd w:id="36"/>
+      <w:bookmarkEnd w:id="37"/>
     </w:p>
     <w:p>
       <w:r>
@@ -11813,16 +11822,16 @@
           <w:lang w:val="it-CH"/>
         </w:rPr>
       </w:pPr>
-      <w:bookmarkStart w:id="37" w:name="_Toc461179226"/>
-      <w:bookmarkStart w:id="38" w:name="_Toc239751113"/>
+      <w:bookmarkStart w:id="38" w:name="_Toc461179226"/>
+      <w:bookmarkStart w:id="39" w:name="_Toc239861566"/>
       <w:r>
         <w:rPr>
           <w:lang w:val="it-CH"/>
         </w:rPr>
         <w:t>Mancanze/limitazioni conosciute</w:t>
       </w:r>
-      <w:bookmarkEnd w:id="37"/>
       <w:bookmarkEnd w:id="38"/>
+      <w:bookmarkEnd w:id="39"/>
     </w:p>
     <w:p>
       <w:r>
@@ -11833,13 +11842,13 @@
       <w:pPr>
         <w:pStyle w:val="Titolo1"/>
       </w:pPr>
-      <w:bookmarkStart w:id="39" w:name="_Toc461179227"/>
-      <w:bookmarkStart w:id="40" w:name="_Toc239751114"/>
+      <w:bookmarkStart w:id="40" w:name="_Toc461179227"/>
+      <w:bookmarkStart w:id="41" w:name="_Toc239861567"/>
       <w:r>
         <w:t>Consuntivo</w:t>
       </w:r>
-      <w:bookmarkEnd w:id="39"/>
       <w:bookmarkEnd w:id="40"/>
+      <w:bookmarkEnd w:id="41"/>
     </w:p>
     <w:p>
       <w:r>
@@ -12068,7 +12077,7 @@
       <w:pPr>
         <w:pStyle w:val="Didascalia"/>
       </w:pPr>
-      <w:bookmarkStart w:id="41" w:name="_Toc124775988"/>
+      <w:bookmarkStart w:id="42" w:name="_Toc124775988"/>
       <w:r>
         <w:t xml:space="preserve">Figura </w:t>
       </w:r>
@@ -12107,7 +12116,7 @@
       <w:r>
         <w:t xml:space="preserve"> consuntivo</w:t>
       </w:r>
-      <w:bookmarkEnd w:id="41"/>
+      <w:bookmarkEnd w:id="42"/>
     </w:p>
     <w:p/>
     <w:p>
@@ -12127,14 +12136,14 @@
       <w:pPr>
         <w:pStyle w:val="Titolo1"/>
       </w:pPr>
-      <w:bookmarkStart w:id="42" w:name="_Toc461179228"/>
-      <w:bookmarkStart w:id="43" w:name="_Toc239751115"/>
+      <w:bookmarkStart w:id="43" w:name="_Toc461179228"/>
+      <w:bookmarkStart w:id="44" w:name="_Toc239861568"/>
       <w:r>
         <w:lastRenderedPageBreak/>
         <w:t>Conclusioni</w:t>
       </w:r>
-      <w:bookmarkEnd w:id="42"/>
       <w:bookmarkEnd w:id="43"/>
+      <w:bookmarkEnd w:id="44"/>
     </w:p>
     <w:p>
       <w:r>
@@ -12151,16 +12160,16 @@
           <w:lang w:val="it-CH"/>
         </w:rPr>
       </w:pPr>
-      <w:bookmarkStart w:id="44" w:name="_Toc461179229"/>
-      <w:bookmarkStart w:id="45" w:name="_Toc239751116"/>
+      <w:bookmarkStart w:id="45" w:name="_Toc461179229"/>
+      <w:bookmarkStart w:id="46" w:name="_Toc239861569"/>
       <w:r>
         <w:rPr>
           <w:lang w:val="it-CH"/>
         </w:rPr>
         <w:t>Sviluppi futuri</w:t>
       </w:r>
-      <w:bookmarkEnd w:id="44"/>
       <w:bookmarkEnd w:id="45"/>
+      <w:bookmarkEnd w:id="46"/>
     </w:p>
     <w:p>
       <w:r>
@@ -12174,16 +12183,16 @@
           <w:lang w:val="it-CH"/>
         </w:rPr>
       </w:pPr>
-      <w:bookmarkStart w:id="46" w:name="_Toc461179230"/>
-      <w:bookmarkStart w:id="47" w:name="_Toc239751117"/>
+      <w:bookmarkStart w:id="47" w:name="_Toc461179230"/>
+      <w:bookmarkStart w:id="48" w:name="_Toc239861570"/>
       <w:r>
         <w:rPr>
           <w:lang w:val="it-CH"/>
         </w:rPr>
         <w:t>Considerazioni personali</w:t>
       </w:r>
-      <w:bookmarkEnd w:id="46"/>
       <w:bookmarkEnd w:id="47"/>
+      <w:bookmarkEnd w:id="48"/>
     </w:p>
     <w:p>
       <w:r>
@@ -12200,7 +12209,7 @@
           <w:b/>
         </w:rPr>
       </w:pPr>
-      <w:bookmarkStart w:id="48" w:name="_Toc461179231"/>
+      <w:bookmarkStart w:id="49" w:name="_Toc461179231"/>
       <w:r>
         <w:br w:type="page"/>
       </w:r>
@@ -12209,13 +12218,13 @@
       <w:pPr>
         <w:pStyle w:val="Titolo1"/>
       </w:pPr>
-      <w:bookmarkStart w:id="49" w:name="_Toc239751118"/>
+      <w:bookmarkStart w:id="50" w:name="_Toc239861571"/>
       <w:r>
         <w:lastRenderedPageBreak/>
         <w:t>Bibliografia</w:t>
       </w:r>
-      <w:bookmarkEnd w:id="48"/>
       <w:bookmarkEnd w:id="49"/>
+      <w:bookmarkEnd w:id="50"/>
     </w:p>
     <w:p>
       <w:pPr>
@@ -12224,16 +12233,16 @@
           <w:lang w:val="it-CH"/>
         </w:rPr>
       </w:pPr>
-      <w:bookmarkStart w:id="50" w:name="_Toc461179232"/>
-      <w:bookmarkStart w:id="51" w:name="_Toc239751119"/>
+      <w:bookmarkStart w:id="51" w:name="_Toc461179232"/>
+      <w:bookmarkStart w:id="52" w:name="_Toc239861572"/>
       <w:r>
         <w:rPr>
           <w:lang w:val="it-CH"/>
         </w:rPr>
         <w:t>Bibliografia per articoli di riviste:</w:t>
       </w:r>
-      <w:bookmarkEnd w:id="50"/>
       <w:bookmarkEnd w:id="51"/>
+      <w:bookmarkEnd w:id="52"/>
     </w:p>
     <w:p>
       <w:pPr>
@@ -12300,16 +12309,16 @@
           <w:lang w:val="it-CH"/>
         </w:rPr>
       </w:pPr>
-      <w:bookmarkStart w:id="52" w:name="_Toc461179233"/>
-      <w:bookmarkStart w:id="53" w:name="_Toc239751120"/>
+      <w:bookmarkStart w:id="53" w:name="_Toc461179233"/>
+      <w:bookmarkStart w:id="54" w:name="_Toc239861573"/>
       <w:r>
         <w:rPr>
           <w:lang w:val="it-CH"/>
         </w:rPr>
         <w:t>Bibliografia per libri</w:t>
       </w:r>
-      <w:bookmarkEnd w:id="52"/>
       <w:bookmarkEnd w:id="53"/>
+      <w:bookmarkEnd w:id="54"/>
     </w:p>
     <w:p>
       <w:pPr>
@@ -12389,16 +12398,16 @@
           <w:lang w:val="it-CH"/>
         </w:rPr>
       </w:pPr>
-      <w:bookmarkStart w:id="54" w:name="_Toc461179234"/>
-      <w:bookmarkStart w:id="55" w:name="_Toc239751121"/>
+      <w:bookmarkStart w:id="55" w:name="_Toc461179234"/>
+      <w:bookmarkStart w:id="56" w:name="_Toc239861574"/>
       <w:r>
         <w:rPr>
           <w:lang w:val="it-CH"/>
         </w:rPr>
         <w:t>Sitografia</w:t>
       </w:r>
-      <w:bookmarkEnd w:id="54"/>
       <w:bookmarkEnd w:id="55"/>
+      <w:bookmarkEnd w:id="56"/>
     </w:p>
     <w:p>
       <w:pPr>
@@ -12497,7 +12506,7 @@
           <w:lang w:val="fr-CH"/>
         </w:rPr>
       </w:pPr>
-      <w:bookmarkStart w:id="56" w:name="_Toc461179235"/>
+      <w:bookmarkStart w:id="57" w:name="_Toc461179235"/>
     </w:p>
     <w:p>
       <w:pPr>
@@ -12520,12 +12529,12 @@
       <w:pPr>
         <w:pStyle w:val="Titolo1"/>
       </w:pPr>
-      <w:bookmarkStart w:id="57" w:name="_Toc239751122"/>
+      <w:bookmarkStart w:id="58" w:name="_Toc239861575"/>
       <w:r>
         <w:lastRenderedPageBreak/>
         <w:t>Glossario</w:t>
       </w:r>
-      <w:bookmarkEnd w:id="57"/>
+      <w:bookmarkEnd w:id="58"/>
     </w:p>
     <w:tbl>
       <w:tblPr>
@@ -12706,11 +12715,11 @@
       <w:pPr>
         <w:pStyle w:val="Titolo1"/>
       </w:pPr>
-      <w:bookmarkStart w:id="58" w:name="_Toc239751123"/>
+      <w:bookmarkStart w:id="59" w:name="_Toc239861576"/>
       <w:r>
         <w:t>Indice delle figure</w:t>
       </w:r>
-      <w:bookmarkEnd w:id="58"/>
+      <w:bookmarkEnd w:id="59"/>
     </w:p>
     <w:p>
       <w:pPr>
@@ -13090,12 +13099,12 @@
       <w:pPr>
         <w:pStyle w:val="Titolo1"/>
       </w:pPr>
-      <w:bookmarkStart w:id="59" w:name="_Toc239751124"/>
+      <w:bookmarkStart w:id="60" w:name="_Toc239861577"/>
       <w:r>
         <w:t>Allegati</w:t>
       </w:r>
-      <w:bookmarkEnd w:id="56"/>
-      <w:bookmarkEnd w:id="59"/>
+      <w:bookmarkEnd w:id="57"/>
+      <w:bookmarkEnd w:id="60"/>
     </w:p>
     <w:p>
       <w:r>
@@ -13317,7 +13326,7 @@
         <w:noProof/>
         <w:sz w:val="20"/>
       </w:rPr>
-      <w:t>08.09.2026</w:t>
+      <w:t>09.09.2026</w:t>
     </w:r>
     <w:r>
       <w:rPr>
@@ -13826,7 +13835,7 @@
         <w:noProof/>
         <w:sz w:val="20"/>
       </w:rPr>
-      <w:t>07.09.2026</w:t>
+      <w:t>08.09.2026</w:t>
     </w:r>
     <w:r>
       <w:rPr>
@@ -14054,7 +14063,7 @@
         <w:noProof/>
         <w:sz w:val="20"/>
       </w:rPr>
-      <w:t>07.09.2026</w:t>
+      <w:t>08.09.2026</w:t>
     </w:r>
     <w:r>
       <w:rPr>
@@ -18761,6 +18770,155 @@
     </w:lvl>
   </w:abstractNum>
   <w:abstractNum w:abstractNumId="17" w15:restartNumberingAfterBreak="0">
+    <w:nsid w:val="6CAF4654"/>
+    <w:multiLevelType w:val="multilevel"/>
+    <w:tmpl w:val="B31E0A48"/>
+    <w:lvl w:ilvl="0">
+      <w:start w:val="1"/>
+      <w:numFmt w:val="bullet"/>
+      <w:lvlText w:val=""/>
+      <w:lvlJc w:val="left"/>
+      <w:pPr>
+        <w:tabs>
+          <w:tab w:val="num" w:pos="720"/>
+        </w:tabs>
+        <w:ind w:left="720" w:hanging="360"/>
+      </w:pPr>
+      <w:rPr>
+        <w:rFonts w:ascii="Symbol" w:hAnsi="Symbol" w:hint="default"/>
+        <w:sz w:val="20"/>
+      </w:rPr>
+    </w:lvl>
+    <w:lvl w:ilvl="1" w:tentative="1">
+      <w:start w:val="1"/>
+      <w:numFmt w:val="bullet"/>
+      <w:lvlText w:val="o"/>
+      <w:lvlJc w:val="left"/>
+      <w:pPr>
+        <w:tabs>
+          <w:tab w:val="num" w:pos="1440"/>
+        </w:tabs>
+        <w:ind w:left="1440" w:hanging="360"/>
+      </w:pPr>
+      <w:rPr>
+        <w:rFonts w:ascii="Courier New" w:hAnsi="Courier New" w:hint="default"/>
+        <w:sz w:val="20"/>
+      </w:rPr>
+    </w:lvl>
+    <w:lvl w:ilvl="2" w:tentative="1">
+      <w:start w:val="1"/>
+      <w:numFmt w:val="bullet"/>
+      <w:lvlText w:val=""/>
+      <w:lvlJc w:val="left"/>
+      <w:pPr>
+        <w:tabs>
+          <w:tab w:val="num" w:pos="2160"/>
+        </w:tabs>
+        <w:ind w:left="2160" w:hanging="360"/>
+      </w:pPr>
+      <w:rPr>
+        <w:rFonts w:ascii="Wingdings" w:hAnsi="Wingdings" w:hint="default"/>
+        <w:sz w:val="20"/>
+      </w:rPr>
+    </w:lvl>
+    <w:lvl w:ilvl="3" w:tentative="1">
+      <w:start w:val="1"/>
+      <w:numFmt w:val="bullet"/>
+      <w:lvlText w:val=""/>
+      <w:lvlJc w:val="left"/>
+      <w:pPr>
+        <w:tabs>
+          <w:tab w:val="num" w:pos="2880"/>
+        </w:tabs>
+        <w:ind w:left="2880" w:hanging="360"/>
+      </w:pPr>
+      <w:rPr>
+        <w:rFonts w:ascii="Wingdings" w:hAnsi="Wingdings" w:hint="default"/>
+        <w:sz w:val="20"/>
+      </w:rPr>
+    </w:lvl>
+    <w:lvl w:ilvl="4" w:tentative="1">
+      <w:start w:val="1"/>
+      <w:numFmt w:val="bullet"/>
+      <w:lvlText w:val=""/>
+      <w:lvlJc w:val="left"/>
+      <w:pPr>
+        <w:tabs>
+          <w:tab w:val="num" w:pos="3600"/>
+        </w:tabs>
+        <w:ind w:left="3600" w:hanging="360"/>
+      </w:pPr>
+      <w:rPr>
+        <w:rFonts w:ascii="Wingdings" w:hAnsi="Wingdings" w:hint="default"/>
+        <w:sz w:val="20"/>
+      </w:rPr>
+    </w:lvl>
+    <w:lvl w:ilvl="5" w:tentative="1">
+      <w:start w:val="1"/>
+      <w:numFmt w:val="bullet"/>
+      <w:lvlText w:val=""/>
+      <w:lvlJc w:val="left"/>
+      <w:pPr>
+        <w:tabs>
+          <w:tab w:val="num" w:pos="4320"/>
+        </w:tabs>
+        <w:ind w:left="4320" w:hanging="360"/>
+      </w:pPr>
+      <w:rPr>
+        <w:rFonts w:ascii="Wingdings" w:hAnsi="Wingdings" w:hint="default"/>
+        <w:sz w:val="20"/>
+      </w:rPr>
+    </w:lvl>
+    <w:lvl w:ilvl="6" w:tentative="1">
+      <w:start w:val="1"/>
+      <w:numFmt w:val="bullet"/>
+      <w:lvlText w:val=""/>
+      <w:lvlJc w:val="left"/>
+      <w:pPr>
+        <w:tabs>
+          <w:tab w:val="num" w:pos="5040"/>
+        </w:tabs>
+        <w:ind w:left="5040" w:hanging="360"/>
+      </w:pPr>
+      <w:rPr>
+        <w:rFonts w:ascii="Wingdings" w:hAnsi="Wingdings" w:hint="default"/>
+        <w:sz w:val="20"/>
+      </w:rPr>
+    </w:lvl>
+    <w:lvl w:ilvl="7" w:tentative="1">
+      <w:start w:val="1"/>
+      <w:numFmt w:val="bullet"/>
+      <w:lvlText w:val=""/>
+      <w:lvlJc w:val="left"/>
+      <w:pPr>
+        <w:tabs>
+          <w:tab w:val="num" w:pos="5760"/>
+        </w:tabs>
+        <w:ind w:left="5760" w:hanging="360"/>
+      </w:pPr>
+      <w:rPr>
+        <w:rFonts w:ascii="Wingdings" w:hAnsi="Wingdings" w:hint="default"/>
+        <w:sz w:val="20"/>
+      </w:rPr>
+    </w:lvl>
+    <w:lvl w:ilvl="8" w:tentative="1">
+      <w:start w:val="1"/>
+      <w:numFmt w:val="bullet"/>
+      <w:lvlText w:val=""/>
+      <w:lvlJc w:val="left"/>
+      <w:pPr>
+        <w:tabs>
+          <w:tab w:val="num" w:pos="6480"/>
+        </w:tabs>
+        <w:ind w:left="6480" w:hanging="360"/>
+      </w:pPr>
+      <w:rPr>
+        <w:rFonts w:ascii="Wingdings" w:hAnsi="Wingdings" w:hint="default"/>
+        <w:sz w:val="20"/>
+      </w:rPr>
+    </w:lvl>
+  </w:abstractNum>
+  <w:abstractNum w:abstractNumId="18" w15:restartNumberingAfterBreak="0">
     <w:nsid w:val="72904C79"/>
     <w:multiLevelType w:val="hybridMultilevel"/>
     <w:tmpl w:val="EB328896"/>
@@ -18900,7 +19058,7 @@
       </w:rPr>
     </w:lvl>
   </w:abstractNum>
-  <w:abstractNum w:abstractNumId="18" w15:restartNumberingAfterBreak="0">
+  <w:abstractNum w:abstractNumId="19" w15:restartNumberingAfterBreak="0">
     <w:nsid w:val="7ACC392C"/>
     <w:multiLevelType w:val="hybridMultilevel"/>
     <w:tmpl w:val="F282F7F0"/>
@@ -19040,7 +19198,7 @@
       </w:rPr>
     </w:lvl>
   </w:abstractNum>
-  <w:abstractNum w:abstractNumId="19" w15:restartNumberingAfterBreak="0">
+  <w:abstractNum w:abstractNumId="20" w15:restartNumberingAfterBreak="0">
     <w:nsid w:val="7CD54937"/>
     <w:multiLevelType w:val="hybridMultilevel"/>
     <w:tmpl w:val="1AB0305A"/>
@@ -19208,10 +19366,10 @@
     <w:abstractNumId w:val="0"/>
   </w:num>
   <w:num w:numId="10" w16cid:durableId="1239287808">
-    <w:abstractNumId w:val="17"/>
+    <w:abstractNumId w:val="18"/>
   </w:num>
   <w:num w:numId="11" w16cid:durableId="167793680">
-    <w:abstractNumId w:val="18"/>
+    <w:abstractNumId w:val="19"/>
   </w:num>
   <w:num w:numId="12" w16cid:durableId="538322029">
     <w:abstractNumId w:val="6"/>
@@ -19220,7 +19378,7 @@
     <w:abstractNumId w:val="3"/>
   </w:num>
   <w:num w:numId="14" w16cid:durableId="1609240294">
-    <w:abstractNumId w:val="19"/>
+    <w:abstractNumId w:val="20"/>
   </w:num>
   <w:num w:numId="15" w16cid:durableId="1371996878">
     <w:abstractNumId w:val="7"/>
@@ -19260,6 +19418,9 @@
   </w:num>
   <w:num w:numId="27" w16cid:durableId="437876889">
     <w:abstractNumId w:val="15"/>
+  </w:num>
+  <w:num w:numId="28" w16cid:durableId="1506164115">
+    <w:abstractNumId w:val="17"/>
   </w:num>
   <w:numIdMacAtCleanup w:val="14"/>
 </w:numbering>

</xml_diff>

<commit_message>
Diario, aggiunta database e aggiornamento sommario documentazione
</commit_message>
<xml_diff>
--- a/3_Documentazione/Documentazione.docx
+++ b/3_Documentazione/Documentazione.docx
@@ -67,7 +67,7 @@
       <w:pPr>
         <w:pStyle w:val="Titolo1"/>
       </w:pPr>
-      <w:bookmarkStart w:id="0" w:name="_Toc239861543"/>
+      <w:bookmarkStart w:id="0" w:name="_Toc239863685"/>
       <w:r>
         <w:lastRenderedPageBreak/>
         <w:t>Indice</w:t>
@@ -140,7 +140,7 @@
         <w:rPr>
           <w:noProof/>
         </w:rPr>
-        <w:instrText xml:space="preserve"> PAGEREF _Toc239861543 \h </w:instrText>
+        <w:instrText xml:space="preserve"> PAGEREF _Toc239863685 \h </w:instrText>
       </w:r>
       <w:r>
         <w:rPr>
@@ -223,7 +223,7 @@
         <w:rPr>
           <w:noProof/>
         </w:rPr>
-        <w:instrText xml:space="preserve"> PAGEREF _Toc239861544 \h </w:instrText>
+        <w:instrText xml:space="preserve"> PAGEREF _Toc239863686 \h </w:instrText>
       </w:r>
       <w:r>
         <w:rPr>
@@ -306,7 +306,7 @@
         <w:rPr>
           <w:noProof/>
         </w:rPr>
-        <w:instrText xml:space="preserve"> PAGEREF _Toc239861545 \h </w:instrText>
+        <w:instrText xml:space="preserve"> PAGEREF _Toc239863687 \h </w:instrText>
       </w:r>
       <w:r>
         <w:rPr>
@@ -389,7 +389,7 @@
         <w:rPr>
           <w:noProof/>
         </w:rPr>
-        <w:instrText xml:space="preserve"> PAGEREF _Toc239861546 \h </w:instrText>
+        <w:instrText xml:space="preserve"> PAGEREF _Toc239863688 \h </w:instrText>
       </w:r>
       <w:r>
         <w:rPr>
@@ -472,7 +472,7 @@
         <w:rPr>
           <w:noProof/>
         </w:rPr>
-        <w:instrText xml:space="preserve"> PAGEREF _Toc239861547 \h </w:instrText>
+        <w:instrText xml:space="preserve"> PAGEREF _Toc239863689 \h </w:instrText>
       </w:r>
       <w:r>
         <w:rPr>
@@ -555,7 +555,7 @@
         <w:rPr>
           <w:noProof/>
         </w:rPr>
-        <w:instrText xml:space="preserve"> PAGEREF _Toc239861548 \h </w:instrText>
+        <w:instrText xml:space="preserve"> PAGEREF _Toc239863690 \h </w:instrText>
       </w:r>
       <w:r>
         <w:rPr>
@@ -638,7 +638,7 @@
         <w:rPr>
           <w:noProof/>
         </w:rPr>
-        <w:instrText xml:space="preserve"> PAGEREF _Toc239861549 \h </w:instrText>
+        <w:instrText xml:space="preserve"> PAGEREF _Toc239863691 \h </w:instrText>
       </w:r>
       <w:r>
         <w:rPr>
@@ -721,7 +721,7 @@
         <w:rPr>
           <w:noProof/>
         </w:rPr>
-        <w:instrText xml:space="preserve"> PAGEREF _Toc239861550 \h </w:instrText>
+        <w:instrText xml:space="preserve"> PAGEREF _Toc239863692 \h </w:instrText>
       </w:r>
       <w:r>
         <w:rPr>
@@ -738,7 +738,7 @@
         <w:rPr>
           <w:noProof/>
         </w:rPr>
-        <w:t>6</w:t>
+        <w:t>7</w:t>
       </w:r>
       <w:r>
         <w:rPr>
@@ -804,7 +804,7 @@
         <w:rPr>
           <w:noProof/>
         </w:rPr>
-        <w:instrText xml:space="preserve"> PAGEREF _Toc239861551 \h </w:instrText>
+        <w:instrText xml:space="preserve"> PAGEREF _Toc239863693 \h </w:instrText>
       </w:r>
       <w:r>
         <w:rPr>
@@ -821,7 +821,7 @@
         <w:rPr>
           <w:noProof/>
         </w:rPr>
-        <w:t>10</w:t>
+        <w:t>11</w:t>
       </w:r>
       <w:r>
         <w:rPr>
@@ -887,7 +887,7 @@
         <w:rPr>
           <w:noProof/>
         </w:rPr>
-        <w:instrText xml:space="preserve"> PAGEREF _Toc239861552 \h </w:instrText>
+        <w:instrText xml:space="preserve"> PAGEREF _Toc239863694 \h </w:instrText>
       </w:r>
       <w:r>
         <w:rPr>
@@ -904,7 +904,7 @@
         <w:rPr>
           <w:noProof/>
         </w:rPr>
-        <w:t>10</w:t>
+        <w:t>11</w:t>
       </w:r>
       <w:r>
         <w:rPr>
@@ -970,7 +970,7 @@
         <w:rPr>
           <w:noProof/>
         </w:rPr>
-        <w:instrText xml:space="preserve"> PAGEREF _Toc239861553 \h </w:instrText>
+        <w:instrText xml:space="preserve"> PAGEREF _Toc239863695 \h </w:instrText>
       </w:r>
       <w:r>
         <w:rPr>
@@ -987,7 +987,7 @@
         <w:rPr>
           <w:noProof/>
         </w:rPr>
-        <w:t>10</w:t>
+        <w:t>11</w:t>
       </w:r>
       <w:r>
         <w:rPr>
@@ -1053,7 +1053,7 @@
         <w:rPr>
           <w:noProof/>
         </w:rPr>
-        <w:instrText xml:space="preserve"> PAGEREF _Toc239861554 \h </w:instrText>
+        <w:instrText xml:space="preserve"> PAGEREF _Toc239863696 \h </w:instrText>
       </w:r>
       <w:r>
         <w:rPr>
@@ -1070,7 +1070,7 @@
         <w:rPr>
           <w:noProof/>
         </w:rPr>
-        <w:t>13</w:t>
+        <w:t>14</w:t>
       </w:r>
       <w:r>
         <w:rPr>
@@ -1136,7 +1136,7 @@
         <w:rPr>
           <w:noProof/>
         </w:rPr>
-        <w:instrText xml:space="preserve"> PAGEREF _Toc239861555 \h </w:instrText>
+        <w:instrText xml:space="preserve"> PAGEREF _Toc239863697 \h </w:instrText>
       </w:r>
       <w:r>
         <w:rPr>
@@ -1153,7 +1153,7 @@
         <w:rPr>
           <w:noProof/>
         </w:rPr>
-        <w:t>13</w:t>
+        <w:t>14</w:t>
       </w:r>
       <w:r>
         <w:rPr>
@@ -1219,7 +1219,7 @@
         <w:rPr>
           <w:noProof/>
         </w:rPr>
-        <w:instrText xml:space="preserve"> PAGEREF _Toc239861556 \h </w:instrText>
+        <w:instrText xml:space="preserve"> PAGEREF _Toc239863698 \h </w:instrText>
       </w:r>
       <w:r>
         <w:rPr>
@@ -1236,7 +1236,7 @@
         <w:rPr>
           <w:noProof/>
         </w:rPr>
-        <w:t>13</w:t>
+        <w:t>14</w:t>
       </w:r>
       <w:r>
         <w:rPr>
@@ -1302,7 +1302,7 @@
         <w:rPr>
           <w:noProof/>
         </w:rPr>
-        <w:instrText xml:space="preserve"> PAGEREF _Toc239861557 \h </w:instrText>
+        <w:instrText xml:space="preserve"> PAGEREF _Toc239863699 \h </w:instrText>
       </w:r>
       <w:r>
         <w:rPr>
@@ -1319,7 +1319,7 @@
         <w:rPr>
           <w:noProof/>
         </w:rPr>
-        <w:t>13</w:t>
+        <w:t>14</w:t>
       </w:r>
       <w:r>
         <w:rPr>
@@ -1385,7 +1385,7 @@
         <w:rPr>
           <w:noProof/>
         </w:rPr>
-        <w:instrText xml:space="preserve"> PAGEREF _Toc239861558 \h </w:instrText>
+        <w:instrText xml:space="preserve"> PAGEREF _Toc239863700 \h </w:instrText>
       </w:r>
       <w:r>
         <w:rPr>
@@ -1402,7 +1402,7 @@
         <w:rPr>
           <w:noProof/>
         </w:rPr>
-        <w:t>13</w:t>
+        <w:t>14</w:t>
       </w:r>
       <w:r>
         <w:rPr>
@@ -1468,7 +1468,7 @@
         <w:rPr>
           <w:noProof/>
         </w:rPr>
-        <w:instrText xml:space="preserve"> PAGEREF _Toc239861559 \h </w:instrText>
+        <w:instrText xml:space="preserve"> PAGEREF _Toc239863701 \h </w:instrText>
       </w:r>
       <w:r>
         <w:rPr>
@@ -1485,7 +1485,7 @@
         <w:rPr>
           <w:noProof/>
         </w:rPr>
-        <w:t>13</w:t>
+        <w:t>14</w:t>
       </w:r>
       <w:r>
         <w:rPr>
@@ -1551,7 +1551,7 @@
         <w:rPr>
           <w:noProof/>
         </w:rPr>
-        <w:instrText xml:space="preserve"> PAGEREF _Toc239861560 \h </w:instrText>
+        <w:instrText xml:space="preserve"> PAGEREF _Toc239863702 \h </w:instrText>
       </w:r>
       <w:r>
         <w:rPr>
@@ -1568,7 +1568,7 @@
         <w:rPr>
           <w:noProof/>
         </w:rPr>
-        <w:t>16</w:t>
+        <w:t>17</w:t>
       </w:r>
       <w:r>
         <w:rPr>
@@ -1634,7 +1634,7 @@
         <w:rPr>
           <w:noProof/>
         </w:rPr>
-        <w:instrText xml:space="preserve"> PAGEREF _Toc239861561 \h </w:instrText>
+        <w:instrText xml:space="preserve"> PAGEREF _Toc239863703 \h </w:instrText>
       </w:r>
       <w:r>
         <w:rPr>
@@ -1651,7 +1651,7 @@
         <w:rPr>
           <w:noProof/>
         </w:rPr>
-        <w:t>16</w:t>
+        <w:t>17</w:t>
       </w:r>
       <w:r>
         <w:rPr>
@@ -1717,7 +1717,7 @@
         <w:rPr>
           <w:noProof/>
         </w:rPr>
-        <w:instrText xml:space="preserve"> PAGEREF _Toc239861562 \h </w:instrText>
+        <w:instrText xml:space="preserve"> PAGEREF _Toc239863704 \h </w:instrText>
       </w:r>
       <w:r>
         <w:rPr>
@@ -1734,7 +1734,7 @@
         <w:rPr>
           <w:noProof/>
         </w:rPr>
-        <w:t>17</w:t>
+        <w:t>18</w:t>
       </w:r>
       <w:r>
         <w:rPr>
@@ -1800,7 +1800,7 @@
         <w:rPr>
           <w:noProof/>
         </w:rPr>
-        <w:instrText xml:space="preserve"> PAGEREF _Toc239861563 \h </w:instrText>
+        <w:instrText xml:space="preserve"> PAGEREF _Toc239863705 \h </w:instrText>
       </w:r>
       <w:r>
         <w:rPr>
@@ -1817,7 +1817,7 @@
         <w:rPr>
           <w:noProof/>
         </w:rPr>
-        <w:t>17</w:t>
+        <w:t>18</w:t>
       </w:r>
       <w:r>
         <w:rPr>
@@ -1883,7 +1883,7 @@
         <w:rPr>
           <w:noProof/>
         </w:rPr>
-        <w:instrText xml:space="preserve"> PAGEREF _Toc239861564 \h </w:instrText>
+        <w:instrText xml:space="preserve"> PAGEREF _Toc239863706 \h </w:instrText>
       </w:r>
       <w:r>
         <w:rPr>
@@ -1900,7 +1900,7 @@
         <w:rPr>
           <w:noProof/>
         </w:rPr>
-        <w:t>17</w:t>
+        <w:t>18</w:t>
       </w:r>
       <w:r>
         <w:rPr>
@@ -1966,7 +1966,7 @@
         <w:rPr>
           <w:noProof/>
         </w:rPr>
-        <w:instrText xml:space="preserve"> PAGEREF _Toc239861565 \h </w:instrText>
+        <w:instrText xml:space="preserve"> PAGEREF _Toc239863707 \h </w:instrText>
       </w:r>
       <w:r>
         <w:rPr>
@@ -1983,7 +1983,7 @@
         <w:rPr>
           <w:noProof/>
         </w:rPr>
-        <w:t>19</w:t>
+        <w:t>20</w:t>
       </w:r>
       <w:r>
         <w:rPr>
@@ -2049,7 +2049,7 @@
         <w:rPr>
           <w:noProof/>
         </w:rPr>
-        <w:instrText xml:space="preserve"> PAGEREF _Toc239861566 \h </w:instrText>
+        <w:instrText xml:space="preserve"> PAGEREF _Toc239863708 \h </w:instrText>
       </w:r>
       <w:r>
         <w:rPr>
@@ -2066,7 +2066,7 @@
         <w:rPr>
           <w:noProof/>
         </w:rPr>
-        <w:t>19</w:t>
+        <w:t>20</w:t>
       </w:r>
       <w:r>
         <w:rPr>
@@ -2132,7 +2132,7 @@
         <w:rPr>
           <w:noProof/>
         </w:rPr>
-        <w:instrText xml:space="preserve"> PAGEREF _Toc239861567 \h </w:instrText>
+        <w:instrText xml:space="preserve"> PAGEREF _Toc239863709 \h </w:instrText>
       </w:r>
       <w:r>
         <w:rPr>
@@ -2149,7 +2149,7 @@
         <w:rPr>
           <w:noProof/>
         </w:rPr>
-        <w:t>19</w:t>
+        <w:t>20</w:t>
       </w:r>
       <w:r>
         <w:rPr>
@@ -2215,7 +2215,7 @@
         <w:rPr>
           <w:noProof/>
         </w:rPr>
-        <w:instrText xml:space="preserve"> PAGEREF _Toc239861568 \h </w:instrText>
+        <w:instrText xml:space="preserve"> PAGEREF _Toc239863710 \h </w:instrText>
       </w:r>
       <w:r>
         <w:rPr>
@@ -2232,7 +2232,7 @@
         <w:rPr>
           <w:noProof/>
         </w:rPr>
-        <w:t>21</w:t>
+        <w:t>22</w:t>
       </w:r>
       <w:r>
         <w:rPr>
@@ -2298,7 +2298,7 @@
         <w:rPr>
           <w:noProof/>
         </w:rPr>
-        <w:instrText xml:space="preserve"> PAGEREF _Toc239861569 \h </w:instrText>
+        <w:instrText xml:space="preserve"> PAGEREF _Toc239863711 \h </w:instrText>
       </w:r>
       <w:r>
         <w:rPr>
@@ -2315,7 +2315,7 @@
         <w:rPr>
           <w:noProof/>
         </w:rPr>
-        <w:t>21</w:t>
+        <w:t>22</w:t>
       </w:r>
       <w:r>
         <w:rPr>
@@ -2381,7 +2381,7 @@
         <w:rPr>
           <w:noProof/>
         </w:rPr>
-        <w:instrText xml:space="preserve"> PAGEREF _Toc239861570 \h </w:instrText>
+        <w:instrText xml:space="preserve"> PAGEREF _Toc239863712 \h </w:instrText>
       </w:r>
       <w:r>
         <w:rPr>
@@ -2398,7 +2398,7 @@
         <w:rPr>
           <w:noProof/>
         </w:rPr>
-        <w:t>21</w:t>
+        <w:t>22</w:t>
       </w:r>
       <w:r>
         <w:rPr>
@@ -2464,7 +2464,7 @@
         <w:rPr>
           <w:noProof/>
         </w:rPr>
-        <w:instrText xml:space="preserve"> PAGEREF _Toc239861571 \h </w:instrText>
+        <w:instrText xml:space="preserve"> PAGEREF _Toc239863713 \h </w:instrText>
       </w:r>
       <w:r>
         <w:rPr>
@@ -2481,7 +2481,7 @@
         <w:rPr>
           <w:noProof/>
         </w:rPr>
-        <w:t>22</w:t>
+        <w:t>23</w:t>
       </w:r>
       <w:r>
         <w:rPr>
@@ -2547,7 +2547,7 @@
         <w:rPr>
           <w:noProof/>
         </w:rPr>
-        <w:instrText xml:space="preserve"> PAGEREF _Toc239861572 \h </w:instrText>
+        <w:instrText xml:space="preserve"> PAGEREF _Toc239863714 \h </w:instrText>
       </w:r>
       <w:r>
         <w:rPr>
@@ -2564,7 +2564,7 @@
         <w:rPr>
           <w:noProof/>
         </w:rPr>
-        <w:t>22</w:t>
+        <w:t>23</w:t>
       </w:r>
       <w:r>
         <w:rPr>
@@ -2630,7 +2630,7 @@
         <w:rPr>
           <w:noProof/>
         </w:rPr>
-        <w:instrText xml:space="preserve"> PAGEREF _Toc239861573 \h </w:instrText>
+        <w:instrText xml:space="preserve"> PAGEREF _Toc239863715 \h </w:instrText>
       </w:r>
       <w:r>
         <w:rPr>
@@ -2647,7 +2647,7 @@
         <w:rPr>
           <w:noProof/>
         </w:rPr>
-        <w:t>22</w:t>
+        <w:t>23</w:t>
       </w:r>
       <w:r>
         <w:rPr>
@@ -2713,7 +2713,7 @@
         <w:rPr>
           <w:noProof/>
         </w:rPr>
-        <w:instrText xml:space="preserve"> PAGEREF _Toc239861574 \h </w:instrText>
+        <w:instrText xml:space="preserve"> PAGEREF _Toc239863716 \h </w:instrText>
       </w:r>
       <w:r>
         <w:rPr>
@@ -2730,7 +2730,7 @@
         <w:rPr>
           <w:noProof/>
         </w:rPr>
-        <w:t>22</w:t>
+        <w:t>23</w:t>
       </w:r>
       <w:r>
         <w:rPr>
@@ -2796,7 +2796,7 @@
         <w:rPr>
           <w:noProof/>
         </w:rPr>
-        <w:instrText xml:space="preserve"> PAGEREF _Toc239861575 \h </w:instrText>
+        <w:instrText xml:space="preserve"> PAGEREF _Toc239863717 \h </w:instrText>
       </w:r>
       <w:r>
         <w:rPr>
@@ -2813,7 +2813,7 @@
         <w:rPr>
           <w:noProof/>
         </w:rPr>
-        <w:t>23</w:t>
+        <w:t>24</w:t>
       </w:r>
       <w:r>
         <w:rPr>
@@ -2879,7 +2879,7 @@
         <w:rPr>
           <w:noProof/>
         </w:rPr>
-        <w:instrText xml:space="preserve"> PAGEREF _Toc239861576 \h </w:instrText>
+        <w:instrText xml:space="preserve"> PAGEREF _Toc239863718 \h </w:instrText>
       </w:r>
       <w:r>
         <w:rPr>
@@ -2896,7 +2896,7 @@
         <w:rPr>
           <w:noProof/>
         </w:rPr>
-        <w:t>23</w:t>
+        <w:t>24</w:t>
       </w:r>
       <w:r>
         <w:rPr>
@@ -2962,7 +2962,7 @@
         <w:rPr>
           <w:noProof/>
         </w:rPr>
-        <w:instrText xml:space="preserve"> PAGEREF _Toc239861577 \h </w:instrText>
+        <w:instrText xml:space="preserve"> PAGEREF _Toc239863719 \h </w:instrText>
       </w:r>
       <w:r>
         <w:rPr>
@@ -2979,7 +2979,7 @@
         <w:rPr>
           <w:noProof/>
         </w:rPr>
-        <w:t>23</w:t>
+        <w:t>24</w:t>
       </w:r>
       <w:r>
         <w:rPr>
@@ -3000,7 +3000,7 @@
       <w:r>
         <w:br w:type="page"/>
       </w:r>
-      <w:bookmarkStart w:id="1" w:name="_Toc239861544"/>
+      <w:bookmarkStart w:id="1" w:name="_Toc239863686"/>
       <w:r>
         <w:lastRenderedPageBreak/>
         <w:t>Introduzione</w:t>
@@ -3014,7 +3014,7 @@
           <w:lang w:val="it-CH"/>
         </w:rPr>
       </w:pPr>
-      <w:bookmarkStart w:id="2" w:name="_Toc239861545"/>
+      <w:bookmarkStart w:id="2" w:name="_Toc239863687"/>
       <w:r>
         <w:rPr>
           <w:lang w:val="it-CH"/>
@@ -3097,7 +3097,7 @@
           <w:lang w:val="it-CH"/>
         </w:rPr>
       </w:pPr>
-      <w:bookmarkStart w:id="3" w:name="_Toc239861546"/>
+      <w:bookmarkStart w:id="3" w:name="_Toc239863688"/>
       <w:r>
         <w:rPr>
           <w:lang w:val="it-CH"/>
@@ -3130,7 +3130,7 @@
       <w:r>
         <w:br w:type="page"/>
       </w:r>
-      <w:bookmarkStart w:id="4" w:name="_Toc239861547"/>
+      <w:bookmarkStart w:id="4" w:name="_Toc239863689"/>
       <w:r>
         <w:lastRenderedPageBreak/>
         <w:t>Analisi</w:t>
@@ -3144,7 +3144,7 @@
           <w:lang w:val="it-CH"/>
         </w:rPr>
       </w:pPr>
-      <w:bookmarkStart w:id="5" w:name="_Toc239861548"/>
+      <w:bookmarkStart w:id="5" w:name="_Toc239863690"/>
       <w:r>
         <w:rPr>
           <w:lang w:val="it-CH"/>
@@ -3267,7 +3267,7 @@
       <w:pPr>
         <w:pStyle w:val="Titolo2"/>
       </w:pPr>
-      <w:bookmarkStart w:id="6" w:name="_Toc239861549"/>
+      <w:bookmarkStart w:id="6" w:name="_Toc239863691"/>
       <w:r>
         <w:t>User Stories</w:t>
       </w:r>
@@ -4293,7 +4293,7 @@
           <w:lang w:val="it-CH"/>
         </w:rPr>
       </w:pPr>
-      <w:bookmarkStart w:id="7" w:name="_Toc239861550"/>
+      <w:bookmarkStart w:id="7" w:name="_Toc239863692"/>
       <w:r>
         <w:rPr>
           <w:lang w:val="it-CH"/>
@@ -8179,7 +8179,7 @@
       <w:pPr>
         <w:pStyle w:val="Titolo2"/>
       </w:pPr>
-      <w:bookmarkStart w:id="8" w:name="_Toc239861551"/>
+      <w:bookmarkStart w:id="8" w:name="_Toc239863693"/>
       <w:r>
         <w:lastRenderedPageBreak/>
         <w:t>Sprint Planning</w:t>
@@ -9080,7 +9080,7 @@
           <w:lang w:val="it-CH"/>
         </w:rPr>
       </w:pPr>
-      <w:bookmarkStart w:id="9" w:name="_Toc239861552"/>
+      <w:bookmarkStart w:id="9" w:name="_Toc239863694"/>
       <w:r>
         <w:rPr>
           <w:lang w:val="it-CH"/>
@@ -9110,7 +9110,7 @@
           <w:lang w:val="it-CH"/>
         </w:rPr>
       </w:pPr>
-      <w:bookmarkStart w:id="10" w:name="_Toc239861553"/>
+      <w:bookmarkStart w:id="10" w:name="_Toc239863695"/>
       <w:r>
         <w:rPr>
           <w:lang w:val="it-CH"/>
@@ -9426,7 +9426,7 @@
           <w:lang w:val="it-CH"/>
         </w:rPr>
       </w:pPr>
-      <w:bookmarkStart w:id="13" w:name="_Toc239861554"/>
+      <w:bookmarkStart w:id="13" w:name="_Toc239863696"/>
       <w:r>
         <w:rPr>
           <w:lang w:val="it-CH"/>
@@ -9455,7 +9455,7 @@
         </w:rPr>
       </w:pPr>
       <w:bookmarkStart w:id="14" w:name="_Toc413411419"/>
-      <w:bookmarkStart w:id="15" w:name="_Toc239861555"/>
+      <w:bookmarkStart w:id="15" w:name="_Toc239863697"/>
       <w:r>
         <w:rPr>
           <w:lang w:val="it-CH"/>
@@ -9487,7 +9487,7 @@
         </w:rPr>
       </w:pPr>
       <w:bookmarkStart w:id="16" w:name="_Toc413411420"/>
-      <w:bookmarkStart w:id="17" w:name="_Toc239861556"/>
+      <w:bookmarkStart w:id="17" w:name="_Toc239863698"/>
       <w:r>
         <w:rPr>
           <w:lang w:val="it-CH"/>
@@ -9513,7 +9513,7 @@
         <w:pStyle w:val="Titolo1"/>
       </w:pPr>
       <w:bookmarkStart w:id="18" w:name="_Toc429059808"/>
-      <w:bookmarkStart w:id="19" w:name="_Toc239861557"/>
+      <w:bookmarkStart w:id="19" w:name="_Toc239863699"/>
       <w:r>
         <w:t>Progettazione</w:t>
       </w:r>
@@ -9534,7 +9534,7 @@
         </w:rPr>
       </w:pPr>
       <w:bookmarkStart w:id="20" w:name="_Toc429059809"/>
-      <w:bookmarkStart w:id="21" w:name="_Toc239861558"/>
+      <w:bookmarkStart w:id="21" w:name="_Toc239863700"/>
       <w:r>
         <w:rPr>
           <w:lang w:val="it-CH"/>
@@ -9615,7 +9615,7 @@
         </w:rPr>
       </w:pPr>
       <w:bookmarkStart w:id="22" w:name="_Toc429059810"/>
-      <w:bookmarkStart w:id="23" w:name="_Toc239861559"/>
+      <w:bookmarkStart w:id="23" w:name="_Toc239863701"/>
       <w:r>
         <w:rPr>
           <w:lang w:val="it-CH"/>
@@ -9870,7 +9870,7 @@
         </w:rPr>
       </w:pPr>
       <w:bookmarkStart w:id="26" w:name="_Toc429059811"/>
-      <w:bookmarkStart w:id="27" w:name="_Toc239861560"/>
+      <w:bookmarkStart w:id="27" w:name="_Toc239863702"/>
       <w:r>
         <w:rPr>
           <w:lang w:val="it-CH"/>
@@ -9902,7 +9902,7 @@
         </w:rPr>
       </w:pPr>
       <w:bookmarkStart w:id="28" w:name="_Toc429059812"/>
-      <w:bookmarkStart w:id="29" w:name="_Toc239861561"/>
+      <w:bookmarkStart w:id="29" w:name="_Toc239863703"/>
       <w:r>
         <w:rPr>
           <w:lang w:val="it-CH"/>
@@ -9994,7 +9994,7 @@
         <w:pStyle w:val="Titolo1"/>
       </w:pPr>
       <w:bookmarkStart w:id="30" w:name="_Toc461179222"/>
-      <w:bookmarkStart w:id="31" w:name="_Toc239861562"/>
+      <w:bookmarkStart w:id="31" w:name="_Toc239863704"/>
       <w:r>
         <w:lastRenderedPageBreak/>
         <w:t>Implementazione</w:t>
@@ -10061,7 +10061,7 @@
         <w:pStyle w:val="Titolo1"/>
       </w:pPr>
       <w:bookmarkStart w:id="32" w:name="_Toc461179223"/>
-      <w:bookmarkStart w:id="33" w:name="_Toc239861563"/>
+      <w:bookmarkStart w:id="33" w:name="_Toc239863705"/>
       <w:r>
         <w:t>Test</w:t>
       </w:r>
@@ -10076,7 +10076,7 @@
         </w:rPr>
       </w:pPr>
       <w:bookmarkStart w:id="34" w:name="_Toc461179224"/>
-      <w:bookmarkStart w:id="35" w:name="_Toc239861564"/>
+      <w:bookmarkStart w:id="35" w:name="_Toc239863706"/>
       <w:r>
         <w:rPr>
           <w:lang w:val="it-CH"/>
@@ -10474,7 +10474,25 @@
                 <w:szCs w:val="24"/>
                 <w:lang w:val="fr-CH"/>
               </w:rPr>
-              <w:t>Store on local PC: Profile_1.2.001.xml (</w:t>
+              <w:t xml:space="preserve">Store on local </w:t>
+            </w:r>
+            <w:proofErr w:type="gramStart"/>
+            <w:r>
+              <w:rPr>
+                <w:sz w:val="24"/>
+                <w:szCs w:val="24"/>
+                <w:lang w:val="fr-CH"/>
+              </w:rPr>
+              <w:t>PC:</w:t>
+            </w:r>
+            <w:proofErr w:type="gramEnd"/>
+            <w:r>
+              <w:rPr>
+                <w:sz w:val="24"/>
+                <w:szCs w:val="24"/>
+                <w:lang w:val="fr-CH"/>
+              </w:rPr>
+              <w:t xml:space="preserve"> Profile_1.2.001.xml (</w:t>
             </w:r>
             <w:proofErr w:type="spellStart"/>
             <w:r>
@@ -11053,8 +11071,9 @@
                 <w:szCs w:val="24"/>
                 <w:lang w:val="fr-CH" w:eastAsia="ja-JP"/>
               </w:rPr>
-              <w:t xml:space="preserve"> the SQL:</w:t>
-            </w:r>
+              <w:t xml:space="preserve"> the </w:t>
+            </w:r>
+            <w:proofErr w:type="gramStart"/>
             <w:r>
               <w:rPr>
                 <w:rFonts w:eastAsia="MS Mincho"/>
@@ -11062,6 +11081,16 @@
                 <w:szCs w:val="24"/>
                 <w:lang w:val="fr-CH" w:eastAsia="ja-JP"/>
               </w:rPr>
+              <w:t>SQL:</w:t>
+            </w:r>
+            <w:proofErr w:type="gramEnd"/>
+            <w:r>
+              <w:rPr>
+                <w:rFonts w:eastAsia="MS Mincho"/>
+                <w:sz w:val="24"/>
+                <w:szCs w:val="24"/>
+                <w:lang w:val="fr-CH" w:eastAsia="ja-JP"/>
+              </w:rPr>
               <w:br/>
             </w:r>
             <w:r>
@@ -11580,7 +11609,7 @@
           <w:lang w:val="it-CH"/>
         </w:rPr>
       </w:pPr>
-      <w:bookmarkStart w:id="37" w:name="_Toc239861565"/>
+      <w:bookmarkStart w:id="37" w:name="_Toc239863707"/>
       <w:r>
         <w:rPr>
           <w:lang w:val="it-CH"/>
@@ -11823,7 +11852,7 @@
         </w:rPr>
       </w:pPr>
       <w:bookmarkStart w:id="38" w:name="_Toc461179226"/>
-      <w:bookmarkStart w:id="39" w:name="_Toc239861566"/>
+      <w:bookmarkStart w:id="39" w:name="_Toc239863708"/>
       <w:r>
         <w:rPr>
           <w:lang w:val="it-CH"/>
@@ -11843,7 +11872,7 @@
         <w:pStyle w:val="Titolo1"/>
       </w:pPr>
       <w:bookmarkStart w:id="40" w:name="_Toc461179227"/>
-      <w:bookmarkStart w:id="41" w:name="_Toc239861567"/>
+      <w:bookmarkStart w:id="41" w:name="_Toc239863709"/>
       <w:r>
         <w:t>Consuntivo</w:t>
       </w:r>
@@ -12137,7 +12166,7 @@
         <w:pStyle w:val="Titolo1"/>
       </w:pPr>
       <w:bookmarkStart w:id="43" w:name="_Toc461179228"/>
-      <w:bookmarkStart w:id="44" w:name="_Toc239861568"/>
+      <w:bookmarkStart w:id="44" w:name="_Toc239863710"/>
       <w:r>
         <w:lastRenderedPageBreak/>
         <w:t>Conclusioni</w:t>
@@ -12161,7 +12190,7 @@
         </w:rPr>
       </w:pPr>
       <w:bookmarkStart w:id="45" w:name="_Toc461179229"/>
-      <w:bookmarkStart w:id="46" w:name="_Toc239861569"/>
+      <w:bookmarkStart w:id="46" w:name="_Toc239863711"/>
       <w:r>
         <w:rPr>
           <w:lang w:val="it-CH"/>
@@ -12184,7 +12213,7 @@
         </w:rPr>
       </w:pPr>
       <w:bookmarkStart w:id="47" w:name="_Toc461179230"/>
-      <w:bookmarkStart w:id="48" w:name="_Toc239861570"/>
+      <w:bookmarkStart w:id="48" w:name="_Toc239863712"/>
       <w:r>
         <w:rPr>
           <w:lang w:val="it-CH"/>
@@ -12218,7 +12247,7 @@
       <w:pPr>
         <w:pStyle w:val="Titolo1"/>
       </w:pPr>
-      <w:bookmarkStart w:id="50" w:name="_Toc239861571"/>
+      <w:bookmarkStart w:id="50" w:name="_Toc239863713"/>
       <w:r>
         <w:lastRenderedPageBreak/>
         <w:t>Bibliografia</w:t>
@@ -12234,7 +12263,7 @@
         </w:rPr>
       </w:pPr>
       <w:bookmarkStart w:id="51" w:name="_Toc461179232"/>
-      <w:bookmarkStart w:id="52" w:name="_Toc239861572"/>
+      <w:bookmarkStart w:id="52" w:name="_Toc239863714"/>
       <w:r>
         <w:rPr>
           <w:lang w:val="it-CH"/>
@@ -12310,7 +12339,7 @@
         </w:rPr>
       </w:pPr>
       <w:bookmarkStart w:id="53" w:name="_Toc461179233"/>
-      <w:bookmarkStart w:id="54" w:name="_Toc239861573"/>
+      <w:bookmarkStart w:id="54" w:name="_Toc239863715"/>
       <w:r>
         <w:rPr>
           <w:lang w:val="it-CH"/>
@@ -12399,7 +12428,7 @@
         </w:rPr>
       </w:pPr>
       <w:bookmarkStart w:id="55" w:name="_Toc461179234"/>
-      <w:bookmarkStart w:id="56" w:name="_Toc239861574"/>
+      <w:bookmarkStart w:id="56" w:name="_Toc239863716"/>
       <w:r>
         <w:rPr>
           <w:lang w:val="it-CH"/>
@@ -12529,7 +12558,7 @@
       <w:pPr>
         <w:pStyle w:val="Titolo1"/>
       </w:pPr>
-      <w:bookmarkStart w:id="58" w:name="_Toc239861575"/>
+      <w:bookmarkStart w:id="58" w:name="_Toc239863717"/>
       <w:r>
         <w:lastRenderedPageBreak/>
         <w:t>Glossario</w:t>
@@ -12715,7 +12744,7 @@
       <w:pPr>
         <w:pStyle w:val="Titolo1"/>
       </w:pPr>
-      <w:bookmarkStart w:id="59" w:name="_Toc239861576"/>
+      <w:bookmarkStart w:id="59" w:name="_Toc239863718"/>
       <w:r>
         <w:t>Indice delle figure</w:t>
       </w:r>
@@ -13099,7 +13128,7 @@
       <w:pPr>
         <w:pStyle w:val="Titolo1"/>
       </w:pPr>
-      <w:bookmarkStart w:id="60" w:name="_Toc239861577"/>
+      <w:bookmarkStart w:id="60" w:name="_Toc239863719"/>
       <w:r>
         <w:t>Allegati</w:t>
       </w:r>
@@ -13835,7 +13864,7 @@
         <w:noProof/>
         <w:sz w:val="20"/>
       </w:rPr>
-      <w:t>08.09.2026</w:t>
+      <w:t>09.09.2026</w:t>
     </w:r>
     <w:r>
       <w:rPr>
@@ -14063,7 +14092,7 @@
         <w:noProof/>
         <w:sz w:val="20"/>
       </w:rPr>
-      <w:t>08.09.2026</w:t>
+      <w:t>09.09.2026</w:t>
     </w:r>
     <w:r>
       <w:rPr>
@@ -20030,6 +20059,7 @@
   <w:style w:type="character" w:default="1" w:styleId="Carpredefinitoparagrafo">
     <w:name w:val="Default Paragraph Font"/>
     <w:uiPriority w:val="1"/>
+    <w:semiHidden/>
     <w:unhideWhenUsed/>
   </w:style>
   <w:style w:type="table" w:default="1" w:styleId="Tabellanormale">

</xml_diff>

<commit_message>
Indice aggiornato, Sprint Planning completato
</commit_message>
<xml_diff>
--- a/3_Documentazione/Documentazione.docx
+++ b/3_Documentazione/Documentazione.docx
@@ -67,7 +67,7 @@
       <w:pPr>
         <w:pStyle w:val="Titolo1"/>
       </w:pPr>
-      <w:bookmarkStart w:id="0" w:name="_Toc240033409"/>
+      <w:bookmarkStart w:id="0" w:name="_Toc240284365"/>
       <w:r>
         <w:lastRenderedPageBreak/>
         <w:t>Indice</w:t>
@@ -140,7 +140,7 @@
         <w:rPr>
           <w:noProof/>
         </w:rPr>
-        <w:instrText xml:space="preserve"> PAGEREF _Toc240033409 \h </w:instrText>
+        <w:instrText xml:space="preserve"> PAGEREF _Toc240284365 \h </w:instrText>
       </w:r>
       <w:r>
         <w:rPr>
@@ -223,7 +223,7 @@
         <w:rPr>
           <w:noProof/>
         </w:rPr>
-        <w:instrText xml:space="preserve"> PAGEREF _Toc240033410 \h </w:instrText>
+        <w:instrText xml:space="preserve"> PAGEREF _Toc240284366 \h </w:instrText>
       </w:r>
       <w:r>
         <w:rPr>
@@ -306,7 +306,7 @@
         <w:rPr>
           <w:noProof/>
         </w:rPr>
-        <w:instrText xml:space="preserve"> PAGEREF _Toc240033411 \h </w:instrText>
+        <w:instrText xml:space="preserve"> PAGEREF _Toc240284367 \h </w:instrText>
       </w:r>
       <w:r>
         <w:rPr>
@@ -389,7 +389,7 @@
         <w:rPr>
           <w:noProof/>
         </w:rPr>
-        <w:instrText xml:space="preserve"> PAGEREF _Toc240033412 \h </w:instrText>
+        <w:instrText xml:space="preserve"> PAGEREF _Toc240284368 \h </w:instrText>
       </w:r>
       <w:r>
         <w:rPr>
@@ -472,7 +472,7 @@
         <w:rPr>
           <w:noProof/>
         </w:rPr>
-        <w:instrText xml:space="preserve"> PAGEREF _Toc240033413 \h </w:instrText>
+        <w:instrText xml:space="preserve"> PAGEREF _Toc240284369 \h </w:instrText>
       </w:r>
       <w:r>
         <w:rPr>
@@ -555,7 +555,7 @@
         <w:rPr>
           <w:noProof/>
         </w:rPr>
-        <w:instrText xml:space="preserve"> PAGEREF _Toc240033414 \h </w:instrText>
+        <w:instrText xml:space="preserve"> PAGEREF _Toc240284370 \h </w:instrText>
       </w:r>
       <w:r>
         <w:rPr>
@@ -638,7 +638,7 @@
         <w:rPr>
           <w:noProof/>
         </w:rPr>
-        <w:instrText xml:space="preserve"> PAGEREF _Toc240033415 \h </w:instrText>
+        <w:instrText xml:space="preserve"> PAGEREF _Toc240284371 \h </w:instrText>
       </w:r>
       <w:r>
         <w:rPr>
@@ -721,7 +721,7 @@
         <w:rPr>
           <w:noProof/>
         </w:rPr>
-        <w:instrText xml:space="preserve"> PAGEREF _Toc240033416 \h </w:instrText>
+        <w:instrText xml:space="preserve"> PAGEREF _Toc240284372 \h </w:instrText>
       </w:r>
       <w:r>
         <w:rPr>
@@ -804,7 +804,7 @@
         <w:rPr>
           <w:noProof/>
         </w:rPr>
-        <w:instrText xml:space="preserve"> PAGEREF _Toc240033417 \h </w:instrText>
+        <w:instrText xml:space="preserve"> PAGEREF _Toc240284373 \h </w:instrText>
       </w:r>
       <w:r>
         <w:rPr>
@@ -887,7 +887,7 @@
         <w:rPr>
           <w:noProof/>
         </w:rPr>
-        <w:instrText xml:space="preserve"> PAGEREF _Toc240033418 \h </w:instrText>
+        <w:instrText xml:space="preserve"> PAGEREF _Toc240284374 \h </w:instrText>
       </w:r>
       <w:r>
         <w:rPr>
@@ -970,7 +970,7 @@
         <w:rPr>
           <w:noProof/>
         </w:rPr>
-        <w:instrText xml:space="preserve"> PAGEREF _Toc240033419 \h </w:instrText>
+        <w:instrText xml:space="preserve"> PAGEREF _Toc240284375 \h </w:instrText>
       </w:r>
       <w:r>
         <w:rPr>
@@ -1053,7 +1053,7 @@
         <w:rPr>
           <w:noProof/>
         </w:rPr>
-        <w:instrText xml:space="preserve"> PAGEREF _Toc240033420 \h </w:instrText>
+        <w:instrText xml:space="preserve"> PAGEREF _Toc240284376 \h </w:instrText>
       </w:r>
       <w:r>
         <w:rPr>
@@ -1136,7 +1136,7 @@
         <w:rPr>
           <w:noProof/>
         </w:rPr>
-        <w:instrText xml:space="preserve"> PAGEREF _Toc240033421 \h </w:instrText>
+        <w:instrText xml:space="preserve"> PAGEREF _Toc240284377 \h </w:instrText>
       </w:r>
       <w:r>
         <w:rPr>
@@ -1219,7 +1219,7 @@
         <w:rPr>
           <w:noProof/>
         </w:rPr>
-        <w:instrText xml:space="preserve"> PAGEREF _Toc240033422 \h </w:instrText>
+        <w:instrText xml:space="preserve"> PAGEREF _Toc240284378 \h </w:instrText>
       </w:r>
       <w:r>
         <w:rPr>
@@ -1302,7 +1302,7 @@
         <w:rPr>
           <w:noProof/>
         </w:rPr>
-        <w:instrText xml:space="preserve"> PAGEREF _Toc240033423 \h </w:instrText>
+        <w:instrText xml:space="preserve"> PAGEREF _Toc240284379 \h </w:instrText>
       </w:r>
       <w:r>
         <w:rPr>
@@ -1385,7 +1385,7 @@
         <w:rPr>
           <w:noProof/>
         </w:rPr>
-        <w:instrText xml:space="preserve"> PAGEREF _Toc240033424 \h </w:instrText>
+        <w:instrText xml:space="preserve"> PAGEREF _Toc240284380 \h </w:instrText>
       </w:r>
       <w:r>
         <w:rPr>
@@ -1468,7 +1468,7 @@
         <w:rPr>
           <w:noProof/>
         </w:rPr>
-        <w:instrText xml:space="preserve"> PAGEREF _Toc240033425 \h </w:instrText>
+        <w:instrText xml:space="preserve"> PAGEREF _Toc240284381 \h </w:instrText>
       </w:r>
       <w:r>
         <w:rPr>
@@ -1551,7 +1551,7 @@
         <w:rPr>
           <w:noProof/>
         </w:rPr>
-        <w:instrText xml:space="preserve"> PAGEREF _Toc240033426 \h </w:instrText>
+        <w:instrText xml:space="preserve"> PAGEREF _Toc240284382 \h </w:instrText>
       </w:r>
       <w:r>
         <w:rPr>
@@ -1634,7 +1634,7 @@
         <w:rPr>
           <w:noProof/>
         </w:rPr>
-        <w:instrText xml:space="preserve"> PAGEREF _Toc240033427 \h </w:instrText>
+        <w:instrText xml:space="preserve"> PAGEREF _Toc240284383 \h </w:instrText>
       </w:r>
       <w:r>
         <w:rPr>
@@ -1717,7 +1717,7 @@
         <w:rPr>
           <w:noProof/>
         </w:rPr>
-        <w:instrText xml:space="preserve"> PAGEREF _Toc240033428 \h </w:instrText>
+        <w:instrText xml:space="preserve"> PAGEREF _Toc240284384 \h </w:instrText>
       </w:r>
       <w:r>
         <w:rPr>
@@ -1800,7 +1800,7 @@
         <w:rPr>
           <w:noProof/>
         </w:rPr>
-        <w:instrText xml:space="preserve"> PAGEREF _Toc240033429 \h </w:instrText>
+        <w:instrText xml:space="preserve"> PAGEREF _Toc240284385 \h </w:instrText>
       </w:r>
       <w:r>
         <w:rPr>
@@ -1883,7 +1883,7 @@
         <w:rPr>
           <w:noProof/>
         </w:rPr>
-        <w:instrText xml:space="preserve"> PAGEREF _Toc240033430 \h </w:instrText>
+        <w:instrText xml:space="preserve"> PAGEREF _Toc240284386 \h </w:instrText>
       </w:r>
       <w:r>
         <w:rPr>
@@ -1966,7 +1966,7 @@
         <w:rPr>
           <w:noProof/>
         </w:rPr>
-        <w:instrText xml:space="preserve"> PAGEREF _Toc240033431 \h </w:instrText>
+        <w:instrText xml:space="preserve"> PAGEREF _Toc240284387 \h </w:instrText>
       </w:r>
       <w:r>
         <w:rPr>
@@ -2049,7 +2049,7 @@
         <w:rPr>
           <w:noProof/>
         </w:rPr>
-        <w:instrText xml:space="preserve"> PAGEREF _Toc240033432 \h </w:instrText>
+        <w:instrText xml:space="preserve"> PAGEREF _Toc240284388 \h </w:instrText>
       </w:r>
       <w:r>
         <w:rPr>
@@ -2132,7 +2132,7 @@
         <w:rPr>
           <w:noProof/>
         </w:rPr>
-        <w:instrText xml:space="preserve"> PAGEREF _Toc240033433 \h </w:instrText>
+        <w:instrText xml:space="preserve"> PAGEREF _Toc240284389 \h </w:instrText>
       </w:r>
       <w:r>
         <w:rPr>
@@ -2215,7 +2215,7 @@
         <w:rPr>
           <w:noProof/>
         </w:rPr>
-        <w:instrText xml:space="preserve"> PAGEREF _Toc240033434 \h </w:instrText>
+        <w:instrText xml:space="preserve"> PAGEREF _Toc240284390 \h </w:instrText>
       </w:r>
       <w:r>
         <w:rPr>
@@ -2298,7 +2298,7 @@
         <w:rPr>
           <w:noProof/>
         </w:rPr>
-        <w:instrText xml:space="preserve"> PAGEREF _Toc240033435 \h </w:instrText>
+        <w:instrText xml:space="preserve"> PAGEREF _Toc240284391 \h </w:instrText>
       </w:r>
       <w:r>
         <w:rPr>
@@ -2381,7 +2381,7 @@
         <w:rPr>
           <w:noProof/>
         </w:rPr>
-        <w:instrText xml:space="preserve"> PAGEREF _Toc240033436 \h </w:instrText>
+        <w:instrText xml:space="preserve"> PAGEREF _Toc240284392 \h </w:instrText>
       </w:r>
       <w:r>
         <w:rPr>
@@ -2464,7 +2464,7 @@
         <w:rPr>
           <w:noProof/>
         </w:rPr>
-        <w:instrText xml:space="preserve"> PAGEREF _Toc240033437 \h </w:instrText>
+        <w:instrText xml:space="preserve"> PAGEREF _Toc240284393 \h </w:instrText>
       </w:r>
       <w:r>
         <w:rPr>
@@ -2547,7 +2547,7 @@
         <w:rPr>
           <w:noProof/>
         </w:rPr>
-        <w:instrText xml:space="preserve"> PAGEREF _Toc240033438 \h </w:instrText>
+        <w:instrText xml:space="preserve"> PAGEREF _Toc240284394 \h </w:instrText>
       </w:r>
       <w:r>
         <w:rPr>
@@ -2630,7 +2630,7 @@
         <w:rPr>
           <w:noProof/>
         </w:rPr>
-        <w:instrText xml:space="preserve"> PAGEREF _Toc240033439 \h </w:instrText>
+        <w:instrText xml:space="preserve"> PAGEREF _Toc240284395 \h </w:instrText>
       </w:r>
       <w:r>
         <w:rPr>
@@ -2713,7 +2713,7 @@
         <w:rPr>
           <w:noProof/>
         </w:rPr>
-        <w:instrText xml:space="preserve"> PAGEREF _Toc240033440 \h </w:instrText>
+        <w:instrText xml:space="preserve"> PAGEREF _Toc240284396 \h </w:instrText>
       </w:r>
       <w:r>
         <w:rPr>
@@ -2796,7 +2796,7 @@
         <w:rPr>
           <w:noProof/>
         </w:rPr>
-        <w:instrText xml:space="preserve"> PAGEREF _Toc240033441 \h </w:instrText>
+        <w:instrText xml:space="preserve"> PAGEREF _Toc240284397 \h </w:instrText>
       </w:r>
       <w:r>
         <w:rPr>
@@ -2879,7 +2879,7 @@
         <w:rPr>
           <w:noProof/>
         </w:rPr>
-        <w:instrText xml:space="preserve"> PAGEREF _Toc240033442 \h </w:instrText>
+        <w:instrText xml:space="preserve"> PAGEREF _Toc240284398 \h </w:instrText>
       </w:r>
       <w:r>
         <w:rPr>
@@ -2962,7 +2962,7 @@
         <w:rPr>
           <w:noProof/>
         </w:rPr>
-        <w:instrText xml:space="preserve"> PAGEREF _Toc240033443 \h </w:instrText>
+        <w:instrText xml:space="preserve"> PAGEREF _Toc240284399 \h </w:instrText>
       </w:r>
       <w:r>
         <w:rPr>
@@ -3045,7 +3045,7 @@
         <w:rPr>
           <w:noProof/>
         </w:rPr>
-        <w:instrText xml:space="preserve"> PAGEREF _Toc240033444 \h </w:instrText>
+        <w:instrText xml:space="preserve"> PAGEREF _Toc240284400 \h </w:instrText>
       </w:r>
       <w:r>
         <w:rPr>
@@ -3083,7 +3083,7 @@
       <w:r>
         <w:br w:type="page"/>
       </w:r>
-      <w:bookmarkStart w:id="1" w:name="_Toc240033410"/>
+      <w:bookmarkStart w:id="1" w:name="_Toc240284366"/>
       <w:r>
         <w:lastRenderedPageBreak/>
         <w:t>Introduzione</w:t>
@@ -3097,7 +3097,7 @@
           <w:lang w:val="it-CH"/>
         </w:rPr>
       </w:pPr>
-      <w:bookmarkStart w:id="2" w:name="_Toc240033411"/>
+      <w:bookmarkStart w:id="2" w:name="_Toc240284367"/>
       <w:r>
         <w:rPr>
           <w:lang w:val="it-CH"/>
@@ -3146,7 +3146,7 @@
           <w:lang w:val="it-CH"/>
         </w:rPr>
       </w:pPr>
-      <w:bookmarkStart w:id="3" w:name="_Toc240033412"/>
+      <w:bookmarkStart w:id="3" w:name="_Toc240284368"/>
       <w:r>
         <w:rPr>
           <w:lang w:val="it-CH"/>
@@ -3231,7 +3231,7 @@
       <w:r>
         <w:br w:type="page"/>
       </w:r>
-      <w:bookmarkStart w:id="4" w:name="_Toc240033413"/>
+      <w:bookmarkStart w:id="4" w:name="_Toc240284369"/>
       <w:r>
         <w:lastRenderedPageBreak/>
         <w:t>Analisi</w:t>
@@ -3245,7 +3245,7 @@
           <w:lang w:val="it-CH"/>
         </w:rPr>
       </w:pPr>
-      <w:bookmarkStart w:id="5" w:name="_Toc240033414"/>
+      <w:bookmarkStart w:id="5" w:name="_Toc240284370"/>
       <w:r>
         <w:rPr>
           <w:lang w:val="it-CH"/>
@@ -3404,7 +3404,7 @@
       <w:pPr>
         <w:pStyle w:val="Titolo2"/>
       </w:pPr>
-      <w:bookmarkStart w:id="6" w:name="_Toc240033415"/>
+      <w:bookmarkStart w:id="6" w:name="_Toc240284371"/>
       <w:proofErr w:type="spellStart"/>
       <w:r>
         <w:lastRenderedPageBreak/>
@@ -3638,7 +3638,7 @@
       <w:pPr>
         <w:pStyle w:val="Titolo2"/>
       </w:pPr>
-      <w:bookmarkStart w:id="7" w:name="_Toc240033416"/>
+      <w:bookmarkStart w:id="7" w:name="_Toc240284372"/>
       <w:r>
         <w:lastRenderedPageBreak/>
         <w:t>User Stories</w:t>
@@ -4670,7 +4670,7 @@
           <w:lang w:val="it-CH"/>
         </w:rPr>
       </w:pPr>
-      <w:bookmarkStart w:id="8" w:name="_Toc240033417"/>
+      <w:bookmarkStart w:id="8" w:name="_Toc240284373"/>
       <w:r>
         <w:rPr>
           <w:lang w:val="it-CH"/>
@@ -8469,7 +8469,7 @@
       <w:pPr>
         <w:pStyle w:val="Titolo3"/>
       </w:pPr>
-      <w:bookmarkStart w:id="9" w:name="_Toc240033418"/>
+      <w:bookmarkStart w:id="9" w:name="_Toc240284374"/>
       <w:r>
         <w:t>Spiegazione elementi tabella dei requisiti:</w:t>
       </w:r>
@@ -8575,7 +8575,7 @@
       <w:pPr>
         <w:pStyle w:val="Titolo2"/>
       </w:pPr>
-      <w:bookmarkStart w:id="10" w:name="_Toc240033419"/>
+      <w:bookmarkStart w:id="10" w:name="_Toc240284375"/>
       <w:r>
         <w:lastRenderedPageBreak/>
         <w:t>Sprint Planning</w:t>
@@ -8820,7 +8820,15 @@
                 <w:bCs/>
                 <w:lang w:val="it-IT"/>
               </w:rPr>
-              <w:t>24</w:t>
+              <w:t>2</w:t>
+            </w:r>
+            <w:r>
+              <w:rPr>
+                <w:b/>
+                <w:bCs/>
+                <w:lang w:val="it-IT"/>
+              </w:rPr>
+              <w:t>0</w:t>
             </w:r>
           </w:p>
         </w:tc>
@@ -8946,7 +8954,13 @@
               <w:rPr>
                 <w:lang w:val="it-IT"/>
               </w:rPr>
-              <w:t>16</w:t>
+              <w:t>1</w:t>
+            </w:r>
+            <w:r>
+              <w:rPr>
+                <w:lang w:val="it-IT"/>
+              </w:rPr>
+              <w:t>2</w:t>
             </w:r>
           </w:p>
         </w:tc>
@@ -9933,7 +9947,7 @@
           <w:lang w:val="it-CH"/>
         </w:rPr>
       </w:pPr>
-      <w:bookmarkStart w:id="11" w:name="_Toc240033420"/>
+      <w:bookmarkStart w:id="11" w:name="_Toc240284376"/>
       <w:r>
         <w:rPr>
           <w:lang w:val="it-CH"/>
@@ -9963,7 +9977,7 @@
           <w:lang w:val="it-CH"/>
         </w:rPr>
       </w:pPr>
-      <w:bookmarkStart w:id="12" w:name="_Toc240033421"/>
+      <w:bookmarkStart w:id="12" w:name="_Toc240284377"/>
       <w:r>
         <w:rPr>
           <w:lang w:val="it-CH"/>
@@ -10279,7 +10293,7 @@
           <w:lang w:val="it-CH"/>
         </w:rPr>
       </w:pPr>
-      <w:bookmarkStart w:id="15" w:name="_Toc240033422"/>
+      <w:bookmarkStart w:id="15" w:name="_Toc240284378"/>
       <w:r>
         <w:rPr>
           <w:lang w:val="it-CH"/>
@@ -10344,7 +10358,7 @@
           <w:lang w:val="it-CH"/>
         </w:rPr>
       </w:pPr>
-      <w:bookmarkStart w:id="17" w:name="_Toc240033423"/>
+      <w:bookmarkStart w:id="17" w:name="_Toc240284379"/>
       <w:r>
         <w:rPr>
           <w:lang w:val="it-CH"/>
@@ -10517,7 +10531,7 @@
         </w:rPr>
       </w:pPr>
       <w:bookmarkStart w:id="18" w:name="_Toc413411420"/>
-      <w:bookmarkStart w:id="19" w:name="_Toc240033424"/>
+      <w:bookmarkStart w:id="19" w:name="_Toc240284380"/>
       <w:r>
         <w:rPr>
           <w:lang w:val="it-CH"/>
@@ -10570,7 +10584,7 @@
       <w:pPr>
         <w:pStyle w:val="Titolo1"/>
       </w:pPr>
-      <w:bookmarkStart w:id="21" w:name="_Toc240033425"/>
+      <w:bookmarkStart w:id="21" w:name="_Toc240284381"/>
       <w:r>
         <w:lastRenderedPageBreak/>
         <w:t>Progettazione</w:t>
@@ -10586,7 +10600,7 @@
         </w:rPr>
       </w:pPr>
       <w:bookmarkStart w:id="22" w:name="_Toc429059810"/>
-      <w:bookmarkStart w:id="23" w:name="_Toc240033426"/>
+      <w:bookmarkStart w:id="23" w:name="_Toc240284382"/>
       <w:r>
         <w:rPr>
           <w:noProof/>
@@ -10812,7 +10826,7 @@
         </w:rPr>
       </w:pPr>
       <w:bookmarkStart w:id="24" w:name="_Toc429059811"/>
-      <w:bookmarkStart w:id="25" w:name="_Toc240033427"/>
+      <w:bookmarkStart w:id="25" w:name="_Toc240284383"/>
       <w:r>
         <w:rPr>
           <w:lang w:val="it-CH"/>
@@ -10843,7 +10857,7 @@
         </w:rPr>
       </w:pPr>
       <w:bookmarkStart w:id="26" w:name="_Toc429059812"/>
-      <w:bookmarkStart w:id="27" w:name="_Toc240033428"/>
+      <w:bookmarkStart w:id="27" w:name="_Toc240284384"/>
       <w:r>
         <w:rPr>
           <w:lang w:val="it-CH"/>
@@ -10935,7 +10949,7 @@
         <w:pStyle w:val="Titolo1"/>
       </w:pPr>
       <w:bookmarkStart w:id="28" w:name="_Toc461179222"/>
-      <w:bookmarkStart w:id="29" w:name="_Toc240033429"/>
+      <w:bookmarkStart w:id="29" w:name="_Toc240284385"/>
       <w:r>
         <w:lastRenderedPageBreak/>
         <w:t>Implementazione</w:t>
@@ -11002,7 +11016,7 @@
         <w:pStyle w:val="Titolo1"/>
       </w:pPr>
       <w:bookmarkStart w:id="30" w:name="_Toc461179223"/>
-      <w:bookmarkStart w:id="31" w:name="_Toc240033430"/>
+      <w:bookmarkStart w:id="31" w:name="_Toc240284386"/>
       <w:r>
         <w:t>Test</w:t>
       </w:r>
@@ -11017,7 +11031,7 @@
         </w:rPr>
       </w:pPr>
       <w:bookmarkStart w:id="32" w:name="_Toc461179224"/>
-      <w:bookmarkStart w:id="33" w:name="_Toc240033431"/>
+      <w:bookmarkStart w:id="33" w:name="_Toc240284387"/>
       <w:r>
         <w:rPr>
           <w:lang w:val="it-CH"/>
@@ -12550,7 +12564,7 @@
           <w:lang w:val="it-CH"/>
         </w:rPr>
       </w:pPr>
-      <w:bookmarkStart w:id="35" w:name="_Toc240033432"/>
+      <w:bookmarkStart w:id="35" w:name="_Toc240284388"/>
       <w:r>
         <w:rPr>
           <w:lang w:val="it-CH"/>
@@ -12793,7 +12807,7 @@
         </w:rPr>
       </w:pPr>
       <w:bookmarkStart w:id="36" w:name="_Toc461179226"/>
-      <w:bookmarkStart w:id="37" w:name="_Toc240033433"/>
+      <w:bookmarkStart w:id="37" w:name="_Toc240284389"/>
       <w:r>
         <w:rPr>
           <w:lang w:val="it-CH"/>
@@ -12813,7 +12827,7 @@
         <w:pStyle w:val="Titolo1"/>
       </w:pPr>
       <w:bookmarkStart w:id="38" w:name="_Toc461179227"/>
-      <w:bookmarkStart w:id="39" w:name="_Toc240033434"/>
+      <w:bookmarkStart w:id="39" w:name="_Toc240284390"/>
       <w:r>
         <w:t>Consuntivo</w:t>
       </w:r>
@@ -13107,7 +13121,7 @@
         <w:pStyle w:val="Titolo1"/>
       </w:pPr>
       <w:bookmarkStart w:id="41" w:name="_Toc461179228"/>
-      <w:bookmarkStart w:id="42" w:name="_Toc240033435"/>
+      <w:bookmarkStart w:id="42" w:name="_Toc240284391"/>
       <w:r>
         <w:lastRenderedPageBreak/>
         <w:t>Conclusioni</w:t>
@@ -13131,7 +13145,7 @@
         </w:rPr>
       </w:pPr>
       <w:bookmarkStart w:id="43" w:name="_Toc461179229"/>
-      <w:bookmarkStart w:id="44" w:name="_Toc240033436"/>
+      <w:bookmarkStart w:id="44" w:name="_Toc240284392"/>
       <w:r>
         <w:rPr>
           <w:lang w:val="it-CH"/>
@@ -13154,7 +13168,7 @@
         </w:rPr>
       </w:pPr>
       <w:bookmarkStart w:id="45" w:name="_Toc461179230"/>
-      <w:bookmarkStart w:id="46" w:name="_Toc240033437"/>
+      <w:bookmarkStart w:id="46" w:name="_Toc240284393"/>
       <w:r>
         <w:rPr>
           <w:lang w:val="it-CH"/>
@@ -13188,7 +13202,7 @@
       <w:pPr>
         <w:pStyle w:val="Titolo1"/>
       </w:pPr>
-      <w:bookmarkStart w:id="48" w:name="_Toc240033438"/>
+      <w:bookmarkStart w:id="48" w:name="_Toc240284394"/>
       <w:r>
         <w:lastRenderedPageBreak/>
         <w:t>Bibliografia</w:t>
@@ -13204,7 +13218,7 @@
         </w:rPr>
       </w:pPr>
       <w:bookmarkStart w:id="49" w:name="_Toc461179232"/>
-      <w:bookmarkStart w:id="50" w:name="_Toc240033439"/>
+      <w:bookmarkStart w:id="50" w:name="_Toc240284395"/>
       <w:r>
         <w:rPr>
           <w:lang w:val="it-CH"/>
@@ -13280,7 +13294,7 @@
         </w:rPr>
       </w:pPr>
       <w:bookmarkStart w:id="51" w:name="_Toc461179233"/>
-      <w:bookmarkStart w:id="52" w:name="_Toc240033440"/>
+      <w:bookmarkStart w:id="52" w:name="_Toc240284396"/>
       <w:r>
         <w:rPr>
           <w:lang w:val="it-CH"/>
@@ -13369,7 +13383,7 @@
         </w:rPr>
       </w:pPr>
       <w:bookmarkStart w:id="53" w:name="_Toc461179234"/>
-      <w:bookmarkStart w:id="54" w:name="_Toc240033441"/>
+      <w:bookmarkStart w:id="54" w:name="_Toc240284397"/>
       <w:r>
         <w:rPr>
           <w:lang w:val="it-CH"/>
@@ -13499,7 +13513,7 @@
       <w:pPr>
         <w:pStyle w:val="Titolo1"/>
       </w:pPr>
-      <w:bookmarkStart w:id="56" w:name="_Toc240033442"/>
+      <w:bookmarkStart w:id="56" w:name="_Toc240284398"/>
       <w:r>
         <w:lastRenderedPageBreak/>
         <w:t>Glossario</w:t>
@@ -13685,7 +13699,7 @@
       <w:pPr>
         <w:pStyle w:val="Titolo1"/>
       </w:pPr>
-      <w:bookmarkStart w:id="57" w:name="_Toc240033443"/>
+      <w:bookmarkStart w:id="57" w:name="_Toc240284399"/>
       <w:r>
         <w:t>Indice delle figure</w:t>
       </w:r>
@@ -14069,7 +14083,7 @@
       <w:pPr>
         <w:pStyle w:val="Titolo1"/>
       </w:pPr>
-      <w:bookmarkStart w:id="58" w:name="_Toc240033444"/>
+      <w:bookmarkStart w:id="58" w:name="_Toc240284400"/>
       <w:r>
         <w:t>Allegati</w:t>
       </w:r>
@@ -14296,7 +14310,7 @@
         <w:noProof/>
         <w:sz w:val="20"/>
       </w:rPr>
-      <w:t>11.09.2026</w:t>
+      <w:t>14.09.2026</w:t>
     </w:r>
     <w:r>
       <w:rPr>
@@ -21139,6 +21153,7 @@
   <w:style w:type="character" w:default="1" w:styleId="Carpredefinitoparagrafo">
     <w:name w:val="Default Paragraph Font"/>
     <w:uiPriority w:val="1"/>
+    <w:semiHidden/>
     <w:unhideWhenUsed/>
   </w:style>
   <w:style w:type="table" w:default="1" w:styleId="Tabellanormale">

</xml_diff>

<commit_message>
Use Case finito, Inizio creazione e documentazione delle prime UI
</commit_message>
<xml_diff>
--- a/3_Documentazione/Documentazione.docx
+++ b/3_Documentazione/Documentazione.docx
@@ -18,19 +18,11 @@
           <w:lang w:val="it-CH"/>
         </w:rPr>
       </w:pPr>
-      <w:proofErr w:type="spellStart"/>
       <w:r>
         <w:rPr>
           <w:lang w:val="it-CH"/>
         </w:rPr>
-        <w:t>Brutal</w:t>
-      </w:r>
-      <w:proofErr w:type="spellEnd"/>
-      <w:r>
-        <w:rPr>
-          <w:lang w:val="it-CH"/>
-        </w:rPr>
-        <w:t xml:space="preserve"> Bumper Cars (BBC)</w:t>
+        <w:t>Brutal Bumper Cars (BBC)</w:t>
       </w:r>
     </w:p>
     <w:p>
@@ -3256,15 +3248,7 @@
     </w:p>
     <w:p>
       <w:r>
-        <w:t>Il progetto "</w:t>
-      </w:r>
-      <w:proofErr w:type="spellStart"/>
-      <w:r>
-        <w:t>Brutal</w:t>
-      </w:r>
-      <w:proofErr w:type="spellEnd"/>
-      <w:r>
-        <w:t xml:space="preserve"> Bumper Cars" è un videogioco 3D dove ci si scontra con gli autoscontri. Il gioco non si svolge in una normale pista da luna park, ma in una grande arena piena di ostacoli, rampe e salite. Lo scopo del gioco è distruggere le auto nemiche e rimanere l'ultimo in gara. </w:t>
+        <w:t xml:space="preserve">Il progetto "Brutal Bumper Cars" è un videogioco 3D dove ci si scontra con gli autoscontri. Il gioco non si svolge in una normale pista da luna park, ma in una grande arena piena di ostacoli, rampe e salite. Lo scopo del gioco è distruggere le auto nemiche e rimanere l'ultimo in gara. </w:t>
       </w:r>
     </w:p>
     <w:p>
@@ -3293,15 +3277,7 @@
         <w:t>Il Giocatore:</w:t>
       </w:r>
       <w:r>
-        <w:t xml:space="preserve"> Guida il suo autoscontro. Può fare derapate (drift) per prendere bene le curve e usare uno scatto veloce (</w:t>
-      </w:r>
-      <w:proofErr w:type="spellStart"/>
-      <w:r>
-        <w:t>boost</w:t>
-      </w:r>
-      <w:proofErr w:type="spellEnd"/>
-      <w:r>
-        <w:t xml:space="preserve">) che si ricarica nel tempo, utile per scappare o attaccare. </w:t>
+        <w:t xml:space="preserve"> Guida il suo autoscontro. Può fare derapate (drift) per prendere bene le curve e usare uno scatto veloce (boost) che si ricarica nel tempo, utile per scappare o attaccare. </w:t>
       </w:r>
     </w:p>
     <w:p>
@@ -3369,263 +3345,111 @@
       <w:r>
         <w:t xml:space="preserve">Esistono già giochi storici basati sugli scontri in arena, come il celebre </w:t>
       </w:r>
-      <w:proofErr w:type="spellStart"/>
       <w:r>
         <w:rPr>
           <w:b/>
           <w:bCs/>
         </w:rPr>
-        <w:t>Destruction</w:t>
-      </w:r>
-      <w:proofErr w:type="spellEnd"/>
+        <w:t>Destruction Derby</w:t>
+      </w:r>
+      <w:r>
+        <w:t>, ma il nostro progetto si distingue per due motivi principali. Innanzitutto, noi mettiamo in pista dei veri e propri autoscontri invece delle classiche automobili. In secondo luogo, uniamo il realismo fisico dei danni a meccaniche caotiche e divertenti: invece di limitarci ai semplici tamponamenti, permettiamo al giocatore di usare abilità come il boost e oggetti speciali come mine, granate e banane, trasformando la gara in un incrocio unico tra un gioco di pura demolizione e un frenetico party game.</w:t>
+      </w:r>
+      <w:r>
+        <w:br w:type="page"/>
+      </w:r>
+    </w:p>
+    <w:p>
+      <w:pPr>
+        <w:pStyle w:val="Titolo2"/>
+      </w:pPr>
+      <w:bookmarkStart w:id="6" w:name="_Toc240284371"/>
+      <w:r>
+        <w:lastRenderedPageBreak/>
+        <w:t>Unity</w:t>
+      </w:r>
+      <w:bookmarkEnd w:id="6"/>
+    </w:p>
+    <w:p>
+      <w:pPr>
+        <w:rPr>
+          <w:lang w:val="it-IT"/>
+        </w:rPr>
+      </w:pPr>
       <w:r>
         <w:rPr>
           <w:b/>
           <w:bCs/>
         </w:rPr>
-        <w:t xml:space="preserve"> Derby</w:t>
-      </w:r>
-      <w:r>
-        <w:t xml:space="preserve">, ma il nostro progetto si distingue per due motivi principali. Innanzitutto, noi mettiamo in pista dei veri e propri autoscontri invece delle classiche automobili. In secondo luogo, uniamo il realismo fisico dei danni a meccaniche caotiche e divertenti: invece di limitarci ai semplici tamponamenti, permettiamo al giocatore di usare abilità come il </w:t>
-      </w:r>
-      <w:proofErr w:type="spellStart"/>
-      <w:r>
-        <w:t>boost</w:t>
-      </w:r>
-      <w:proofErr w:type="spellEnd"/>
-      <w:r>
-        <w:t xml:space="preserve"> e oggetti speciali come mine, granate e banane, trasformando la gara in un incrocio unico tra un gioco di pura demolizione e un frenetico party game.</w:t>
-      </w:r>
-      <w:r>
-        <w:br w:type="page"/>
-      </w:r>
-    </w:p>
-    <w:p>
-      <w:pPr>
-        <w:pStyle w:val="Titolo2"/>
-      </w:pPr>
-      <w:bookmarkStart w:id="6" w:name="_Toc240284371"/>
-      <w:proofErr w:type="spellStart"/>
-      <w:r>
-        <w:lastRenderedPageBreak/>
-        <w:t>Unity</w:t>
-      </w:r>
-      <w:bookmarkEnd w:id="6"/>
-      <w:proofErr w:type="spellEnd"/>
-    </w:p>
-    <w:p>
-      <w:pPr>
-        <w:rPr>
-          <w:lang w:val="it-IT"/>
-        </w:rPr>
-      </w:pPr>
-      <w:r>
+        <w:t>Cos'è Unity e le sue particolarità</w:t>
+      </w:r>
+    </w:p>
+    <w:p>
+      <w:r>
+        <w:t xml:space="preserve">Unity è un programma molto famoso che serve per creare videogiochi in 2D e in 3D. </w:t>
+      </w:r>
+      <w:r>
+        <w:t>C</w:t>
+      </w:r>
+      <w:r>
+        <w:t>i fornisce tutti gli strumenti necessari per costruire il gioco in un unico posto.</w:t>
+      </w:r>
+      <w:r>
+        <w:t xml:space="preserve"> Inoltre</w:t>
+      </w:r>
+      <w:r>
+        <w:t xml:space="preserve"> </w:t>
+      </w:r>
+      <w:r>
+        <w:t>c</w:t>
+      </w:r>
+      <w:r>
+        <w:t>i permette di gestire facilmente i modelli 3D, i suoni e i movimenti fisici senza usare altri programmi.</w:t>
+      </w:r>
+    </w:p>
+    <w:p/>
+    <w:p>
+      <w:r>
+        <w:t>La cosa più comoda di Unity è che funziona un po' come le costruzioni Lego. Invece di programmare un oggetto intero da zero, possiamo "attaccare" piccoli blocchi di istruzioni già pronti (chiamati componenti). Per esempio, possiamo attaccare al nostro autoscontro un blocco per la gravità e un altro per calcolare gli urti. Inoltre, Unity usa un linguaggio di programmazione chiamato C#, che è potente ma abbastanza facile da usare. Infine, ha una grande comunità su internet per chiedere aiuto e ci permette di far funzionare il gioco finito su tanti dispositivi diversi senza dover rifare tutto da capo.</w:t>
+      </w:r>
+    </w:p>
+    <w:p/>
+    <w:p>
+      <w:pPr>
         <w:rPr>
           <w:b/>
           <w:bCs/>
         </w:rPr>
-        <w:t xml:space="preserve">Cos'è </w:t>
-      </w:r>
-      <w:proofErr w:type="spellStart"/>
+      </w:pPr>
       <w:r>
         <w:rPr>
           <w:b/>
           <w:bCs/>
         </w:rPr>
-        <w:t>Unity</w:t>
-      </w:r>
-      <w:proofErr w:type="spellEnd"/>
-      <w:r>
-        <w:rPr>
-          <w:b/>
-          <w:bCs/>
-        </w:rPr>
-        <w:t xml:space="preserve"> e le sue particolarità</w:t>
-      </w:r>
-    </w:p>
-    <w:p>
-      <w:proofErr w:type="spellStart"/>
-      <w:r>
-        <w:t>Unity</w:t>
-      </w:r>
-      <w:proofErr w:type="spellEnd"/>
-      <w:r>
-        <w:t xml:space="preserve"> è un programma molto famoso che serve per creare videogiochi in 2D e in 3D. </w:t>
-      </w:r>
-      <w:r>
-        <w:t>C</w:t>
-      </w:r>
-      <w:r>
-        <w:t>i fornisce tutti gli strumenti necessari per costruire il gioco in un unico posto.</w:t>
-      </w:r>
-      <w:r>
-        <w:t xml:space="preserve"> Inoltre</w:t>
-      </w:r>
-      <w:r>
-        <w:t xml:space="preserve"> </w:t>
-      </w:r>
-      <w:r>
-        <w:t>c</w:t>
-      </w:r>
-      <w:r>
-        <w:t>i permette di gestire facilmente i modelli 3D, i suoni e i movimenti fisici senza usare altri programmi.</w:t>
+        <w:t>Perché abbiamo scelto Unity al posto di Unreal Engine</w:t>
+      </w:r>
+    </w:p>
+    <w:p>
+      <w:r>
+        <w:t>All'inizio abbiamo pensato di usare anche un altro programma molto conosciuto, Unreal Engine. Alla fine, però, abbiamo scelto Unity per alcuni motivi molto semplici. Il primo motivo è il linguaggio di programmazione: il C# di Unity per noi è molto più facile e veloce da scrivere rispetto al difficile C++ di Unreal Engine. Così possiamo concentrarci sul gioco senza impazzire con codici troppo complicati.</w:t>
       </w:r>
     </w:p>
     <w:p/>
     <w:p>
       <w:r>
-        <w:t xml:space="preserve">La cosa più comoda di </w:t>
-      </w:r>
-      <w:proofErr w:type="spellStart"/>
-      <w:r>
-        <w:t>Unity</w:t>
-      </w:r>
-      <w:proofErr w:type="spellEnd"/>
-      <w:r>
-        <w:t xml:space="preserve"> è che funziona un po' come le costruzioni Lego. Invece di programmare un oggetto intero da zero, possiamo "attaccare" piccoli blocchi di istruzioni già pronti (chiamati componenti). Per esempio, possiamo attaccare al nostro autoscontro un blocco per la gravità e un altro per calcolare gli urti. Inoltre, </w:t>
-      </w:r>
-      <w:proofErr w:type="spellStart"/>
-      <w:r>
-        <w:t>Unity</w:t>
-      </w:r>
-      <w:proofErr w:type="spellEnd"/>
-      <w:r>
-        <w:t xml:space="preserve"> usa un linguaggio di programmazione chiamato C#, che è potente ma abbastanza facile da usare. Infine, ha una grande comunità su internet per chiedere aiuto e ci permette di far funzionare il gioco finito su tanti dispositivi diversi senza dover rifare tutto da capo.</w:t>
+        <w:t>Il secondo motivo è il tipo di gioco che stiamo facendo. Unreal Engine è fantastico per creare mondi enormi e super realistici. Il nostro gioco, invece, è veloce, divertente e si svolge dentro arene chiuse. Per questo scopo Unity è perfetto perché è più leggero e ci fa avere ottime prestazioni, senza pesare troppo sul computer con funzioni che non ci servono.</w:t>
       </w:r>
     </w:p>
     <w:p/>
     <w:p>
-      <w:pPr>
-        <w:rPr>
-          <w:b/>
-          <w:bCs/>
-        </w:rPr>
-      </w:pPr>
-      <w:r>
-        <w:rPr>
-          <w:b/>
-          <w:bCs/>
-        </w:rPr>
-        <w:t xml:space="preserve">Perché abbiamo scelto </w:t>
-      </w:r>
-      <w:proofErr w:type="spellStart"/>
-      <w:r>
-        <w:rPr>
-          <w:b/>
-          <w:bCs/>
-        </w:rPr>
-        <w:t>Unity</w:t>
-      </w:r>
-      <w:proofErr w:type="spellEnd"/>
-      <w:r>
-        <w:rPr>
-          <w:b/>
-          <w:bCs/>
-        </w:rPr>
-        <w:t xml:space="preserve"> al posto di </w:t>
-      </w:r>
-      <w:proofErr w:type="spellStart"/>
-      <w:r>
-        <w:rPr>
-          <w:b/>
-          <w:bCs/>
-        </w:rPr>
-        <w:t>Unreal</w:t>
-      </w:r>
-      <w:proofErr w:type="spellEnd"/>
-      <w:r>
-        <w:rPr>
-          <w:b/>
-          <w:bCs/>
-        </w:rPr>
-        <w:t xml:space="preserve"> Engine</w:t>
-      </w:r>
-    </w:p>
-    <w:p>
-      <w:r>
-        <w:t xml:space="preserve">All'inizio abbiamo pensato di usare anche un altro programma molto conosciuto, </w:t>
-      </w:r>
-      <w:proofErr w:type="spellStart"/>
-      <w:r>
-        <w:t>Unreal</w:t>
-      </w:r>
-      <w:proofErr w:type="spellEnd"/>
-      <w:r>
-        <w:t xml:space="preserve"> Engine. Alla fine, però, abbiamo scelto </w:t>
-      </w:r>
-      <w:proofErr w:type="spellStart"/>
-      <w:r>
-        <w:t>Unity</w:t>
-      </w:r>
-      <w:proofErr w:type="spellEnd"/>
-      <w:r>
-        <w:t xml:space="preserve"> per alcuni motivi molto semplici. Il primo motivo è il linguaggio di programmazione: il C# di </w:t>
-      </w:r>
-      <w:proofErr w:type="spellStart"/>
-      <w:r>
-        <w:t>Unity</w:t>
-      </w:r>
-      <w:proofErr w:type="spellEnd"/>
-      <w:r>
-        <w:t xml:space="preserve"> per noi è molto più facile e veloce da scrivere rispetto al difficile C++ di </w:t>
-      </w:r>
-      <w:proofErr w:type="spellStart"/>
-      <w:r>
-        <w:t>Unreal</w:t>
-      </w:r>
-      <w:proofErr w:type="spellEnd"/>
-      <w:r>
-        <w:t xml:space="preserve"> Engine. Così possiamo concentrarci sul gioco senza impazzire con codici troppo complicati.</w:t>
-      </w:r>
-    </w:p>
-    <w:p/>
-    <w:p>
-      <w:r>
-        <w:t xml:space="preserve">Il secondo motivo è il tipo di gioco che stiamo facendo. </w:t>
-      </w:r>
-      <w:proofErr w:type="spellStart"/>
-      <w:r>
-        <w:t>Unreal</w:t>
-      </w:r>
-      <w:proofErr w:type="spellEnd"/>
-      <w:r>
-        <w:t xml:space="preserve"> Engine è fantastico per creare mondi enormi e super realistici. Il nostro gioco, invece, è veloce, divertente e si svolge dentro arene chiuse. Per questo scopo </w:t>
-      </w:r>
-      <w:proofErr w:type="spellStart"/>
-      <w:r>
-        <w:t>Unity</w:t>
-      </w:r>
-      <w:proofErr w:type="spellEnd"/>
-      <w:r>
-        <w:t xml:space="preserve"> è perfetto perché è più leggero e ci fa avere ottime prestazioni, senza pesare troppo sul computer con funzioni che non ci servono.</w:t>
-      </w:r>
-    </w:p>
-    <w:p/>
-    <w:p>
-      <w:r>
-        <w:t xml:space="preserve">Infine, </w:t>
-      </w:r>
-      <w:proofErr w:type="spellStart"/>
-      <w:r>
-        <w:t>Unity</w:t>
-      </w:r>
-      <w:proofErr w:type="spellEnd"/>
-      <w:r>
-        <w:t xml:space="preserve"> è ottimo per gestire la fisica. Calcolare i danni, le derapate e gli scontri tra le auto è molto facile. Visto che siamo </w:t>
+      <w:r>
+        <w:t xml:space="preserve">Infine, Unity è ottimo per gestire la fisica. Calcolare i danni, le derapate e gli scontri tra le auto è molto facile. Visto che siamo </w:t>
       </w:r>
       <w:r>
         <w:t>in due</w:t>
       </w:r>
       <w:r>
-        <w:t xml:space="preserve">, abbiamo bisogno di fare tante prove veloci. Con </w:t>
-      </w:r>
-      <w:proofErr w:type="spellStart"/>
-      <w:r>
-        <w:t>Unity</w:t>
-      </w:r>
-      <w:proofErr w:type="spellEnd"/>
-      <w:r>
-        <w:t xml:space="preserve"> possiamo mettere subito le auto nell'arena, testare i nemici e correggere gli errori al volo, risparmiando un sacco di tempo.</w:t>
+        <w:t>, abbiamo bisogno di fare tante prove veloci. Con Unity possiamo mettere subito le auto nell'arena, testare i nemici e correggere gli errori al volo, risparmiando un sacco di tempo.</w:t>
       </w:r>
     </w:p>
     <w:p/>
@@ -4069,15 +3893,7 @@
         </w:numPr>
       </w:pPr>
       <w:r>
-        <w:t xml:space="preserve">Come giocatore voglio poter raccogliere i </w:t>
-      </w:r>
-      <w:proofErr w:type="spellStart"/>
-      <w:r>
-        <w:t>perk</w:t>
-      </w:r>
-      <w:proofErr w:type="spellEnd"/>
-      <w:r>
-        <w:t xml:space="preserve"> per poterli usare in partita.</w:t>
+        <w:t>Come giocatore voglio poter raccogliere i perk per poterli usare in partita.</w:t>
       </w:r>
     </w:p>
     <w:p>
@@ -4105,21 +3921,13 @@
         </w:numPr>
       </w:pPr>
       <w:r>
-        <w:t xml:space="preserve">Posso vedere i </w:t>
-      </w:r>
-      <w:proofErr w:type="spellStart"/>
-      <w:r>
-        <w:t>pe</w:t>
+        <w:t>Posso vedere i pe</w:t>
       </w:r>
       <w:r>
         <w:t>r</w:t>
       </w:r>
       <w:r>
-        <w:t>k</w:t>
-      </w:r>
-      <w:proofErr w:type="spellEnd"/>
-      <w:r>
-        <w:t>.</w:t>
+        <w:t>k.</w:t>
       </w:r>
     </w:p>
     <w:p>
@@ -4131,15 +3939,7 @@
         </w:numPr>
       </w:pPr>
       <w:r>
-        <w:t xml:space="preserve">Posso raccogliere i </w:t>
-      </w:r>
-      <w:proofErr w:type="spellStart"/>
-      <w:r>
-        <w:t>perk</w:t>
-      </w:r>
-      <w:proofErr w:type="spellEnd"/>
-      <w:r>
-        <w:t>.</w:t>
+        <w:t>Posso raccogliere i perk.</w:t>
       </w:r>
     </w:p>
     <w:p>
@@ -4151,15 +3951,7 @@
         </w:numPr>
       </w:pPr>
       <w:r>
-        <w:t xml:space="preserve">Posso usare i </w:t>
-      </w:r>
-      <w:proofErr w:type="spellStart"/>
-      <w:r>
-        <w:t>perk</w:t>
-      </w:r>
-      <w:proofErr w:type="spellEnd"/>
-      <w:r>
-        <w:t>.</w:t>
+        <w:t>Posso usare i perk.</w:t>
       </w:r>
     </w:p>
     <w:p>
@@ -4360,15 +4152,7 @@
         </w:numPr>
       </w:pPr>
       <w:r>
-        <w:t xml:space="preserve">Tramite i </w:t>
-      </w:r>
-      <w:proofErr w:type="spellStart"/>
-      <w:r>
-        <w:t>perk</w:t>
-      </w:r>
-      <w:proofErr w:type="spellEnd"/>
-      <w:r>
-        <w:t xml:space="preserve"> posso </w:t>
+        <w:t xml:space="preserve">Tramite i perk posso </w:t>
       </w:r>
       <w:r>
         <w:t>infliggere</w:t>
@@ -4411,15 +4195,7 @@
         </w:numPr>
       </w:pPr>
       <w:r>
-        <w:t xml:space="preserve">Come giocatore voglio poter </w:t>
-      </w:r>
-      <w:proofErr w:type="spellStart"/>
-      <w:r>
-        <w:t>driftare</w:t>
-      </w:r>
-      <w:proofErr w:type="spellEnd"/>
-      <w:r>
-        <w:t xml:space="preserve"> per eseguire manovre evasive.</w:t>
+        <w:t>Come giocatore voglio poter driftare per eseguire manovre evasive.</w:t>
       </w:r>
     </w:p>
     <w:p>
@@ -4447,13 +4223,8 @@
         </w:numPr>
       </w:pPr>
       <w:r>
-        <w:t xml:space="preserve">Tramite l’apposito comando (SHIFT) posso </w:t>
-      </w:r>
-      <w:proofErr w:type="spellStart"/>
-      <w:r>
-        <w:t>driftare</w:t>
-      </w:r>
-      <w:proofErr w:type="spellEnd"/>
+        <w:t>Tramite l’apposito comando (SHIFT) posso driftare</w:t>
+      </w:r>
     </w:p>
     <w:p>
       <w:pPr>
@@ -6247,13 +6018,8 @@
             <w:gridSpan w:val="5"/>
           </w:tcPr>
           <w:p>
-            <w:proofErr w:type="spellStart"/>
-            <w:r>
-              <w:t>Spawn</w:t>
-            </w:r>
-            <w:proofErr w:type="spellEnd"/>
-            <w:r>
-              <w:t xml:space="preserve"> dei veicoli avversari all'interno della mappa, capaci di muoversi e interagire con il giocatore.</w:t>
+            <w:r>
+              <w:t>Spawn dei veicoli avversari all'interno della mappa, capaci di muoversi e interagire con il giocatore.</w:t>
             </w:r>
           </w:p>
         </w:tc>
@@ -6969,13 +6735,8 @@
           </w:tcPr>
           <w:p>
             <w:r>
-              <w:t xml:space="preserve">Generazione e raccolta </w:t>
-            </w:r>
-            <w:proofErr w:type="spellStart"/>
-            <w:r>
-              <w:t>perk</w:t>
-            </w:r>
-            <w:proofErr w:type="spellEnd"/>
+              <w:t>Generazione e raccolta perk</w:t>
+            </w:r>
           </w:p>
         </w:tc>
       </w:tr>
@@ -7008,15 +6769,7 @@
           </w:tcPr>
           <w:p>
             <w:r>
-              <w:t>Comparsa visibile di power-up/</w:t>
-            </w:r>
-            <w:proofErr w:type="spellStart"/>
-            <w:r>
-              <w:t>perk</w:t>
-            </w:r>
-            <w:proofErr w:type="spellEnd"/>
-            <w:r>
-              <w:t xml:space="preserve"> sul tracciato e rilevamento del passaggio del veicolo per la loro raccolta nell'inventario temporaneo.</w:t>
+              <w:t>Comparsa visibile di power-up/perk sul tracciato e rilevamento del passaggio del veicolo per la loro raccolta nell'inventario temporaneo.</w:t>
             </w:r>
           </w:p>
         </w:tc>
@@ -7268,13 +7021,8 @@
           </w:tcPr>
           <w:p>
             <w:r>
-              <w:t xml:space="preserve">Utilizzo ed effetti dei </w:t>
-            </w:r>
-            <w:proofErr w:type="spellStart"/>
-            <w:r>
-              <w:t>perk</w:t>
-            </w:r>
-            <w:proofErr w:type="spellEnd"/>
+              <w:t>Utilizzo ed effetti dei perk</w:t>
+            </w:r>
           </w:p>
         </w:tc>
       </w:tr>
@@ -7307,15 +7055,7 @@
           </w:tcPr>
           <w:p>
             <w:r>
-              <w:t xml:space="preserve">Attivazione del </w:t>
-            </w:r>
-            <w:proofErr w:type="spellStart"/>
-            <w:r>
-              <w:t>perk</w:t>
-            </w:r>
-            <w:proofErr w:type="spellEnd"/>
-            <w:r>
-              <w:t xml:space="preserve"> raccolto per generare vantaggi specifici o infliggere danni aggiuntivi ai veicoli avversari.</w:t>
+              <w:t>Attivazione del perk raccolto per generare vantaggi specifici o infliggere danni aggiuntivi ai veicoli avversari.</w:t>
             </w:r>
           </w:p>
         </w:tc>
@@ -7368,15 +7108,7 @@
           </w:tcPr>
           <w:p>
             <w:r>
-              <w:t xml:space="preserve">Richiede la raccolta del </w:t>
-            </w:r>
-            <w:proofErr w:type="spellStart"/>
-            <w:r>
-              <w:t>perk</w:t>
-            </w:r>
-            <w:proofErr w:type="spellEnd"/>
-            <w:r>
-              <w:t xml:space="preserve"> (Req-10)</w:t>
+              <w:t>Richiede la raccolta del perk (Req-10)</w:t>
             </w:r>
             <w:r>
               <w:t>.</w:t>
@@ -8437,15 +8169,7 @@
           </w:tcPr>
           <w:p>
             <w:r>
-              <w:t xml:space="preserve">I menu di navigazione, i comandi a schermo e gli indicatori grafici (vita, ricarica turbo, stato </w:t>
-            </w:r>
-            <w:proofErr w:type="spellStart"/>
-            <w:r>
-              <w:t>perk</w:t>
-            </w:r>
-            <w:proofErr w:type="spellEnd"/>
-            <w:r>
-              <w:t>) devono risultare leggibili e intuitivi durante le fasi concitate della partita.</w:t>
+              <w:t>I menu di navigazione, i comandi a schermo e gli indicatori grafici (vita, ricarica turbo, stato perk) devono risultare leggibili e intuitivi durante le fasi concitate della partita.</w:t>
             </w:r>
           </w:p>
         </w:tc>
@@ -9938,6 +9662,12 @@
           <w:lang w:val="it-IT"/>
         </w:rPr>
       </w:pPr>
+      <w:r>
+        <w:rPr>
+          <w:lang w:val="it-IT"/>
+        </w:rPr>
+        <w:br w:type="page"/>
+      </w:r>
     </w:p>
     <w:p>
       <w:pPr>
@@ -9952,22 +9682,98 @@
         <w:rPr>
           <w:lang w:val="it-CH"/>
         </w:rPr>
+        <w:lastRenderedPageBreak/>
         <w:t>Use case</w:t>
       </w:r>
       <w:bookmarkEnd w:id="11"/>
     </w:p>
     <w:p>
       <w:r>
-        <w:t xml:space="preserve">I casi d’uso rappresentano l’interazione tra i vari </w:t>
-      </w:r>
-      <w:r>
-        <w:t>attori e le funzionalità</w:t>
-      </w:r>
-      <w:r>
-        <w:t xml:space="preserve"> del prodotto</w:t>
-      </w:r>
-      <w:r>
-        <w:t>.</w:t>
+        <w:rPr>
+          <w:noProof/>
+        </w:rPr>
+        <w:drawing>
+          <wp:inline distT="0" distB="0" distL="0" distR="0" wp14:anchorId="5B7F8B9F" wp14:editId="78257CD4">
+            <wp:extent cx="6115050" cy="4076700"/>
+            <wp:effectExtent l="0" t="0" r="0" b="0"/>
+            <wp:docPr id="6" name="Immagine 6"/>
+            <wp:cNvGraphicFramePr>
+              <a:graphicFrameLocks xmlns:a="http://schemas.openxmlformats.org/drawingml/2006/main" noChangeAspect="1"/>
+            </wp:cNvGraphicFramePr>
+            <a:graphic xmlns:a="http://schemas.openxmlformats.org/drawingml/2006/main">
+              <a:graphicData uri="http://schemas.openxmlformats.org/drawingml/2006/picture">
+                <pic:pic xmlns:pic="http://schemas.openxmlformats.org/drawingml/2006/picture">
+                  <pic:nvPicPr>
+                    <pic:cNvPr id="0" name="Picture 2"/>
+                    <pic:cNvPicPr>
+                      <a:picLocks noChangeAspect="1" noChangeArrowheads="1"/>
+                    </pic:cNvPicPr>
+                  </pic:nvPicPr>
+                  <pic:blipFill>
+                    <a:blip r:embed="rId8" cstate="print">
+                      <a:extLst>
+                        <a:ext uri="{28A0092B-C50C-407E-A947-70E740481C1C}">
+                          <a14:useLocalDpi xmlns:a14="http://schemas.microsoft.com/office/drawing/2010/main" val="0"/>
+                        </a:ext>
+                      </a:extLst>
+                    </a:blip>
+                    <a:srcRect/>
+                    <a:stretch>
+                      <a:fillRect/>
+                    </a:stretch>
+                  </pic:blipFill>
+                  <pic:spPr bwMode="auto">
+                    <a:xfrm>
+                      <a:off x="0" y="0"/>
+                      <a:ext cx="6115050" cy="4076700"/>
+                    </a:xfrm>
+                    <a:prstGeom prst="rect">
+                      <a:avLst/>
+                    </a:prstGeom>
+                    <a:noFill/>
+                    <a:ln>
+                      <a:noFill/>
+                    </a:ln>
+                  </pic:spPr>
+                </pic:pic>
+              </a:graphicData>
+            </a:graphic>
+          </wp:inline>
+        </w:drawing>
+      </w:r>
+    </w:p>
+    <w:p>
+      <w:r>
+        <w:t>Questo</w:t>
+      </w:r>
+      <w:r>
+        <w:t xml:space="preserve"> Use Case </w:t>
+      </w:r>
+      <w:r>
+        <w:t>descrive come funziona Brutal Bumper Cars. Spiega in modo chiaro cosa fa il Giocatore (Player) e cosa fa il computer (Sistema) in automatico.</w:t>
+      </w:r>
+    </w:p>
+    <w:p/>
+    <w:p>
+      <w:r>
+        <w:t>Il Giocatore può personalizzare il suo veicolo, guardare le statistiche, cambiare le impostazioni o uscire dal gioco. Quando avvia la partita, il Giocatore si occupa solo di guidare la sua auto e usare i potenziamenti (power-up).</w:t>
+      </w:r>
+    </w:p>
+    <w:p/>
+    <w:p>
+      <w:r>
+        <w:t>Il Sistema prepara tutto il resto: crea la mappa e fa comparire i veicoli e i potenziamenti. Durante la gara, il Sistema guida le auto nemiche (bot) e controlla chi viene eliminato. Alla fine, decide chi ha vinto, mostra il risultato sullo schermo e salva i punteggi.</w:t>
+      </w:r>
+    </w:p>
+    <w:p/>
+    <w:p>
+      <w:r>
+        <w:t>L'applicazione divide così le azioni umane da quelle automatiche del computer, facendo funzionare il gioco in modo semplice e ordinato.</w:t>
+      </w:r>
+    </w:p>
+    <w:p>
+      <w:r>
+        <w:br w:type="page"/>
       </w:r>
     </w:p>
     <w:p>
@@ -9982,6 +9788,7 @@
         <w:rPr>
           <w:lang w:val="it-CH"/>
         </w:rPr>
+        <w:lastRenderedPageBreak/>
         <w:t>Pianificazione</w:t>
       </w:r>
       <w:bookmarkEnd w:id="12"/>
@@ -9997,15 +9804,7 @@
     <w:p/>
     <w:p>
       <w:r>
-        <w:t xml:space="preserve">La pianificazione può essere rappresentata mediante un diagramma di </w:t>
-      </w:r>
-      <w:proofErr w:type="spellStart"/>
-      <w:r>
-        <w:t>Gantt</w:t>
-      </w:r>
-      <w:proofErr w:type="spellEnd"/>
-      <w:r>
-        <w:t>:</w:t>
+        <w:t>La pianificazione può essere rappresentata mediante un diagramma di Gantt:</w:t>
       </w:r>
     </w:p>
     <w:p/>
@@ -10017,7 +9816,6 @@
         <w:rPr>
           <w:noProof/>
         </w:rPr>
-        <w:lastRenderedPageBreak/>
         <w:drawing>
           <wp:inline distT="0" distB="0" distL="0" distR="0" wp14:anchorId="280632B8" wp14:editId="61600608">
             <wp:extent cx="5972175" cy="2876550"/>
@@ -10036,7 +9834,7 @@
                     </pic:cNvPicPr>
                   </pic:nvPicPr>
                   <pic:blipFill>
-                    <a:blip r:embed="rId8" cstate="print">
+                    <a:blip r:embed="rId9" cstate="print">
                       <a:extLst>
                         <a:ext uri="{28A0092B-C50C-407E-A947-70E740481C1C}">
                           <a14:useLocalDpi xmlns:a14="http://schemas.microsoft.com/office/drawing/2010/main" val="0"/>
@@ -10107,14 +9905,9 @@
         <w:t xml:space="preserve"> </w:t>
       </w:r>
       <w:r>
-        <w:t xml:space="preserve">Esempio di diagramma di </w:t>
-      </w:r>
-      <w:proofErr w:type="spellStart"/>
-      <w:r>
-        <w:t>Gantt</w:t>
+        <w:t>Esempio di diagramma di Gantt</w:t>
       </w:r>
       <w:bookmarkEnd w:id="13"/>
-      <w:proofErr w:type="spellEnd"/>
     </w:p>
     <w:p>
       <w:r>
@@ -10130,15 +9923,7 @@
         <w:t>.</w:t>
       </w:r>
       <w:r>
-        <w:t xml:space="preserve"> </w:t>
-      </w:r>
-      <w:proofErr w:type="spellStart"/>
-      <w:r>
-        <w:t>scrum</w:t>
-      </w:r>
-      <w:proofErr w:type="spellEnd"/>
-      <w:r>
-        <w:t>), dovranno apparire in questo capitolo.</w:t>
+        <w:t xml:space="preserve"> scrum), dovranno apparire in questo capitolo.</w:t>
       </w:r>
     </w:p>
     <w:p/>
@@ -10146,10 +9931,10 @@
     <w:p>
       <w:pPr>
         <w:sectPr>
-          <w:headerReference w:type="default" r:id="rId9"/>
-          <w:footerReference w:type="default" r:id="rId10"/>
-          <w:headerReference w:type="first" r:id="rId11"/>
-          <w:footerReference w:type="first" r:id="rId12"/>
+          <w:headerReference w:type="default" r:id="rId10"/>
+          <w:footerReference w:type="default" r:id="rId11"/>
+          <w:headerReference w:type="first" r:id="rId12"/>
+          <w:footerReference w:type="first" r:id="rId13"/>
           <w:pgSz w:w="11906" w:h="16838"/>
           <w:pgMar w:top="1985" w:right="1134" w:bottom="1418" w:left="1134" w:header="567" w:footer="567" w:gutter="0"/>
           <w:pgNumType w:start="1"/>
@@ -10191,7 +9976,7 @@
                     </pic:cNvPicPr>
                   </pic:nvPicPr>
                   <pic:blipFill>
-                    <a:blip r:embed="rId8" cstate="print">
+                    <a:blip r:embed="rId9" cstate="print">
                       <a:extLst>
                         <a:ext uri="{28A0092B-C50C-407E-A947-70E740481C1C}">
                           <a14:useLocalDpi xmlns:a14="http://schemas.microsoft.com/office/drawing/2010/main" val="0"/>
@@ -10262,22 +10047,17 @@
         <w:t xml:space="preserve"> </w:t>
       </w:r>
       <w:r>
-        <w:t xml:space="preserve">Esempio di diagramma di </w:t>
-      </w:r>
-      <w:proofErr w:type="spellStart"/>
-      <w:r>
-        <w:t>Gantt</w:t>
+        <w:t>Esempio di diagramma di Gantt</w:t>
       </w:r>
       <w:bookmarkEnd w:id="14"/>
-      <w:proofErr w:type="spellEnd"/>
     </w:p>
     <w:p/>
     <w:p>
       <w:pPr>
         <w:sectPr>
-          <w:footerReference w:type="default" r:id="rId13"/>
-          <w:headerReference w:type="first" r:id="rId14"/>
-          <w:footerReference w:type="first" r:id="rId15"/>
+          <w:footerReference w:type="default" r:id="rId14"/>
+          <w:headerReference w:type="first" r:id="rId15"/>
+          <w:footerReference w:type="first" r:id="rId16"/>
           <w:pgSz w:w="16838" w:h="11906" w:orient="landscape"/>
           <w:pgMar w:top="720" w:right="720" w:bottom="720" w:left="720" w:header="567" w:footer="567" w:gutter="0"/>
           <w:cols w:space="720"/>
@@ -10323,30 +10103,21 @@
       <w:r>
         <w:t xml:space="preserve"> PC scolastici con </w:t>
       </w:r>
-      <w:proofErr w:type="spellStart"/>
       <w:r>
         <w:t>Unity</w:t>
       </w:r>
-      <w:proofErr w:type="spellEnd"/>
       <w:r>
         <w:t>. Il debugging è effettuato direttamente sul</w:t>
       </w:r>
       <w:r>
-        <w:t xml:space="preserve"> game </w:t>
-      </w:r>
-      <w:proofErr w:type="spellStart"/>
-      <w:r>
-        <w:t>engine</w:t>
-      </w:r>
-      <w:proofErr w:type="spellEnd"/>
+        <w:t xml:space="preserve"> game engine</w:t>
+      </w:r>
       <w:r>
         <w:t xml:space="preserve"> </w:t>
       </w:r>
-      <w:proofErr w:type="spellStart"/>
       <w:r>
         <w:t>Unity</w:t>
       </w:r>
-      <w:proofErr w:type="spellEnd"/>
       <w:r>
         <w:t>, oltretutto sono stati anche eseguiti dei test su dei computer personali con delle prestazioni minori rispetto a quelli scolastici.</w:t>
       </w:r>
@@ -10417,13 +10188,8 @@
             <w:tcW w:w="2440" w:type="dxa"/>
           </w:tcPr>
           <w:p>
-            <w:proofErr w:type="spellStart"/>
-            <w:r>
-              <w:t>Unity</w:t>
-            </w:r>
-            <w:proofErr w:type="spellEnd"/>
-            <w:r>
-              <w:t xml:space="preserve">: </w:t>
+            <w:r>
+              <w:t xml:space="preserve">Unity: </w:t>
             </w:r>
           </w:p>
         </w:tc>
@@ -10544,13 +10310,8 @@
     <w:p>
       <w:bookmarkStart w:id="20" w:name="_Toc429059808"/>
       <w:r>
-        <w:t xml:space="preserve">PC Windows 11 </w:t>
-      </w:r>
-      <w:proofErr w:type="spellStart"/>
-      <w:r>
-        <w:t>Education</w:t>
-      </w:r>
-      <w:proofErr w:type="spellEnd"/>
+        <w:t>PC Windows 11 Education</w:t>
+      </w:r>
     </w:p>
     <w:p>
       <w:r>
@@ -10564,15 +10325,7 @@
     </w:p>
     <w:p>
       <w:r>
-        <w:t xml:space="preserve">NVIDIA </w:t>
-      </w:r>
-      <w:proofErr w:type="spellStart"/>
-      <w:r>
-        <w:t>GeForce</w:t>
-      </w:r>
-      <w:proofErr w:type="spellEnd"/>
-      <w:r>
-        <w:t xml:space="preserve"> RTX 2060</w:t>
+        <w:t>NVIDIA GeForce RTX 2060</w:t>
       </w:r>
     </w:p>
     <w:p>
@@ -10631,7 +10384,7 @@
                     </pic:cNvPicPr>
                   </pic:nvPicPr>
                   <pic:blipFill rotWithShape="1">
-                    <a:blip r:embed="rId16" cstate="print">
+                    <a:blip r:embed="rId17" cstate="print">
                       <a:extLst>
                         <a:ext uri="{28A0092B-C50C-407E-A947-70E740481C1C}">
                           <a14:useLocalDpi xmlns:a14="http://schemas.microsoft.com/office/drawing/2010/main" val="0"/>
@@ -10696,21 +10449,7 @@
         <w:rPr>
           <w:lang w:eastAsia="it-CH"/>
         </w:rPr>
-        <w:t xml:space="preserve">Questo schema Entità-Relazione descrive la struttura del database per un videogioco. Al centro troviamo l'entità "User", che rappresenta l'account del giocatore ed è identificata da una </w:t>
-      </w:r>
-      <w:proofErr w:type="spellStart"/>
-      <w:r>
-        <w:rPr>
-          <w:lang w:eastAsia="it-CH"/>
-        </w:rPr>
-        <w:t>Primary</w:t>
-      </w:r>
-      <w:proofErr w:type="spellEnd"/>
-      <w:r>
-        <w:rPr>
-          <w:lang w:eastAsia="it-CH"/>
-        </w:rPr>
-        <w:t xml:space="preserve"> Key (</w:t>
+        <w:t>Questo schema Entità-Relazione descrive la struttura del database per un videogioco. Al centro troviamo l'entità "User", che rappresenta l'account del giocatore ed è identificata da una Primary Key (</w:t>
       </w:r>
       <w:r>
         <w:rPr>
@@ -10746,7 +10485,6 @@
         </w:rPr>
         <w:t xml:space="preserve">Per trasformare le relazioni "Possiede" e "Gestisce" in vere e proprie tabelle, utilizziamo le Chiavi Esterne (Foreign Key o FK). Le tabelle "Statistiche" e "impostazioni" conterranno una colonna specifica (ad esempio </w:t>
       </w:r>
-      <w:proofErr w:type="spellStart"/>
       <w:r>
         <w:rPr>
           <w:sz w:val="23"/>
@@ -10755,26 +10493,11 @@
         </w:rPr>
         <w:t>Id_User</w:t>
       </w:r>
-      <w:proofErr w:type="spellEnd"/>
       <w:r>
         <w:rPr>
           <w:lang w:eastAsia="it-CH"/>
         </w:rPr>
-        <w:t xml:space="preserve">) che funziona da FK e punta direttamente alla </w:t>
-      </w:r>
-      <w:proofErr w:type="spellStart"/>
-      <w:r>
-        <w:rPr>
-          <w:lang w:eastAsia="it-CH"/>
-        </w:rPr>
-        <w:t>Primary</w:t>
-      </w:r>
-      <w:proofErr w:type="spellEnd"/>
-      <w:r>
-        <w:rPr>
-          <w:lang w:eastAsia="it-CH"/>
-        </w:rPr>
-        <w:t xml:space="preserve"> Key della tabella "User". Poiché a ogni giocatore corrisponde un solo set di statistiche e un solo profilo di opzioni (relazione 1 a 1), su queste FK viene applicato un vincolo </w:t>
+        <w:t xml:space="preserve">) che funziona da FK e punta direttamente alla Primary Key della tabella "User". Poiché a ogni giocatore corrisponde un solo set di statistiche e un solo profilo di opzioni (relazione 1 a 1), su queste FK viene applicato un vincolo </w:t>
       </w:r>
       <w:r>
         <w:rPr>
@@ -10838,15 +10561,234 @@
     </w:p>
     <w:p>
       <w:r>
-        <w:t xml:space="preserve">Descrizione delle interfacce interne ed esterne del sistema e dell’interfaccia utente. La progettazione delle interfacce è basata sulle informazioni ricavate durante la fase di analisi e realizzata tramite </w:t>
-      </w:r>
-      <w:proofErr w:type="spellStart"/>
-      <w:r>
-        <w:t>mockups</w:t>
-      </w:r>
-      <w:proofErr w:type="spellEnd"/>
+        <w:t>Abbiamo deciso di mantenere uno stile a tema arancione per il gioco</w:t>
+      </w:r>
       <w:r>
         <w:t>.</w:t>
+      </w:r>
+    </w:p>
+    <w:p>
+      <w:r>
+        <w:t>Le griglie sono la nostra focalizzazione, portando una UI pulita a tutte le interfacce presenti.</w:t>
+      </w:r>
+    </w:p>
+    <w:p>
+      <w:r>
+        <w:t>Cerchiamo di mantenere facile l’utilizzo delle interfacce per l’utente.</w:t>
+      </w:r>
+    </w:p>
+    <w:p>
+      <w:r>
+        <w:t>Le seguenti immagini sono generati per bozza tramite Gemini, non sono vincolanti nel risultato che sarà presente a fine sviluppo.</w:t>
+      </w:r>
+    </w:p>
+    <w:p>
+      <w:pPr>
+        <w:pStyle w:val="Titolo3"/>
+      </w:pPr>
+      <w:r>
+        <w:t>Statistiche</w:t>
+      </w:r>
+    </w:p>
+    <w:p>
+      <w:r>
+        <w:rPr>
+          <w:noProof/>
+        </w:rPr>
+        <w:drawing>
+          <wp:inline distT="0" distB="0" distL="0" distR="0" wp14:anchorId="2BA77E0D" wp14:editId="5F83BED4">
+            <wp:extent cx="6115050" cy="3276600"/>
+            <wp:effectExtent l="0" t="0" r="0" b="0"/>
+            <wp:docPr id="11" name="Immagine 11"/>
+            <wp:cNvGraphicFramePr>
+              <a:graphicFrameLocks xmlns:a="http://schemas.openxmlformats.org/drawingml/2006/main" noChangeAspect="1"/>
+            </wp:cNvGraphicFramePr>
+            <a:graphic xmlns:a="http://schemas.openxmlformats.org/drawingml/2006/main">
+              <a:graphicData uri="http://schemas.openxmlformats.org/drawingml/2006/picture">
+                <pic:pic xmlns:pic="http://schemas.openxmlformats.org/drawingml/2006/picture">
+                  <pic:nvPicPr>
+                    <pic:cNvPr id="0" name="Picture 3"/>
+                    <pic:cNvPicPr>
+                      <a:picLocks noChangeAspect="1" noChangeArrowheads="1"/>
+                    </pic:cNvPicPr>
+                  </pic:nvPicPr>
+                  <pic:blipFill>
+                    <a:blip r:embed="rId18" cstate="print">
+                      <a:extLst>
+                        <a:ext uri="{28A0092B-C50C-407E-A947-70E740481C1C}">
+                          <a14:useLocalDpi xmlns:a14="http://schemas.microsoft.com/office/drawing/2010/main" val="0"/>
+                        </a:ext>
+                      </a:extLst>
+                    </a:blip>
+                    <a:srcRect/>
+                    <a:stretch>
+                      <a:fillRect/>
+                    </a:stretch>
+                  </pic:blipFill>
+                  <pic:spPr bwMode="auto">
+                    <a:xfrm>
+                      <a:off x="0" y="0"/>
+                      <a:ext cx="6115050" cy="3276600"/>
+                    </a:xfrm>
+                    <a:prstGeom prst="rect">
+                      <a:avLst/>
+                    </a:prstGeom>
+                    <a:noFill/>
+                    <a:ln>
+                      <a:noFill/>
+                    </a:ln>
+                  </pic:spPr>
+                </pic:pic>
+              </a:graphicData>
+            </a:graphic>
+          </wp:inline>
+        </w:drawing>
+      </w:r>
+    </w:p>
+    <w:p/>
+    <w:p>
+      <w:pPr>
+        <w:pStyle w:val="Titolo3"/>
+      </w:pPr>
+      <w:r>
+        <w:lastRenderedPageBreak/>
+        <w:t>Impostazioni</w:t>
+      </w:r>
+    </w:p>
+    <w:p>
+      <w:pPr>
+        <w:rPr>
+          <w:lang w:val="it-IT"/>
+        </w:rPr>
+      </w:pPr>
+      <w:r>
+        <w:rPr>
+          <w:noProof/>
+          <w:lang w:val="it-IT"/>
+        </w:rPr>
+        <w:drawing>
+          <wp:inline distT="0" distB="0" distL="0" distR="0" wp14:anchorId="540FFFAF" wp14:editId="174224A0">
+            <wp:extent cx="6105525" cy="3238500"/>
+            <wp:effectExtent l="0" t="0" r="9525" b="0"/>
+            <wp:docPr id="14" name="Immagine 14"/>
+            <wp:cNvGraphicFramePr>
+              <a:graphicFrameLocks xmlns:a="http://schemas.openxmlformats.org/drawingml/2006/main" noChangeAspect="1"/>
+            </wp:cNvGraphicFramePr>
+            <a:graphic xmlns:a="http://schemas.openxmlformats.org/drawingml/2006/main">
+              <a:graphicData uri="http://schemas.openxmlformats.org/drawingml/2006/picture">
+                <pic:pic xmlns:pic="http://schemas.openxmlformats.org/drawingml/2006/picture">
+                  <pic:nvPicPr>
+                    <pic:cNvPr id="0" name="Picture 4"/>
+                    <pic:cNvPicPr>
+                      <a:picLocks noChangeAspect="1" noChangeArrowheads="1"/>
+                    </pic:cNvPicPr>
+                  </pic:nvPicPr>
+                  <pic:blipFill>
+                    <a:blip r:embed="rId19" cstate="print">
+                      <a:extLst>
+                        <a:ext uri="{28A0092B-C50C-407E-A947-70E740481C1C}">
+                          <a14:useLocalDpi xmlns:a14="http://schemas.microsoft.com/office/drawing/2010/main" val="0"/>
+                        </a:ext>
+                      </a:extLst>
+                    </a:blip>
+                    <a:srcRect/>
+                    <a:stretch>
+                      <a:fillRect/>
+                    </a:stretch>
+                  </pic:blipFill>
+                  <pic:spPr bwMode="auto">
+                    <a:xfrm>
+                      <a:off x="0" y="0"/>
+                      <a:ext cx="6105525" cy="3238500"/>
+                    </a:xfrm>
+                    <a:prstGeom prst="rect">
+                      <a:avLst/>
+                    </a:prstGeom>
+                    <a:noFill/>
+                    <a:ln>
+                      <a:noFill/>
+                    </a:ln>
+                  </pic:spPr>
+                </pic:pic>
+              </a:graphicData>
+            </a:graphic>
+          </wp:inline>
+        </w:drawing>
+      </w:r>
+    </w:p>
+    <w:p/>
+    <w:p>
+      <w:pPr>
+        <w:pStyle w:val="Titolo3"/>
+      </w:pPr>
+      <w:r>
+        <w:t>Homepage</w:t>
+      </w:r>
+    </w:p>
+    <w:p>
+      <w:pPr>
+        <w:rPr>
+          <w:lang w:val="it-IT"/>
+        </w:rPr>
+      </w:pPr>
+      <w:r>
+        <w:rPr>
+          <w:noProof/>
+          <w:lang w:val="it-IT"/>
+        </w:rPr>
+        <w:drawing>
+          <wp:inline distT="0" distB="0" distL="0" distR="0" wp14:anchorId="6CFDA699" wp14:editId="5211FDCB">
+            <wp:extent cx="6105525" cy="3257550"/>
+            <wp:effectExtent l="0" t="0" r="9525" b="0"/>
+            <wp:docPr id="16" name="Immagine 16"/>
+            <wp:cNvGraphicFramePr>
+              <a:graphicFrameLocks xmlns:a="http://schemas.openxmlformats.org/drawingml/2006/main" noChangeAspect="1"/>
+            </wp:cNvGraphicFramePr>
+            <a:graphic xmlns:a="http://schemas.openxmlformats.org/drawingml/2006/main">
+              <a:graphicData uri="http://schemas.openxmlformats.org/drawingml/2006/picture">
+                <pic:pic xmlns:pic="http://schemas.openxmlformats.org/drawingml/2006/picture">
+                  <pic:nvPicPr>
+                    <pic:cNvPr id="0" name="Picture 5"/>
+                    <pic:cNvPicPr>
+                      <a:picLocks noChangeAspect="1" noChangeArrowheads="1"/>
+                    </pic:cNvPicPr>
+                  </pic:nvPicPr>
+                  <pic:blipFill>
+                    <a:blip r:embed="rId20" cstate="print">
+                      <a:extLst>
+                        <a:ext uri="{28A0092B-C50C-407E-A947-70E740481C1C}">
+                          <a14:useLocalDpi xmlns:a14="http://schemas.microsoft.com/office/drawing/2010/main" val="0"/>
+                        </a:ext>
+                      </a:extLst>
+                    </a:blip>
+                    <a:srcRect/>
+                    <a:stretch>
+                      <a:fillRect/>
+                    </a:stretch>
+                  </pic:blipFill>
+                  <pic:spPr bwMode="auto">
+                    <a:xfrm>
+                      <a:off x="0" y="0"/>
+                      <a:ext cx="6105525" cy="3257550"/>
+                    </a:xfrm>
+                    <a:prstGeom prst="rect">
+                      <a:avLst/>
+                    </a:prstGeom>
+                    <a:noFill/>
+                    <a:ln>
+                      <a:noFill/>
+                    </a:ln>
+                  </pic:spPr>
+                </pic:pic>
+              </a:graphicData>
+            </a:graphic>
+          </wp:inline>
+        </w:drawing>
+      </w:r>
+    </w:p>
+    <w:p>
+      <w:r>
+        <w:br w:type="page"/>
       </w:r>
     </w:p>
     <w:p>
@@ -10862,6 +10804,7 @@
         <w:rPr>
           <w:lang w:val="it-CH"/>
         </w:rPr>
+        <w:lastRenderedPageBreak/>
         <w:t>Design procedurale</w:t>
       </w:r>
       <w:bookmarkEnd w:id="26"/>
@@ -10913,13 +10856,8 @@
         </w:numPr>
       </w:pPr>
       <w:r>
-        <w:t xml:space="preserve">Tabelle di </w:t>
-      </w:r>
-      <w:proofErr w:type="spellStart"/>
-      <w:r>
-        <w:t>routing</w:t>
-      </w:r>
-      <w:proofErr w:type="spellEnd"/>
+        <w:t>Tabelle di routing</w:t>
+      </w:r>
     </w:p>
     <w:p>
       <w:pPr>
@@ -11199,212 +11137,86 @@
                 <w:szCs w:val="24"/>
                 <w:lang w:val="it-CH"/>
               </w:rPr>
-              <w:t xml:space="preserve">Import a card with KIC, KID and KIK keys, </w:t>
-            </w:r>
-            <w:proofErr w:type="spellStart"/>
-            <w:r>
-              <w:rPr>
+              <w:t>Import a card with KIC, KID and KIK keys, but not shown with the GUI</w:t>
+            </w:r>
+          </w:p>
+        </w:tc>
+      </w:tr>
+      <w:tr>
+        <w:tc>
+          <w:tcPr>
+            <w:tcW w:w="1843" w:type="dxa"/>
+            <w:shd w:val="clear" w:color="auto" w:fill="D9D9D9" w:themeFill="background1" w:themeFillShade="D9"/>
+          </w:tcPr>
+          <w:p>
+            <w:pPr>
+              <w:pStyle w:val="BodyTextChar"/>
+              <w:rPr>
+                <w:b/>
                 <w:sz w:val="24"/>
                 <w:szCs w:val="24"/>
                 <w:lang w:val="it-CH"/>
               </w:rPr>
-              <w:t>but</w:t>
-            </w:r>
-            <w:proofErr w:type="spellEnd"/>
-            <w:r>
-              <w:rPr>
+            </w:pPr>
+            <w:r>
+              <w:rPr>
+                <w:b/>
                 <w:sz w:val="24"/>
                 <w:szCs w:val="24"/>
                 <w:lang w:val="it-CH"/>
               </w:rPr>
-              <w:t xml:space="preserve"> </w:t>
-            </w:r>
-            <w:proofErr w:type="spellStart"/>
-            <w:r>
+              <w:t>Descrizione</w:t>
+            </w:r>
+          </w:p>
+        </w:tc>
+        <w:tc>
+          <w:tcPr>
+            <w:tcW w:w="7794" w:type="dxa"/>
+            <w:gridSpan w:val="3"/>
+          </w:tcPr>
+          <w:p>
+            <w:pPr>
+              <w:pStyle w:val="BodyTextChar"/>
               <w:rPr>
                 <w:sz w:val="24"/>
                 <w:szCs w:val="24"/>
                 <w:lang w:val="it-CH"/>
               </w:rPr>
-              <w:t>not</w:t>
-            </w:r>
-            <w:proofErr w:type="spellEnd"/>
+            </w:pPr>
             <w:r>
               <w:rPr>
                 <w:sz w:val="24"/>
                 <w:szCs w:val="24"/>
                 <w:lang w:val="it-CH"/>
               </w:rPr>
-              <w:t xml:space="preserve"> </w:t>
-            </w:r>
-            <w:proofErr w:type="spellStart"/>
-            <w:r>
-              <w:rPr>
+              <w:t>Import a card with KIC, KID and KIK keys with no obfuscation, but not shown with the GUI</w:t>
+            </w:r>
+          </w:p>
+        </w:tc>
+      </w:tr>
+      <w:tr>
+        <w:tc>
+          <w:tcPr>
+            <w:tcW w:w="1843" w:type="dxa"/>
+            <w:shd w:val="clear" w:color="auto" w:fill="D9D9D9" w:themeFill="background1" w:themeFillShade="D9"/>
+          </w:tcPr>
+          <w:p>
+            <w:pPr>
+              <w:pStyle w:val="BodyTextChar"/>
+              <w:rPr>
+                <w:b/>
                 <w:sz w:val="24"/>
                 <w:szCs w:val="24"/>
                 <w:lang w:val="it-CH"/>
               </w:rPr>
-              <w:t>shown</w:t>
-            </w:r>
-            <w:proofErr w:type="spellEnd"/>
-            <w:r>
-              <w:rPr>
+            </w:pPr>
+            <w:r>
+              <w:rPr>
+                <w:b/>
                 <w:sz w:val="24"/>
                 <w:szCs w:val="24"/>
                 <w:lang w:val="it-CH"/>
               </w:rPr>
-              <w:t xml:space="preserve"> with the GUI</w:t>
-            </w:r>
-          </w:p>
-        </w:tc>
-      </w:tr>
-      <w:tr>
-        <w:tc>
-          <w:tcPr>
-            <w:tcW w:w="1843" w:type="dxa"/>
-            <w:shd w:val="clear" w:color="auto" w:fill="D9D9D9" w:themeFill="background1" w:themeFillShade="D9"/>
-          </w:tcPr>
-          <w:p>
-            <w:pPr>
-              <w:pStyle w:val="BodyTextChar"/>
-              <w:rPr>
-                <w:b/>
-                <w:sz w:val="24"/>
-                <w:szCs w:val="24"/>
-                <w:lang w:val="it-CH"/>
-              </w:rPr>
-            </w:pPr>
-            <w:r>
-              <w:rPr>
-                <w:b/>
-                <w:sz w:val="24"/>
-                <w:szCs w:val="24"/>
-                <w:lang w:val="it-CH"/>
-              </w:rPr>
-              <w:t>Descrizione</w:t>
-            </w:r>
-          </w:p>
-        </w:tc>
-        <w:tc>
-          <w:tcPr>
-            <w:tcW w:w="7794" w:type="dxa"/>
-            <w:gridSpan w:val="3"/>
-          </w:tcPr>
-          <w:p>
-            <w:pPr>
-              <w:pStyle w:val="BodyTextChar"/>
-              <w:rPr>
-                <w:sz w:val="24"/>
-                <w:szCs w:val="24"/>
-                <w:lang w:val="it-CH"/>
-              </w:rPr>
-            </w:pPr>
-            <w:r>
-              <w:rPr>
-                <w:sz w:val="24"/>
-                <w:szCs w:val="24"/>
-                <w:lang w:val="it-CH"/>
-              </w:rPr>
-              <w:t xml:space="preserve">Import a card with KIC, KID and KIK keys with no </w:t>
-            </w:r>
-            <w:proofErr w:type="spellStart"/>
-            <w:r>
-              <w:rPr>
-                <w:sz w:val="24"/>
-                <w:szCs w:val="24"/>
-                <w:lang w:val="it-CH"/>
-              </w:rPr>
-              <w:t>obfuscation</w:t>
-            </w:r>
-            <w:proofErr w:type="spellEnd"/>
-            <w:r>
-              <w:rPr>
-                <w:sz w:val="24"/>
-                <w:szCs w:val="24"/>
-                <w:lang w:val="it-CH"/>
-              </w:rPr>
-              <w:t xml:space="preserve">, </w:t>
-            </w:r>
-            <w:proofErr w:type="spellStart"/>
-            <w:r>
-              <w:rPr>
-                <w:sz w:val="24"/>
-                <w:szCs w:val="24"/>
-                <w:lang w:val="it-CH"/>
-              </w:rPr>
-              <w:t>but</w:t>
-            </w:r>
-            <w:proofErr w:type="spellEnd"/>
-            <w:r>
-              <w:rPr>
-                <w:sz w:val="24"/>
-                <w:szCs w:val="24"/>
-                <w:lang w:val="it-CH"/>
-              </w:rPr>
-              <w:t xml:space="preserve"> </w:t>
-            </w:r>
-            <w:proofErr w:type="spellStart"/>
-            <w:r>
-              <w:rPr>
-                <w:sz w:val="24"/>
-                <w:szCs w:val="24"/>
-                <w:lang w:val="it-CH"/>
-              </w:rPr>
-              <w:t>not</w:t>
-            </w:r>
-            <w:proofErr w:type="spellEnd"/>
-            <w:r>
-              <w:rPr>
-                <w:sz w:val="24"/>
-                <w:szCs w:val="24"/>
-                <w:lang w:val="it-CH"/>
-              </w:rPr>
-              <w:t xml:space="preserve"> </w:t>
-            </w:r>
-            <w:proofErr w:type="spellStart"/>
-            <w:r>
-              <w:rPr>
-                <w:sz w:val="24"/>
-                <w:szCs w:val="24"/>
-                <w:lang w:val="it-CH"/>
-              </w:rPr>
-              <w:t>shown</w:t>
-            </w:r>
-            <w:proofErr w:type="spellEnd"/>
-            <w:r>
-              <w:rPr>
-                <w:sz w:val="24"/>
-                <w:szCs w:val="24"/>
-                <w:lang w:val="it-CH"/>
-              </w:rPr>
-              <w:t xml:space="preserve"> with the GUI</w:t>
-            </w:r>
-          </w:p>
-        </w:tc>
-      </w:tr>
-      <w:tr>
-        <w:tc>
-          <w:tcPr>
-            <w:tcW w:w="1843" w:type="dxa"/>
-            <w:shd w:val="clear" w:color="auto" w:fill="D9D9D9" w:themeFill="background1" w:themeFillShade="D9"/>
-          </w:tcPr>
-          <w:p>
-            <w:pPr>
-              <w:pStyle w:val="BodyTextChar"/>
-              <w:rPr>
-                <w:b/>
-                <w:sz w:val="24"/>
-                <w:szCs w:val="24"/>
-                <w:lang w:val="it-CH"/>
-              </w:rPr>
-            </w:pPr>
-            <w:r>
-              <w:rPr>
-                <w:b/>
-                <w:sz w:val="24"/>
-                <w:szCs w:val="24"/>
-                <w:lang w:val="it-CH"/>
-              </w:rPr>
               <w:t>Prerequisiti</w:t>
             </w:r>
           </w:p>
@@ -11429,90 +11241,32 @@
                 <w:szCs w:val="24"/>
                 <w:lang w:val="fr-CH"/>
               </w:rPr>
-              <w:t xml:space="preserve">Store on local </w:t>
-            </w:r>
-            <w:proofErr w:type="gramStart"/>
+              <w:t xml:space="preserve">Store on local PC: Profile_1.2.001.xml (appendix </w:t>
+            </w:r>
             <w:r>
               <w:rPr>
                 <w:sz w:val="24"/>
                 <w:szCs w:val="24"/>
                 <w:lang w:val="fr-CH"/>
               </w:rPr>
-              <w:t>PC:</w:t>
-            </w:r>
-            <w:proofErr w:type="gramEnd"/>
+              <w:t>n_n</w:t>
+            </w:r>
             <w:r>
               <w:rPr>
                 <w:sz w:val="24"/>
                 <w:szCs w:val="24"/>
                 <w:lang w:val="fr-CH"/>
               </w:rPr>
-              <w:t xml:space="preserve"> Profile_1.2.001.xml (</w:t>
-            </w:r>
-            <w:proofErr w:type="spellStart"/>
+              <w:t xml:space="preserve">) and Cards_1.2.001.txt (appendix </w:t>
+            </w:r>
             <w:r>
               <w:rPr>
                 <w:sz w:val="24"/>
                 <w:szCs w:val="24"/>
                 <w:lang w:val="fr-CH"/>
               </w:rPr>
-              <w:t>appendix</w:t>
-            </w:r>
-            <w:proofErr w:type="spellEnd"/>
-            <w:r>
-              <w:rPr>
-                <w:sz w:val="24"/>
-                <w:szCs w:val="24"/>
-                <w:lang w:val="fr-CH"/>
-              </w:rPr>
-              <w:t xml:space="preserve"> </w:t>
-            </w:r>
-            <w:proofErr w:type="spellStart"/>
-            <w:r>
-              <w:rPr>
-                <w:sz w:val="24"/>
-                <w:szCs w:val="24"/>
-                <w:lang w:val="fr-CH"/>
-              </w:rPr>
               <w:t>n_n</w:t>
             </w:r>
-            <w:proofErr w:type="spellEnd"/>
-            <w:r>
-              <w:rPr>
-                <w:sz w:val="24"/>
-                <w:szCs w:val="24"/>
-                <w:lang w:val="fr-CH"/>
-              </w:rPr>
-              <w:t>) and Cards_1.2.001.txt (</w:t>
-            </w:r>
-            <w:proofErr w:type="spellStart"/>
-            <w:r>
-              <w:rPr>
-                <w:sz w:val="24"/>
-                <w:szCs w:val="24"/>
-                <w:lang w:val="fr-CH"/>
-              </w:rPr>
-              <w:t>appendix</w:t>
-            </w:r>
-            <w:proofErr w:type="spellEnd"/>
-            <w:r>
-              <w:rPr>
-                <w:sz w:val="24"/>
-                <w:szCs w:val="24"/>
-                <w:lang w:val="fr-CH"/>
-              </w:rPr>
-              <w:t xml:space="preserve"> </w:t>
-            </w:r>
-            <w:proofErr w:type="spellStart"/>
-            <w:r>
-              <w:rPr>
-                <w:sz w:val="24"/>
-                <w:szCs w:val="24"/>
-                <w:lang w:val="fr-CH"/>
-              </w:rPr>
-              <w:t>n_n</w:t>
-            </w:r>
-            <w:proofErr w:type="spellEnd"/>
             <w:r>
               <w:rPr>
                 <w:sz w:val="24"/>
@@ -11601,52 +11355,16 @@
                 <w:szCs w:val="24"/>
                 <w:lang w:val="fr-CH"/>
               </w:rPr>
-              <w:t>Go to “</w:t>
-            </w:r>
-            <w:proofErr w:type="spellStart"/>
+              <w:t xml:space="preserve">Go to “Cards manager” menu, </w:t>
+            </w:r>
             <w:r>
               <w:rPr>
                 <w:sz w:val="24"/>
                 <w:szCs w:val="24"/>
                 <w:lang w:val="fr-CH"/>
               </w:rPr>
-              <w:t>Cards</w:t>
-            </w:r>
-            <w:proofErr w:type="spellEnd"/>
-            <w:r>
-              <w:rPr>
-                <w:sz w:val="24"/>
-                <w:szCs w:val="24"/>
-                <w:lang w:val="fr-CH"/>
-              </w:rPr>
-              <w:t xml:space="preserve"> manager” menu, </w:t>
-            </w:r>
-            <w:r>
-              <w:rPr>
-                <w:sz w:val="24"/>
-                <w:szCs w:val="24"/>
-                <w:lang w:val="fr-CH"/>
-              </w:rPr>
               <w:br/>
-              <w:t xml:space="preserve">in main page click “Import Profiles” </w:t>
-            </w:r>
-            <w:proofErr w:type="spellStart"/>
-            <w:r>
-              <w:rPr>
-                <w:sz w:val="24"/>
-                <w:szCs w:val="24"/>
-                <w:lang w:val="fr-CH"/>
-              </w:rPr>
-              <w:t>link</w:t>
-            </w:r>
-            <w:proofErr w:type="spellEnd"/>
-            <w:r>
-              <w:rPr>
-                <w:sz w:val="24"/>
-                <w:szCs w:val="24"/>
-                <w:lang w:val="fr-CH"/>
-              </w:rPr>
-              <w:t>,</w:t>
+              <w:t>in main page click “Import Profiles” link,</w:t>
             </w:r>
             <w:r>
               <w:rPr>
@@ -11687,25 +11405,25 @@
                 <w:szCs w:val="24"/>
                 <w:lang w:val="fr-CH"/>
               </w:rPr>
-              <w:t>Go to “</w:t>
-            </w:r>
-            <w:proofErr w:type="spellStart"/>
+              <w:t xml:space="preserve">Go to “Cards manager” menu, </w:t>
+            </w:r>
             <w:r>
               <w:rPr>
                 <w:sz w:val="24"/>
                 <w:szCs w:val="24"/>
                 <w:lang w:val="fr-CH"/>
               </w:rPr>
-              <w:t>Cards</w:t>
-            </w:r>
-            <w:proofErr w:type="spellEnd"/>
+              <w:br/>
+              <w:t>in main page click “Import Cards” link,</w:t>
+            </w:r>
             <w:r>
               <w:rPr>
                 <w:sz w:val="24"/>
                 <w:szCs w:val="24"/>
                 <w:lang w:val="fr-CH"/>
               </w:rPr>
-              <w:t xml:space="preserve"> manager” menu, </w:t>
+              <w:br/>
+              <w:t>Select the “1.2.001.txt” file,</w:t>
             </w:r>
             <w:r>
               <w:rPr>
@@ -11714,125 +11432,26 @@
                 <w:lang w:val="fr-CH"/>
               </w:rPr>
               <w:br/>
-              <w:t xml:space="preserve">in main page click “Import </w:t>
-            </w:r>
-            <w:proofErr w:type="spellStart"/>
+              <w:t xml:space="preserve">Delete the cards, </w:t>
+            </w:r>
             <w:r>
               <w:rPr>
                 <w:sz w:val="24"/>
                 <w:szCs w:val="24"/>
                 <w:lang w:val="fr-CH"/>
               </w:rPr>
-              <w:t>Cards</w:t>
-            </w:r>
-            <w:proofErr w:type="spellEnd"/>
+              <w:br/>
+              <w:t>Select the “1.2.001.txt” file,</w:t>
+            </w:r>
             <w:r>
               <w:rPr>
                 <w:sz w:val="24"/>
                 <w:szCs w:val="24"/>
                 <w:lang w:val="fr-CH"/>
               </w:rPr>
-              <w:t xml:space="preserve">” </w:t>
-            </w:r>
-            <w:proofErr w:type="spellStart"/>
-            <w:r>
-              <w:rPr>
-                <w:sz w:val="24"/>
-                <w:szCs w:val="24"/>
-                <w:lang w:val="fr-CH"/>
-              </w:rPr>
-              <w:t>link</w:t>
-            </w:r>
-            <w:proofErr w:type="spellEnd"/>
-            <w:r>
-              <w:rPr>
-                <w:sz w:val="24"/>
-                <w:szCs w:val="24"/>
-                <w:lang w:val="fr-CH"/>
-              </w:rPr>
-              <w:t>,</w:t>
-            </w:r>
-            <w:r>
-              <w:rPr>
-                <w:sz w:val="24"/>
-                <w:szCs w:val="24"/>
-                <w:lang w:val="fr-CH"/>
-              </w:rPr>
               <w:br/>
-              <w:t>Select the “1.2.001.txt” file,</w:t>
-            </w:r>
-            <w:r>
-              <w:rPr>
-                <w:sz w:val="24"/>
-                <w:szCs w:val="24"/>
-                <w:lang w:val="fr-CH"/>
-              </w:rPr>
-              <w:br/>
-            </w:r>
-            <w:proofErr w:type="spellStart"/>
-            <w:r>
-              <w:rPr>
-                <w:sz w:val="24"/>
-                <w:szCs w:val="24"/>
-                <w:lang w:val="fr-CH"/>
-              </w:rPr>
-              <w:t>Delete</w:t>
-            </w:r>
-            <w:proofErr w:type="spellEnd"/>
-            <w:r>
-              <w:rPr>
-                <w:sz w:val="24"/>
-                <w:szCs w:val="24"/>
-                <w:lang w:val="fr-CH"/>
-              </w:rPr>
-              <w:t xml:space="preserve"> the </w:t>
-            </w:r>
-            <w:proofErr w:type="spellStart"/>
-            <w:r>
-              <w:rPr>
-                <w:sz w:val="24"/>
-                <w:szCs w:val="24"/>
-                <w:lang w:val="fr-CH"/>
-              </w:rPr>
-              <w:t>cards</w:t>
-            </w:r>
-            <w:proofErr w:type="spellEnd"/>
-            <w:r>
-              <w:rPr>
-                <w:sz w:val="24"/>
-                <w:szCs w:val="24"/>
-                <w:lang w:val="fr-CH"/>
-              </w:rPr>
-              <w:t xml:space="preserve">, </w:t>
-            </w:r>
-            <w:r>
-              <w:rPr>
-                <w:sz w:val="24"/>
-                <w:szCs w:val="24"/>
-                <w:lang w:val="fr-CH"/>
-              </w:rPr>
-              <w:br/>
-              <w:t>Select the “1.2.001.txt” file,</w:t>
-            </w:r>
-            <w:r>
-              <w:rPr>
-                <w:sz w:val="24"/>
-                <w:szCs w:val="24"/>
-                <w:lang w:val="fr-CH"/>
-              </w:rPr>
-              <w:br/>
-              <w:t xml:space="preserve">Import the </w:t>
-            </w:r>
-            <w:proofErr w:type="spellStart"/>
-            <w:r>
-              <w:rPr>
-                <w:sz w:val="24"/>
-                <w:szCs w:val="24"/>
-                <w:lang w:val="fr-CH"/>
-              </w:rPr>
-              <w:t>cards</w:t>
-            </w:r>
-            <w:proofErr w:type="spellEnd"/>
+              <w:t>Import the cards</w:t>
+            </w:r>
           </w:p>
           <w:p>
             <w:pPr>
@@ -11847,7 +11466,6 @@
                 <w:lang w:val="fr-CH"/>
               </w:rPr>
             </w:pPr>
-            <w:proofErr w:type="spellStart"/>
             <w:r>
               <w:rPr>
                 <w:sz w:val="24"/>
@@ -11855,16 +11473,7 @@
                 <w:lang w:val="fr-CH"/>
               </w:rPr>
               <w:lastRenderedPageBreak/>
-              <w:t>Research</w:t>
-            </w:r>
-            <w:proofErr w:type="spellEnd"/>
-            <w:r>
-              <w:rPr>
-                <w:sz w:val="24"/>
-                <w:szCs w:val="24"/>
-                <w:lang w:val="fr-CH"/>
-              </w:rPr>
-              <w:t xml:space="preserve"> the “</w:t>
+              <w:t>Research the “</w:t>
             </w:r>
             <w:r>
               <w:rPr>
@@ -11882,118 +11491,26 @@
                 <w:szCs w:val="24"/>
                 <w:lang w:val="fr-CH"/>
               </w:rPr>
-              <w:t xml:space="preserve">” </w:t>
-            </w:r>
-            <w:proofErr w:type="spellStart"/>
+              <w:t>” Card,</w:t>
+            </w:r>
             <w:r>
               <w:rPr>
                 <w:sz w:val="24"/>
                 <w:szCs w:val="24"/>
                 <w:lang w:val="fr-CH"/>
               </w:rPr>
-              <w:t>Card</w:t>
-            </w:r>
-            <w:proofErr w:type="spellEnd"/>
+              <w:br/>
+              <w:t>Click the imsi card link</w:t>
+            </w:r>
             <w:r>
               <w:rPr>
                 <w:sz w:val="24"/>
                 <w:szCs w:val="24"/>
                 <w:lang w:val="fr-CH"/>
               </w:rPr>
-              <w:t>,</w:t>
-            </w:r>
-            <w:r>
-              <w:rPr>
-                <w:sz w:val="24"/>
-                <w:szCs w:val="24"/>
-                <w:lang w:val="fr-CH"/>
-              </w:rPr>
               <w:br/>
-              <w:t xml:space="preserve">Click the </w:t>
-            </w:r>
-            <w:proofErr w:type="spellStart"/>
-            <w:r>
-              <w:rPr>
-                <w:sz w:val="24"/>
-                <w:szCs w:val="24"/>
-                <w:lang w:val="fr-CH"/>
-              </w:rPr>
-              <w:t>imsi</w:t>
-            </w:r>
-            <w:proofErr w:type="spellEnd"/>
-            <w:r>
-              <w:rPr>
-                <w:sz w:val="24"/>
-                <w:szCs w:val="24"/>
-                <w:lang w:val="fr-CH"/>
-              </w:rPr>
-              <w:t xml:space="preserve"> </w:t>
-            </w:r>
-            <w:proofErr w:type="spellStart"/>
-            <w:r>
-              <w:rPr>
-                <w:sz w:val="24"/>
-                <w:szCs w:val="24"/>
-                <w:lang w:val="fr-CH"/>
-              </w:rPr>
-              <w:t>card</w:t>
-            </w:r>
-            <w:proofErr w:type="spellEnd"/>
-            <w:r>
-              <w:rPr>
-                <w:sz w:val="24"/>
-                <w:szCs w:val="24"/>
-                <w:lang w:val="fr-CH"/>
-              </w:rPr>
-              <w:t xml:space="preserve"> </w:t>
-            </w:r>
-            <w:proofErr w:type="spellStart"/>
-            <w:r>
-              <w:rPr>
-                <w:sz w:val="24"/>
-                <w:szCs w:val="24"/>
-                <w:lang w:val="fr-CH"/>
-              </w:rPr>
-              <w:t>link</w:t>
-            </w:r>
-            <w:proofErr w:type="spellEnd"/>
-            <w:r>
-              <w:rPr>
-                <w:sz w:val="24"/>
-                <w:szCs w:val="24"/>
-                <w:lang w:val="fr-CH"/>
-              </w:rPr>
-              <w:br/>
-              <w:t xml:space="preserve">Check the </w:t>
-            </w:r>
-            <w:proofErr w:type="spellStart"/>
-            <w:r>
-              <w:rPr>
-                <w:sz w:val="24"/>
-                <w:szCs w:val="24"/>
-                <w:lang w:val="fr-CH"/>
-              </w:rPr>
-              <w:t>card</w:t>
-            </w:r>
-            <w:proofErr w:type="spellEnd"/>
-            <w:r>
-              <w:rPr>
-                <w:sz w:val="24"/>
-                <w:szCs w:val="24"/>
-                <w:lang w:val="fr-CH"/>
-              </w:rPr>
-              <w:t xml:space="preserve"> </w:t>
-            </w:r>
-            <w:proofErr w:type="spellStart"/>
-            <w:r>
-              <w:rPr>
-                <w:sz w:val="24"/>
-                <w:szCs w:val="24"/>
-                <w:lang w:val="fr-CH"/>
-              </w:rPr>
-              <w:t>details</w:t>
-            </w:r>
-            <w:proofErr w:type="spellEnd"/>
+              <w:t>Check the card details</w:t>
+            </w:r>
           </w:p>
           <w:p>
             <w:pPr>
@@ -12008,7 +11525,6 @@
                 <w:lang w:val="fr-CH"/>
               </w:rPr>
             </w:pPr>
-            <w:proofErr w:type="spellStart"/>
             <w:r>
               <w:rPr>
                 <w:rFonts w:eastAsia="MS Mincho"/>
@@ -12016,9 +11532,8 @@
                 <w:szCs w:val="24"/>
                 <w:lang w:val="fr-CH" w:eastAsia="ja-JP"/>
               </w:rPr>
-              <w:t>Execute</w:t>
-            </w:r>
-            <w:proofErr w:type="spellEnd"/>
+              <w:t>Execute the SQL:</w:t>
+            </w:r>
             <w:r>
               <w:rPr>
                 <w:rFonts w:eastAsia="MS Mincho"/>
@@ -12026,26 +11541,6 @@
                 <w:szCs w:val="24"/>
                 <w:lang w:val="fr-CH" w:eastAsia="ja-JP"/>
               </w:rPr>
-              <w:t xml:space="preserve"> the </w:t>
-            </w:r>
-            <w:proofErr w:type="gramStart"/>
-            <w:r>
-              <w:rPr>
-                <w:rFonts w:eastAsia="MS Mincho"/>
-                <w:sz w:val="24"/>
-                <w:szCs w:val="24"/>
-                <w:lang w:val="fr-CH" w:eastAsia="ja-JP"/>
-              </w:rPr>
-              <w:t>SQL:</w:t>
-            </w:r>
-            <w:proofErr w:type="gramEnd"/>
-            <w:r>
-              <w:rPr>
-                <w:rFonts w:eastAsia="MS Mincho"/>
-                <w:sz w:val="24"/>
-                <w:szCs w:val="24"/>
-                <w:lang w:val="fr-CH" w:eastAsia="ja-JP"/>
-              </w:rPr>
               <w:br/>
             </w:r>
             <w:r>
@@ -12054,331 +11549,7 @@
                 <w:rFonts w:eastAsia="MS Mincho"/>
                 <w:lang w:val="fr-CH"/>
               </w:rPr>
-              <w:t xml:space="preserve">SELECT </w:t>
-            </w:r>
-            <w:proofErr w:type="spellStart"/>
-            <w:r>
-              <w:rPr>
-                <w:rStyle w:val="Codice"/>
-                <w:rFonts w:eastAsia="MS Mincho"/>
-                <w:lang w:val="fr-CH"/>
-              </w:rPr>
-              <w:t>imsi</w:t>
-            </w:r>
-            <w:proofErr w:type="spellEnd"/>
-            <w:r>
-              <w:rPr>
-                <w:rStyle w:val="Codice"/>
-                <w:rFonts w:eastAsia="MS Mincho"/>
-                <w:lang w:val="fr-CH"/>
-              </w:rPr>
-              <w:t xml:space="preserve">, </w:t>
-            </w:r>
-            <w:proofErr w:type="spellStart"/>
-            <w:r>
-              <w:rPr>
-                <w:rStyle w:val="Codice"/>
-                <w:rFonts w:eastAsia="MS Mincho"/>
-                <w:lang w:val="fr-CH"/>
-              </w:rPr>
-              <w:t>dir</w:t>
-            </w:r>
-            <w:proofErr w:type="spellEnd"/>
-            <w:r>
-              <w:rPr>
-                <w:rStyle w:val="Codice"/>
-                <w:rFonts w:eastAsia="MS Mincho"/>
-                <w:lang w:val="fr-CH"/>
-              </w:rPr>
-              <w:t xml:space="preserve">, </w:t>
-            </w:r>
-            <w:proofErr w:type="spellStart"/>
-            <w:r>
-              <w:rPr>
-                <w:rStyle w:val="Codice"/>
-                <w:rFonts w:eastAsia="MS Mincho"/>
-                <w:lang w:val="fr-CH"/>
-              </w:rPr>
-              <w:t>keyset</w:t>
-            </w:r>
-            <w:proofErr w:type="spellEnd"/>
-            <w:r>
-              <w:rPr>
-                <w:rStyle w:val="Codice"/>
-                <w:rFonts w:eastAsia="MS Mincho"/>
-                <w:lang w:val="fr-CH"/>
-              </w:rPr>
-              <w:t xml:space="preserve">, </w:t>
-            </w:r>
-            <w:proofErr w:type="spellStart"/>
-            <w:r>
-              <w:rPr>
-                <w:rStyle w:val="Codice"/>
-                <w:rFonts w:eastAsia="MS Mincho"/>
-                <w:lang w:val="fr-CH"/>
-              </w:rPr>
-              <w:t>cntr</w:t>
-            </w:r>
-            <w:proofErr w:type="spellEnd"/>
-            <w:r>
-              <w:rPr>
-                <w:rStyle w:val="Codice"/>
-                <w:rFonts w:eastAsia="MS Mincho"/>
-                <w:lang w:val="fr-CH"/>
-              </w:rPr>
-              <w:t xml:space="preserve">, </w:t>
-            </w:r>
-            <w:proofErr w:type="spellStart"/>
-            <w:r>
-              <w:rPr>
-                <w:rStyle w:val="Codice"/>
-                <w:rFonts w:eastAsia="MS Mincho"/>
-                <w:lang w:val="fr-CH"/>
-              </w:rPr>
-              <w:t>rawtohex</w:t>
-            </w:r>
-            <w:proofErr w:type="spellEnd"/>
-            <w:r>
-              <w:rPr>
-                <w:rStyle w:val="Codice"/>
-                <w:rFonts w:eastAsia="MS Mincho"/>
-                <w:lang w:val="fr-CH"/>
-              </w:rPr>
-              <w:t>(</w:t>
-            </w:r>
-            <w:proofErr w:type="spellStart"/>
-            <w:r>
-              <w:rPr>
-                <w:rStyle w:val="Codice"/>
-                <w:rFonts w:eastAsia="MS Mincho"/>
-                <w:lang w:val="fr-CH"/>
-              </w:rPr>
-              <w:t>kickey</w:t>
-            </w:r>
-            <w:proofErr w:type="spellEnd"/>
-            <w:r>
-              <w:rPr>
-                <w:rStyle w:val="Codice"/>
-                <w:rFonts w:eastAsia="MS Mincho"/>
-                <w:lang w:val="fr-CH"/>
-              </w:rPr>
-              <w:t xml:space="preserve">), </w:t>
-            </w:r>
-            <w:proofErr w:type="spellStart"/>
-            <w:r>
-              <w:rPr>
-                <w:rStyle w:val="Codice"/>
-                <w:rFonts w:eastAsia="MS Mincho"/>
-                <w:lang w:val="fr-CH"/>
-              </w:rPr>
-              <w:t>rawtohex</w:t>
-            </w:r>
-            <w:proofErr w:type="spellEnd"/>
-            <w:r>
-              <w:rPr>
-                <w:rStyle w:val="Codice"/>
-                <w:rFonts w:eastAsia="MS Mincho"/>
-                <w:lang w:val="fr-CH"/>
-              </w:rPr>
-              <w:t>(</w:t>
-            </w:r>
-            <w:proofErr w:type="spellStart"/>
-            <w:r>
-              <w:rPr>
-                <w:rStyle w:val="Codice"/>
-                <w:rFonts w:eastAsia="MS Mincho"/>
-                <w:lang w:val="fr-CH"/>
-              </w:rPr>
-              <w:t>kidkey</w:t>
-            </w:r>
-            <w:proofErr w:type="spellEnd"/>
-            <w:r>
-              <w:rPr>
-                <w:rStyle w:val="Codice"/>
-                <w:rFonts w:eastAsia="MS Mincho"/>
-                <w:lang w:val="fr-CH"/>
-              </w:rPr>
-              <w:t xml:space="preserve">), </w:t>
-            </w:r>
-            <w:proofErr w:type="spellStart"/>
-            <w:r>
-              <w:rPr>
-                <w:rStyle w:val="Codice"/>
-                <w:rFonts w:eastAsia="MS Mincho"/>
-                <w:lang w:val="fr-CH"/>
-              </w:rPr>
-              <w:t>rawtohex</w:t>
-            </w:r>
-            <w:proofErr w:type="spellEnd"/>
-            <w:r>
-              <w:rPr>
-                <w:rStyle w:val="Codice"/>
-                <w:rFonts w:eastAsia="MS Mincho"/>
-                <w:lang w:val="fr-CH"/>
-              </w:rPr>
-              <w:t>(</w:t>
-            </w:r>
-            <w:proofErr w:type="spellStart"/>
-            <w:r>
-              <w:rPr>
-                <w:rStyle w:val="Codice"/>
-                <w:rFonts w:eastAsia="MS Mincho"/>
-                <w:lang w:val="fr-CH"/>
-              </w:rPr>
-              <w:t>kikkey</w:t>
-            </w:r>
-            <w:proofErr w:type="spellEnd"/>
-            <w:r>
-              <w:rPr>
-                <w:rStyle w:val="Codice"/>
-                <w:rFonts w:eastAsia="MS Mincho"/>
-                <w:lang w:val="fr-CH"/>
-              </w:rPr>
-              <w:t xml:space="preserve">), </w:t>
-            </w:r>
-            <w:proofErr w:type="spellStart"/>
-            <w:r>
-              <w:rPr>
-                <w:rStyle w:val="Codice"/>
-                <w:rFonts w:eastAsia="MS Mincho"/>
-                <w:lang w:val="fr-CH"/>
-              </w:rPr>
-              <w:t>rawtohex</w:t>
-            </w:r>
-            <w:proofErr w:type="spellEnd"/>
-            <w:r>
-              <w:rPr>
-                <w:rStyle w:val="Codice"/>
-                <w:rFonts w:eastAsia="MS Mincho"/>
-                <w:lang w:val="fr-CH"/>
-              </w:rPr>
-              <w:t>(</w:t>
-            </w:r>
-            <w:proofErr w:type="spellStart"/>
-            <w:r>
-              <w:rPr>
-                <w:rStyle w:val="Codice"/>
-                <w:rFonts w:eastAsia="MS Mincho"/>
-                <w:lang w:val="fr-CH"/>
-              </w:rPr>
-              <w:t>chv</w:t>
-            </w:r>
-            <w:proofErr w:type="spellEnd"/>
-            <w:r>
-              <w:rPr>
-                <w:rStyle w:val="Codice"/>
-                <w:rFonts w:eastAsia="MS Mincho"/>
-                <w:lang w:val="fr-CH"/>
-              </w:rPr>
-              <w:t xml:space="preserve">), </w:t>
-            </w:r>
-            <w:proofErr w:type="spellStart"/>
-            <w:r>
-              <w:rPr>
-                <w:rStyle w:val="Codice"/>
-                <w:rFonts w:eastAsia="MS Mincho"/>
-                <w:lang w:val="fr-CH"/>
-              </w:rPr>
-              <w:t>rawtohex</w:t>
-            </w:r>
-            <w:proofErr w:type="spellEnd"/>
-            <w:r>
-              <w:rPr>
-                <w:rStyle w:val="Codice"/>
-                <w:rFonts w:eastAsia="MS Mincho"/>
-                <w:lang w:val="fr-CH"/>
-              </w:rPr>
-              <w:t>(</w:t>
-            </w:r>
-            <w:proofErr w:type="spellStart"/>
-            <w:r>
-              <w:rPr>
-                <w:rStyle w:val="Codice"/>
-                <w:rFonts w:eastAsia="MS Mincho"/>
-                <w:lang w:val="fr-CH"/>
-              </w:rPr>
-              <w:t>dap</w:t>
-            </w:r>
-            <w:proofErr w:type="spellEnd"/>
-            <w:r>
-              <w:rPr>
-                <w:rStyle w:val="Codice"/>
-                <w:rFonts w:eastAsia="MS Mincho"/>
-                <w:lang w:val="fr-CH"/>
-              </w:rPr>
-              <w:t xml:space="preserve">)FROM </w:t>
-            </w:r>
-            <w:proofErr w:type="spellStart"/>
-            <w:r>
-              <w:rPr>
-                <w:rStyle w:val="Codice"/>
-                <w:rFonts w:eastAsia="MS Mincho"/>
-                <w:lang w:val="fr-CH"/>
-              </w:rPr>
-              <w:t>otacardkey</w:t>
-            </w:r>
-            <w:proofErr w:type="spellEnd"/>
-            <w:r>
-              <w:rPr>
-                <w:rStyle w:val="Codice"/>
-                <w:rFonts w:eastAsia="MS Mincho"/>
-                <w:lang w:val="fr-CH"/>
-              </w:rPr>
-              <w:t xml:space="preserve"> a </w:t>
-            </w:r>
-            <w:proofErr w:type="spellStart"/>
-            <w:r>
-              <w:rPr>
-                <w:rStyle w:val="Codice"/>
-                <w:rFonts w:eastAsia="MS Mincho"/>
-                <w:lang w:val="fr-CH"/>
-              </w:rPr>
-              <w:t>where</w:t>
-            </w:r>
-            <w:proofErr w:type="spellEnd"/>
-            <w:r>
-              <w:rPr>
-                <w:rStyle w:val="Codice"/>
-                <w:rFonts w:eastAsia="MS Mincho"/>
-                <w:lang w:val="fr-CH"/>
-              </w:rPr>
-              <w:t xml:space="preserve"> </w:t>
-            </w:r>
-            <w:proofErr w:type="spellStart"/>
-            <w:r>
-              <w:rPr>
-                <w:rStyle w:val="Codice"/>
-                <w:rFonts w:eastAsia="MS Mincho"/>
-                <w:lang w:val="fr-CH"/>
-              </w:rPr>
-              <w:t>imsi</w:t>
-            </w:r>
-            <w:proofErr w:type="spellEnd"/>
-            <w:r>
-              <w:rPr>
-                <w:rStyle w:val="Codice"/>
-                <w:rFonts w:eastAsia="MS Mincho"/>
-                <w:lang w:val="fr-CH"/>
-              </w:rPr>
-              <w:t xml:space="preserve">='340041795924770' ORDER BY </w:t>
-            </w:r>
-            <w:proofErr w:type="spellStart"/>
-            <w:r>
-              <w:rPr>
-                <w:rStyle w:val="Codice"/>
-                <w:rFonts w:eastAsia="MS Mincho"/>
-                <w:lang w:val="fr-CH"/>
-              </w:rPr>
-              <w:t>keyset</w:t>
-            </w:r>
-            <w:proofErr w:type="spellEnd"/>
-            <w:r>
-              <w:rPr>
-                <w:rStyle w:val="Codice"/>
-                <w:rFonts w:eastAsia="MS Mincho"/>
-                <w:lang w:val="fr-CH"/>
-              </w:rPr>
-              <w:t>;</w:t>
+              <w:t>SELECT imsi, dir, keyset, cntr, rawtohex(kickey), rawtohex(kidkey), rawtohex(kikkey), rawtohex(chv), rawtohex(dap)FROM otacardkey a where imsi='340041795924770' ORDER BY keyset;</w:t>
             </w:r>
           </w:p>
         </w:tc>
@@ -12431,115 +11602,7 @@
                 <w:szCs w:val="24"/>
                 <w:lang w:val="it-CH"/>
               </w:rPr>
-              <w:t xml:space="preserve">Keys </w:t>
-            </w:r>
-            <w:proofErr w:type="spellStart"/>
-            <w:r>
-              <w:rPr>
-                <w:sz w:val="24"/>
-                <w:szCs w:val="24"/>
-                <w:lang w:val="it-CH"/>
-              </w:rPr>
-              <w:t>visible</w:t>
-            </w:r>
-            <w:proofErr w:type="spellEnd"/>
-            <w:r>
-              <w:rPr>
-                <w:sz w:val="24"/>
-                <w:szCs w:val="24"/>
-                <w:lang w:val="it-CH"/>
-              </w:rPr>
-              <w:t xml:space="preserve"> in the DB (</w:t>
-            </w:r>
-            <w:proofErr w:type="spellStart"/>
-            <w:r>
-              <w:rPr>
-                <w:sz w:val="24"/>
-                <w:szCs w:val="24"/>
-                <w:lang w:val="it-CH"/>
-              </w:rPr>
-              <w:t>OtaCardKey</w:t>
-            </w:r>
-            <w:proofErr w:type="spellEnd"/>
-            <w:r>
-              <w:rPr>
-                <w:sz w:val="24"/>
-                <w:szCs w:val="24"/>
-                <w:lang w:val="it-CH"/>
-              </w:rPr>
-              <w:t xml:space="preserve">) </w:t>
-            </w:r>
-            <w:proofErr w:type="spellStart"/>
-            <w:r>
-              <w:rPr>
-                <w:sz w:val="24"/>
-                <w:szCs w:val="24"/>
-                <w:lang w:val="it-CH"/>
-              </w:rPr>
-              <w:t>but</w:t>
-            </w:r>
-            <w:proofErr w:type="spellEnd"/>
-            <w:r>
-              <w:rPr>
-                <w:sz w:val="24"/>
-                <w:szCs w:val="24"/>
-                <w:lang w:val="it-CH"/>
-              </w:rPr>
-              <w:t xml:space="preserve"> </w:t>
-            </w:r>
-            <w:proofErr w:type="spellStart"/>
-            <w:r>
-              <w:rPr>
-                <w:sz w:val="24"/>
-                <w:szCs w:val="24"/>
-                <w:lang w:val="it-CH"/>
-              </w:rPr>
-              <w:t>not</w:t>
-            </w:r>
-            <w:proofErr w:type="spellEnd"/>
-            <w:r>
-              <w:rPr>
-                <w:sz w:val="24"/>
-                <w:szCs w:val="24"/>
-                <w:lang w:val="it-CH"/>
-              </w:rPr>
-              <w:t xml:space="preserve"> </w:t>
-            </w:r>
-            <w:proofErr w:type="spellStart"/>
-            <w:r>
-              <w:rPr>
-                <w:sz w:val="24"/>
-                <w:szCs w:val="24"/>
-                <w:lang w:val="it-CH"/>
-              </w:rPr>
-              <w:t>visible</w:t>
-            </w:r>
-            <w:proofErr w:type="spellEnd"/>
-            <w:r>
-              <w:rPr>
-                <w:sz w:val="24"/>
-                <w:szCs w:val="24"/>
-                <w:lang w:val="it-CH"/>
-              </w:rPr>
-              <w:t xml:space="preserve"> in the GUI (Card </w:t>
-            </w:r>
-            <w:proofErr w:type="spellStart"/>
-            <w:r>
-              <w:rPr>
-                <w:sz w:val="24"/>
-                <w:szCs w:val="24"/>
-                <w:lang w:val="it-CH"/>
-              </w:rPr>
-              <w:t>details</w:t>
-            </w:r>
-            <w:proofErr w:type="spellEnd"/>
-            <w:r>
-              <w:rPr>
-                <w:sz w:val="24"/>
-                <w:szCs w:val="24"/>
-                <w:lang w:val="it-CH"/>
-              </w:rPr>
-              <w:t>)</w:t>
+              <w:t>Keys visible in the DB (OtaCardKey) but not visible in the GUI (Card details)</w:t>
             </w:r>
           </w:p>
         </w:tc>
@@ -12842,21 +11905,13 @@
         <w:t>.</w:t>
       </w:r>
       <w:r>
-        <w:t xml:space="preserve"> 1.7) (ad esempio </w:t>
-      </w:r>
-      <w:proofErr w:type="spellStart"/>
-      <w:r>
-        <w:t>Gan</w:t>
+        <w:t xml:space="preserve"> 1.7) (ad esempio Gan</w:t>
       </w:r>
       <w:r>
         <w:t>t</w:t>
       </w:r>
       <w:r>
-        <w:t>t</w:t>
-      </w:r>
-      <w:proofErr w:type="spellEnd"/>
-      <w:r>
-        <w:t xml:space="preserve"> consuntivo).</w:t>
+        <w:t>t consuntivo).</w:t>
       </w:r>
     </w:p>
     <w:p/>
@@ -12864,10 +11919,10 @@
     <w:p>
       <w:pPr>
         <w:sectPr>
-          <w:headerReference w:type="default" r:id="rId17"/>
-          <w:footerReference w:type="default" r:id="rId18"/>
-          <w:headerReference w:type="first" r:id="rId19"/>
-          <w:footerReference w:type="first" r:id="rId20"/>
+          <w:headerReference w:type="default" r:id="rId21"/>
+          <w:footerReference w:type="default" r:id="rId22"/>
+          <w:headerReference w:type="first" r:id="rId23"/>
+          <w:footerReference w:type="first" r:id="rId24"/>
           <w:pgSz w:w="11906" w:h="16838"/>
           <w:pgMar w:top="1985" w:right="1134" w:bottom="1418" w:left="1134" w:header="567" w:footer="567" w:gutter="0"/>
           <w:cols w:space="720"/>
@@ -13019,7 +12074,7 @@
                     </pic:cNvPicPr>
                   </pic:nvPicPr>
                   <pic:blipFill>
-                    <a:blip r:embed="rId8" cstate="print">
+                    <a:blip r:embed="rId9" cstate="print">
                       <a:extLst>
                         <a:ext uri="{28A0092B-C50C-407E-A947-70E740481C1C}">
                           <a14:useLocalDpi xmlns:a14="http://schemas.microsoft.com/office/drawing/2010/main" val="0"/>
@@ -13090,13 +12145,8 @@
         <w:t xml:space="preserve"> </w:t>
       </w:r>
       <w:r>
-        <w:t xml:space="preserve">Esempio di diagramma di </w:t>
-      </w:r>
-      <w:proofErr w:type="spellStart"/>
-      <w:r>
-        <w:t>Gantt</w:t>
-      </w:r>
-      <w:proofErr w:type="spellEnd"/>
+        <w:t>Esempio di diagramma di Gantt</w:t>
+      </w:r>
       <w:r>
         <w:t xml:space="preserve"> consuntivo</w:t>
       </w:r>
@@ -13106,8 +12156,8 @@
     <w:p>
       <w:pPr>
         <w:sectPr>
-          <w:headerReference w:type="first" r:id="rId21"/>
-          <w:footerReference w:type="first" r:id="rId22"/>
+          <w:headerReference w:type="first" r:id="rId25"/>
+          <w:footerReference w:type="first" r:id="rId26"/>
           <w:pgSz w:w="16838" w:h="11906" w:orient="landscape"/>
           <w:pgMar w:top="720" w:right="720" w:bottom="720" w:left="720" w:header="567" w:footer="567" w:gutter="0"/>
           <w:cols w:space="720"/>
@@ -13333,13 +12383,8 @@
           <w:numId w:val="7"/>
         </w:numPr>
       </w:pPr>
-      <w:proofErr w:type="spellStart"/>
-      <w:r>
-        <w:t>ev</w:t>
-      </w:r>
-      <w:proofErr w:type="spellEnd"/>
-      <w:r>
-        <w:t>. Numero di edizione,</w:t>
+      <w:r>
+        <w:t>ev. Numero di edizione,</w:t>
       </w:r>
     </w:p>
     <w:p>
@@ -13401,15 +12446,7 @@
         </w:numPr>
       </w:pPr>
       <w:r>
-        <w:t xml:space="preserve">URL del sito (se troppo lungo solo dominio, </w:t>
-      </w:r>
-      <w:proofErr w:type="spellStart"/>
-      <w:r>
-        <w:t>evt</w:t>
-      </w:r>
-      <w:proofErr w:type="spellEnd"/>
-      <w:r>
-        <w:t xml:space="preserve"> completo nel diario),</w:t>
+        <w:t>URL del sito (se troppo lungo solo dominio, evt completo nel diario),</w:t>
       </w:r>
     </w:p>
     <w:p>
@@ -13589,15 +12626,7 @@
           </w:tcPr>
           <w:p>
             <w:r>
-              <w:t xml:space="preserve">American Standard Code for Information </w:t>
-            </w:r>
-            <w:proofErr w:type="spellStart"/>
-            <w:r>
-              <w:t>Interchange</w:t>
-            </w:r>
-            <w:proofErr w:type="spellEnd"/>
-            <w:r>
-              <w:t>, codice per la codifica di caratteri.</w:t>
+              <w:t>American Standard Code for Information Interchange, codice per la codifica di caratteri.</w:t>
             </w:r>
           </w:p>
         </w:tc>
@@ -13674,21 +12703,8 @@
             <w:tcW w:w="7081" w:type="dxa"/>
           </w:tcPr>
           <w:p>
-            <w:proofErr w:type="spellStart"/>
-            <w:r>
-              <w:t>Zettabyte</w:t>
-            </w:r>
-            <w:proofErr w:type="spellEnd"/>
-            <w:r>
-              <w:t xml:space="preserve"> File System, filesystem </w:t>
-            </w:r>
-            <w:proofErr w:type="spellStart"/>
-            <w:r>
-              <w:t>opernsource</w:t>
-            </w:r>
-            <w:proofErr w:type="spellEnd"/>
-            <w:r>
-              <w:t xml:space="preserve"> a 128 bit con funzionalità avanzate.</w:t>
+            <w:r>
+              <w:t>Zettabyte File System, filesystem opernsource a 128 bit con funzionalità avanzate.</w:t>
             </w:r>
           </w:p>
         </w:tc>
@@ -14158,16 +13174,11 @@
         </w:numPr>
       </w:pPr>
       <w:r>
-        <w:t xml:space="preserve">Mandato e/o </w:t>
-      </w:r>
-      <w:proofErr w:type="spellStart"/>
-      <w:r>
-        <w:t>Qd</w:t>
+        <w:t>Mandato e/o Qd</w:t>
       </w:r>
       <w:r>
         <w:t>C</w:t>
       </w:r>
-      <w:proofErr w:type="spellEnd"/>
     </w:p>
     <w:p>
       <w:pPr>
@@ -14198,8 +13209,8 @@
       </w:pPr>
     </w:p>
     <w:sectPr>
-      <w:headerReference w:type="first" r:id="rId23"/>
-      <w:footerReference w:type="first" r:id="rId24"/>
+      <w:headerReference w:type="first" r:id="rId27"/>
+      <w:footerReference w:type="first" r:id="rId28"/>
       <w:pgSz w:w="11906" w:h="16838"/>
       <w:pgMar w:top="1985" w:right="1134" w:bottom="1418" w:left="1134" w:header="567" w:footer="567" w:gutter="0"/>
       <w:cols w:space="720"/>
@@ -14372,19 +13383,11 @@
               <w:lang w:val="it-IT"/>
             </w:rPr>
           </w:pPr>
-          <w:proofErr w:type="spellStart"/>
           <w:r>
             <w:rPr>
               <w:lang w:val="it-IT"/>
             </w:rPr>
-            <w:t>Brutal</w:t>
-          </w:r>
-          <w:proofErr w:type="spellEnd"/>
-          <w:r>
-            <w:rPr>
-              <w:lang w:val="it-IT"/>
-            </w:rPr>
-            <w:t xml:space="preserve"> Bumper Cars (BBC)</w:t>
+            <w:t>Brutal Bumper Cars (BBC)</w:t>
           </w:r>
         </w:p>
       </w:tc>
@@ -14819,7 +13822,7 @@
         <w:noProof/>
         <w:sz w:val="20"/>
       </w:rPr>
-      <w:t>11.09.2026</w:t>
+      <w:t>14.09.2026</w:t>
     </w:r>
     <w:r>
       <w:rPr>
@@ -15047,7 +14050,7 @@
         <w:noProof/>
         <w:sz w:val="20"/>
       </w:rPr>
-      <w:t>11.09.2026</w:t>
+      <w:t>14.09.2026</w:t>
     </w:r>
     <w:r>
       <w:rPr>
@@ -15426,23 +14429,13 @@
               <w:sz w:val="20"/>
             </w:rPr>
           </w:pPr>
-          <w:proofErr w:type="spellStart"/>
           <w:r>
             <w:rPr>
               <w:rFonts w:cs="Arial"/>
               <w:b/>
               <w:sz w:val="20"/>
             </w:rPr>
-            <w:t>Brutal</w:t>
-          </w:r>
-          <w:proofErr w:type="spellEnd"/>
-          <w:r>
-            <w:rPr>
-              <w:rFonts w:cs="Arial"/>
-              <w:b/>
-              <w:sz w:val="20"/>
-            </w:rPr>
-            <w:t xml:space="preserve"> Bumper Cars (BBC)</w:t>
+            <w:t>Brutal Bumper Cars (BBC)</w:t>
           </w:r>
         </w:p>
       </w:tc>
@@ -21153,7 +20146,6 @@
   <w:style w:type="character" w:default="1" w:styleId="Carpredefinitoparagrafo">
     <w:name w:val="Default Paragraph Font"/>
     <w:uiPriority w:val="1"/>
-    <w:semiHidden/>
     <w:unhideWhenUsed/>
   </w:style>
   <w:style w:type="table" w:default="1" w:styleId="Tabellanormale">

</xml_diff>

<commit_message>
Sprint 1 Review Update
</commit_message>
<xml_diff>
--- a/3_Documentazione/Documentazione.docx
+++ b/3_Documentazione/Documentazione.docx
@@ -4099,7 +4099,10 @@
         </w:numPr>
       </w:pPr>
       <w:r>
-        <w:t>Dal menu principale voglio poter aprire le impostazioni di gioco.</w:t>
+        <w:t>V</w:t>
+      </w:r>
+      <w:r>
+        <w:t>oglio poter aprire le impostazioni di gioco.</w:t>
       </w:r>
     </w:p>
     <w:p>
@@ -7874,59 +7877,6 @@
           </w:p>
         </w:tc>
       </w:tr>
-      <w:tr>
-        <w:tc>
-          <w:tcPr>
-            <w:tcW w:w="9644" w:type="dxa"/>
-            <w:gridSpan w:val="6"/>
-          </w:tcPr>
-          <w:p>
-            <w:pPr>
-              <w:rPr>
-                <w:b/>
-              </w:rPr>
-            </w:pPr>
-            <w:r>
-              <w:rPr>
-                <w:b/>
-              </w:rPr>
-              <w:t>Sotto requisiti</w:t>
-            </w:r>
-          </w:p>
-        </w:tc>
-      </w:tr>
-      <w:tr>
-        <w:tc>
-          <w:tcPr>
-            <w:tcW w:w="1519" w:type="dxa"/>
-            <w:shd w:val="clear" w:color="auto" w:fill="D9D9D9" w:themeFill="background1" w:themeFillShade="D9"/>
-          </w:tcPr>
-          <w:p>
-            <w:pPr>
-              <w:rPr>
-                <w:b/>
-              </w:rPr>
-            </w:pPr>
-            <w:r>
-              <w:rPr>
-                <w:b/>
-              </w:rPr>
-              <w:t>001</w:t>
-            </w:r>
-          </w:p>
-        </w:tc>
-        <w:tc>
-          <w:tcPr>
-            <w:tcW w:w="8125" w:type="dxa"/>
-            <w:gridSpan w:val="5"/>
-          </w:tcPr>
-          <w:p>
-            <w:r>
-              <w:t>Richiede il menu principale (Req-01).</w:t>
-            </w:r>
-          </w:p>
-        </w:tc>
-      </w:tr>
     </w:tbl>
     <w:p>
       <w:pPr>
@@ -8118,59 +8068,6 @@
           <w:p>
             <w:r>
               <w:t>Tabella dedicata consultabile dal giocatore per monitorare i propri progressi e i dati di gioco aggiornati (es. partite giocate, avversari eliminati).</w:t>
-            </w:r>
-          </w:p>
-        </w:tc>
-      </w:tr>
-      <w:tr>
-        <w:tc>
-          <w:tcPr>
-            <w:tcW w:w="9644" w:type="dxa"/>
-            <w:gridSpan w:val="6"/>
-          </w:tcPr>
-          <w:p>
-            <w:pPr>
-              <w:rPr>
-                <w:b/>
-              </w:rPr>
-            </w:pPr>
-            <w:r>
-              <w:rPr>
-                <w:b/>
-              </w:rPr>
-              <w:t>Sotto requisiti</w:t>
-            </w:r>
-          </w:p>
-        </w:tc>
-      </w:tr>
-      <w:tr>
-        <w:tc>
-          <w:tcPr>
-            <w:tcW w:w="1519" w:type="dxa"/>
-            <w:shd w:val="clear" w:color="auto" w:fill="D9D9D9" w:themeFill="background1" w:themeFillShade="D9"/>
-          </w:tcPr>
-          <w:p>
-            <w:pPr>
-              <w:rPr>
-                <w:b/>
-              </w:rPr>
-            </w:pPr>
-            <w:r>
-              <w:rPr>
-                <w:b/>
-              </w:rPr>
-              <w:t>001</w:t>
-            </w:r>
-          </w:p>
-        </w:tc>
-        <w:tc>
-          <w:tcPr>
-            <w:tcW w:w="8125" w:type="dxa"/>
-            <w:gridSpan w:val="5"/>
-          </w:tcPr>
-          <w:p>
-            <w:r>
-              <w:t>Richiede il menu principale (Req-01).</w:t>
             </w:r>
           </w:p>
         </w:tc>
@@ -10462,15 +10359,7 @@
                               <w:fldChar w:fldCharType="end"/>
                             </w:r>
                             <w:r>
-                              <w:t xml:space="preserve"> </w:t>
-                            </w:r>
-                            <w:proofErr w:type="spellStart"/>
-                            <w:r>
-                              <w:t>Gantt</w:t>
-                            </w:r>
-                            <w:proofErr w:type="spellEnd"/>
-                            <w:r>
-                              <w:t xml:space="preserve"> Preventivo</w:t>
+                              <w:t xml:space="preserve"> Gantt Preventivo</w:t>
                             </w:r>
                             <w:bookmarkEnd w:id="14"/>
                           </w:p>
@@ -10645,7 +10534,7 @@
           <w:lang w:val="it-CH"/>
         </w:rPr>
       </w:pPr>
-      <w:bookmarkStart w:id="16" w:name="_Toc240960164"/>
+      <w:bookmarkStart w:id="15" w:name="_Toc240960164"/>
       <w:r>
         <w:rPr>
           <w:lang w:val="it-CH"/>
@@ -10653,72 +10542,72 @@
         <w:lastRenderedPageBreak/>
         <w:t>Analisi dei mezzi</w:t>
       </w:r>
+      <w:bookmarkEnd w:id="15"/>
+    </w:p>
+    <w:p>
+      <w:pPr>
+        <w:spacing w:after="160" w:line="278" w:lineRule="auto"/>
+      </w:pPr>
+      <w:bookmarkStart w:id="16" w:name="_Toc413411419"/>
+      <w:r>
+        <w:t>Per la realizzazione del progetto sono stati utilizzat</w:t>
+      </w:r>
+      <w:r>
+        <w:t>i</w:t>
+      </w:r>
+      <w:r>
+        <w:t xml:space="preserve"> </w:t>
+      </w:r>
+      <w:r>
+        <w:t>2</w:t>
+      </w:r>
+      <w:r>
+        <w:t xml:space="preserve"> PC scolastici con </w:t>
+      </w:r>
+      <w:proofErr w:type="spellStart"/>
+      <w:r>
+        <w:t>Unity</w:t>
+      </w:r>
+      <w:proofErr w:type="spellEnd"/>
+      <w:r>
+        <w:t>. Il debugging è effettuato direttamente sul</w:t>
+      </w:r>
+      <w:r>
+        <w:t xml:space="preserve"> game </w:t>
+      </w:r>
+      <w:proofErr w:type="spellStart"/>
+      <w:r>
+        <w:t>engine</w:t>
+      </w:r>
+      <w:proofErr w:type="spellEnd"/>
+      <w:r>
+        <w:t xml:space="preserve"> </w:t>
+      </w:r>
+      <w:proofErr w:type="spellStart"/>
+      <w:r>
+        <w:t>Unity</w:t>
+      </w:r>
+      <w:proofErr w:type="spellEnd"/>
+      <w:r>
+        <w:t>, oltretutto sono stati anche eseguiti dei test su dei computer personali con delle prestazioni minori rispetto a quelli scolastici.</w:t>
+      </w:r>
+    </w:p>
+    <w:p>
+      <w:pPr>
+        <w:pStyle w:val="Titolo3"/>
+        <w:rPr>
+          <w:lang w:val="it-CH"/>
+        </w:rPr>
+      </w:pPr>
+      <w:bookmarkStart w:id="17" w:name="_Toc240960165"/>
+      <w:r>
+        <w:rPr>
+          <w:lang w:val="it-CH"/>
+        </w:rPr>
+        <w:t>Software</w:t>
+      </w:r>
       <w:bookmarkEnd w:id="16"/>
-    </w:p>
-    <w:p>
-      <w:pPr>
-        <w:spacing w:after="160" w:line="278" w:lineRule="auto"/>
-      </w:pPr>
-      <w:bookmarkStart w:id="17" w:name="_Toc413411419"/>
-      <w:r>
-        <w:t>Per la realizzazione del progetto sono stati utilizzat</w:t>
-      </w:r>
-      <w:r>
-        <w:t>i</w:t>
-      </w:r>
-      <w:r>
-        <w:t xml:space="preserve"> </w:t>
-      </w:r>
-      <w:r>
-        <w:t>2</w:t>
-      </w:r>
-      <w:r>
-        <w:t xml:space="preserve"> PC scolastici con </w:t>
-      </w:r>
-      <w:proofErr w:type="spellStart"/>
-      <w:r>
-        <w:t>Unity</w:t>
-      </w:r>
-      <w:proofErr w:type="spellEnd"/>
-      <w:r>
-        <w:t>. Il debugging è effettuato direttamente sul</w:t>
-      </w:r>
-      <w:r>
-        <w:t xml:space="preserve"> game </w:t>
-      </w:r>
-      <w:proofErr w:type="spellStart"/>
-      <w:r>
-        <w:t>engine</w:t>
-      </w:r>
-      <w:proofErr w:type="spellEnd"/>
-      <w:r>
-        <w:t xml:space="preserve"> </w:t>
-      </w:r>
-      <w:proofErr w:type="spellStart"/>
-      <w:r>
-        <w:t>Unity</w:t>
-      </w:r>
-      <w:proofErr w:type="spellEnd"/>
-      <w:r>
-        <w:t>, oltretutto sono stati anche eseguiti dei test su dei computer personali con delle prestazioni minori rispetto a quelli scolastici.</w:t>
-      </w:r>
-    </w:p>
-    <w:p>
-      <w:pPr>
-        <w:pStyle w:val="Titolo3"/>
-        <w:rPr>
-          <w:lang w:val="it-CH"/>
-        </w:rPr>
-      </w:pPr>
-      <w:bookmarkStart w:id="18" w:name="_Toc240960165"/>
-      <w:r>
-        <w:rPr>
-          <w:lang w:val="it-CH"/>
-        </w:rPr>
-        <w:t>Software</w:t>
-      </w:r>
       <w:bookmarkEnd w:id="17"/>
-      <w:bookmarkEnd w:id="18"/>
     </w:p>
     <w:tbl>
       <w:tblPr>
@@ -10911,19 +10800,19 @@
           <w:lang w:val="it-CH"/>
         </w:rPr>
       </w:pPr>
-      <w:bookmarkStart w:id="19" w:name="_Toc413411420"/>
-      <w:bookmarkStart w:id="20" w:name="_Toc240960166"/>
+      <w:bookmarkStart w:id="18" w:name="_Toc413411420"/>
+      <w:bookmarkStart w:id="19" w:name="_Toc240960166"/>
       <w:r>
         <w:rPr>
           <w:lang w:val="it-CH"/>
         </w:rPr>
         <w:t>Hardware</w:t>
       </w:r>
+      <w:bookmarkEnd w:id="18"/>
       <w:bookmarkEnd w:id="19"/>
-      <w:bookmarkEnd w:id="20"/>
-    </w:p>
-    <w:p>
-      <w:bookmarkStart w:id="21" w:name="_Toc429059808"/>
+    </w:p>
+    <w:p>
+      <w:bookmarkStart w:id="20" w:name="_Toc429059808"/>
       <w:r>
         <w:t xml:space="preserve">PC Windows 11 </w:t>
       </w:r>
@@ -10965,14 +10854,16 @@
       <w:pPr>
         <w:pStyle w:val="Titolo1"/>
       </w:pPr>
-      <w:bookmarkStart w:id="22" w:name="_Toc240960167"/>
+      <w:bookmarkStart w:id="21" w:name="_Toc240960167"/>
       <w:r>
         <w:lastRenderedPageBreak/>
         <w:t>Progettazione</w:t>
       </w:r>
+      <w:bookmarkEnd w:id="20"/>
       <w:bookmarkEnd w:id="21"/>
-      <w:bookmarkEnd w:id="22"/>
-    </w:p>
+    </w:p>
+    <w:bookmarkStart w:id="22" w:name="_Toc429059810"/>
+    <w:bookmarkStart w:id="23" w:name="_Toc240960168"/>
     <w:p>
       <w:pPr>
         <w:pStyle w:val="Titolo2"/>
@@ -10980,8 +10871,6 @@
           <w:lang w:val="it-CH"/>
         </w:rPr>
       </w:pPr>
-      <w:bookmarkStart w:id="23" w:name="_Toc429059810"/>
-      <w:bookmarkStart w:id="24" w:name="_Toc240960168"/>
       <w:r>
         <w:rPr>
           <w:noProof/>
@@ -11033,7 +10922,7 @@
                                 <w:lang w:val="it-IT"/>
                               </w:rPr>
                             </w:pPr>
-                            <w:bookmarkStart w:id="25" w:name="_Toc240960144"/>
+                            <w:bookmarkStart w:id="24" w:name="_Toc240960144"/>
                             <w:r>
                               <w:t xml:space="preserve">Figura </w:t>
                             </w:r>
@@ -11064,7 +10953,7 @@
                               </w:rPr>
                               <w:t xml:space="preserve"> DataBase</w:t>
                             </w:r>
-                            <w:bookmarkEnd w:id="25"/>
+                            <w:bookmarkEnd w:id="24"/>
                           </w:p>
                         </w:txbxContent>
                       </wps:txbx>
@@ -11218,8 +11107,8 @@
         </w:rPr>
         <w:t>Design dei dati e database</w:t>
       </w:r>
+      <w:bookmarkEnd w:id="22"/>
       <w:bookmarkEnd w:id="23"/>
-      <w:bookmarkEnd w:id="24"/>
     </w:p>
     <w:p>
       <w:pPr>
@@ -11353,54 +11242,46 @@
           <w:lang w:val="it-CH"/>
         </w:rPr>
       </w:pPr>
-      <w:bookmarkStart w:id="27" w:name="_Toc429059811"/>
-      <w:bookmarkStart w:id="28" w:name="_Toc240960169"/>
+      <w:bookmarkStart w:id="25" w:name="_Toc429059811"/>
+      <w:bookmarkStart w:id="26" w:name="_Toc240960169"/>
       <w:r>
         <w:rPr>
           <w:lang w:val="it-CH"/>
         </w:rPr>
         <w:t>Design delle interfacce</w:t>
       </w:r>
+      <w:bookmarkEnd w:id="25"/>
+      <w:bookmarkEnd w:id="26"/>
+    </w:p>
+    <w:p>
+      <w:r>
+        <w:t>Abbiamo deciso di mantenere uno stile a tema arancione per il gioco.</w:t>
+      </w:r>
+    </w:p>
+    <w:p>
+      <w:r>
+        <w:t>Le griglie sono la nostra focalizzazione, portando una UI pulita a tutte le interfacce presenti.</w:t>
+      </w:r>
+    </w:p>
+    <w:p>
+      <w:r>
+        <w:t>Cerchiamo di mantenere facile l’utilizzo delle interfacce per l’utente.</w:t>
+      </w:r>
+    </w:p>
+    <w:p>
+      <w:r>
+        <w:t>Le seguenti immagini sono generati per bozza tramite Gemini, non sono vincolanti nel risultato che sarà presente a fine sviluppo.</w:t>
+      </w:r>
+    </w:p>
+    <w:p>
+      <w:pPr>
+        <w:pStyle w:val="Titolo3"/>
+      </w:pPr>
+      <w:bookmarkStart w:id="27" w:name="_Toc240960170"/>
+      <w:r>
+        <w:t>Statistiche</w:t>
+      </w:r>
       <w:bookmarkEnd w:id="27"/>
-      <w:bookmarkEnd w:id="28"/>
-    </w:p>
-    <w:p>
-      <w:r>
-        <w:t>Abbiamo deciso di mantenere uno stile a tema arancione per il gioco.</w:t>
-      </w:r>
-    </w:p>
-    <w:p>
-      <w:r>
-        <w:t>Le griglie sono la nostra focalizzazione, portando una UI pulita a tutte le interfacce presenti.</w:t>
-      </w:r>
-    </w:p>
-    <w:p>
-      <w:r>
-        <w:t>Cerchiamo di mantenere facile l’utilizzo delle interfacce per l’utente.</w:t>
-      </w:r>
-    </w:p>
-    <w:p>
-      <w:r>
-        <w:t xml:space="preserve">Le seguenti immagini </w:t>
-      </w:r>
-      <w:proofErr w:type="gramStart"/>
-      <w:r>
-        <w:t>sono generati</w:t>
-      </w:r>
-      <w:proofErr w:type="gramEnd"/>
-      <w:r>
-        <w:t xml:space="preserve"> per bozza tramite Gemini, non sono vincolanti nel risultato che sarà presente a fine sviluppo.</w:t>
-      </w:r>
-    </w:p>
-    <w:p>
-      <w:pPr>
-        <w:pStyle w:val="Titolo3"/>
-      </w:pPr>
-      <w:bookmarkStart w:id="29" w:name="_Toc240960170"/>
-      <w:r>
-        <w:t>Statistiche</w:t>
-      </w:r>
-      <w:bookmarkEnd w:id="29"/>
     </w:p>
     <w:p>
       <w:pPr>
@@ -11411,7 +11292,7 @@
           <w:noProof/>
         </w:rPr>
         <w:drawing>
-          <wp:inline distT="0" distB="0" distL="0" distR="0" wp14:anchorId="2BA77E0D" wp14:editId="2CB79885">
+          <wp:inline distT="0" distB="0" distL="0" distR="0" wp14:anchorId="2BA77E0D" wp14:editId="41021398">
             <wp:extent cx="6115050" cy="3276600"/>
             <wp:effectExtent l="0" t="0" r="0" b="0"/>
             <wp:docPr id="11" name="Immagine 11"/>
@@ -11464,7 +11345,7 @@
       <w:pPr>
         <w:pStyle w:val="Didascalia"/>
       </w:pPr>
-      <w:bookmarkStart w:id="30" w:name="_Toc240960145"/>
+      <w:bookmarkStart w:id="28" w:name="_Toc240960145"/>
       <w:r>
         <w:t xml:space="preserve">Figura </w:t>
       </w:r>
@@ -11500,19 +11381,19 @@
       <w:r>
         <w:t>Statistiche</w:t>
       </w:r>
-      <w:bookmarkEnd w:id="30"/>
+      <w:bookmarkEnd w:id="28"/>
     </w:p>
     <w:p/>
     <w:p>
       <w:pPr>
         <w:pStyle w:val="Titolo3"/>
       </w:pPr>
-      <w:bookmarkStart w:id="31" w:name="_Toc240960171"/>
+      <w:bookmarkStart w:id="29" w:name="_Toc240960171"/>
       <w:r>
         <w:lastRenderedPageBreak/>
         <w:t>Impostazioni</w:t>
       </w:r>
-      <w:bookmarkEnd w:id="31"/>
+      <w:bookmarkEnd w:id="29"/>
     </w:p>
     <w:p>
       <w:pPr>
@@ -11580,7 +11461,7 @@
           <w:lang w:val="it-IT"/>
         </w:rPr>
       </w:pPr>
-      <w:bookmarkStart w:id="32" w:name="_Toc240960146"/>
+      <w:bookmarkStart w:id="30" w:name="_Toc240960146"/>
       <w:r>
         <w:t xml:space="preserve">Figura </w:t>
       </w:r>
@@ -11616,18 +11497,18 @@
       <w:r>
         <w:t>Impostazioni</w:t>
       </w:r>
-      <w:bookmarkEnd w:id="32"/>
+      <w:bookmarkEnd w:id="30"/>
     </w:p>
     <w:p/>
     <w:p>
       <w:pPr>
         <w:pStyle w:val="Titolo3"/>
       </w:pPr>
-      <w:bookmarkStart w:id="33" w:name="_Toc240960172"/>
+      <w:bookmarkStart w:id="31" w:name="_Toc240960172"/>
       <w:r>
         <w:t>Homepage</w:t>
       </w:r>
-      <w:bookmarkEnd w:id="33"/>
+      <w:bookmarkEnd w:id="31"/>
     </w:p>
     <w:p>
       <w:pPr>
@@ -11695,7 +11576,7 @@
           <w:lang w:val="it-IT"/>
         </w:rPr>
       </w:pPr>
-      <w:bookmarkStart w:id="34" w:name="_Toc240960147"/>
+      <w:bookmarkStart w:id="32" w:name="_Toc240960147"/>
       <w:r>
         <w:t xml:space="preserve">Figura </w:t>
       </w:r>
@@ -11731,7 +11612,7 @@
       <w:r>
         <w:t>Home</w:t>
       </w:r>
-      <w:bookmarkEnd w:id="34"/>
+      <w:bookmarkEnd w:id="32"/>
     </w:p>
     <w:p>
       <w:r>
@@ -11742,12 +11623,12 @@
       <w:pPr>
         <w:pStyle w:val="Titolo3"/>
       </w:pPr>
-      <w:bookmarkStart w:id="35" w:name="_Toc240960173"/>
+      <w:bookmarkStart w:id="33" w:name="_Toc240960173"/>
       <w:r>
         <w:lastRenderedPageBreak/>
         <w:t>Garage</w:t>
       </w:r>
-      <w:bookmarkEnd w:id="35"/>
+      <w:bookmarkEnd w:id="33"/>
     </w:p>
     <w:p>
       <w:pPr>
@@ -11814,7 +11695,7 @@
           <w:lang w:val="it-IT"/>
         </w:rPr>
       </w:pPr>
-      <w:bookmarkStart w:id="36" w:name="_Toc240960148"/>
+      <w:bookmarkStart w:id="34" w:name="_Toc240960148"/>
       <w:r>
         <w:t xml:space="preserve">Figura </w:t>
       </w:r>
@@ -11855,17 +11736,17 @@
       <w:r>
         <w:t>-Gioco (Garage)</w:t>
       </w:r>
-      <w:bookmarkEnd w:id="36"/>
+      <w:bookmarkEnd w:id="34"/>
     </w:p>
     <w:p>
       <w:pPr>
         <w:pStyle w:val="Titolo3"/>
       </w:pPr>
-      <w:bookmarkStart w:id="37" w:name="_Toc240960174"/>
+      <w:bookmarkStart w:id="35" w:name="_Toc240960174"/>
       <w:r>
         <w:t>In-Game</w:t>
       </w:r>
-      <w:bookmarkEnd w:id="37"/>
+      <w:bookmarkEnd w:id="35"/>
     </w:p>
     <w:p>
       <w:pPr>
@@ -11929,7 +11810,7 @@
       <w:pPr>
         <w:pStyle w:val="Didascalia"/>
       </w:pPr>
-      <w:bookmarkStart w:id="38" w:name="_Toc240960149"/>
+      <w:bookmarkStart w:id="36" w:name="_Toc240960149"/>
       <w:r>
         <w:t xml:space="preserve">Figura </w:t>
       </w:r>
@@ -11965,7 +11846,7 @@
       <w:r>
         <w:t>Interfaccia Gameplay</w:t>
       </w:r>
-      <w:bookmarkEnd w:id="38"/>
+      <w:bookmarkEnd w:id="36"/>
       <w:r>
         <w:br w:type="page"/>
       </w:r>
@@ -11978,8 +11859,8 @@
           <w:lang w:val="it-CH"/>
         </w:rPr>
       </w:pPr>
-      <w:bookmarkStart w:id="39" w:name="_Toc429059812"/>
-      <w:bookmarkStart w:id="40" w:name="_Toc240960175"/>
+      <w:bookmarkStart w:id="37" w:name="_Toc429059812"/>
+      <w:bookmarkStart w:id="38" w:name="_Toc240960175"/>
       <w:r>
         <w:rPr>
           <w:color w:val="FF0000"/>
@@ -11988,8 +11869,8 @@
         <w:lastRenderedPageBreak/>
         <w:t>Design procedurale</w:t>
       </w:r>
-      <w:bookmarkEnd w:id="39"/>
-      <w:bookmarkEnd w:id="40"/>
+      <w:bookmarkEnd w:id="37"/>
+      <w:bookmarkEnd w:id="38"/>
     </w:p>
     <w:p>
       <w:pPr>
@@ -12127,106 +12008,106 @@
       <w:pPr>
         <w:pStyle w:val="Titolo1"/>
       </w:pPr>
-      <w:bookmarkStart w:id="41" w:name="_Toc461179222"/>
-      <w:bookmarkStart w:id="42" w:name="_Toc240960176"/>
+      <w:bookmarkStart w:id="39" w:name="_Toc461179222"/>
+      <w:bookmarkStart w:id="40" w:name="_Toc240960176"/>
       <w:r>
         <w:lastRenderedPageBreak/>
         <w:t>Implementazione</w:t>
       </w:r>
+      <w:bookmarkEnd w:id="39"/>
+      <w:bookmarkEnd w:id="40"/>
+    </w:p>
+    <w:p>
+      <w:r>
+        <w:t>In questo capitolo dovrà essere mostrato come è stato realizzato il lavoro. Questa parte può differenziarsi dalla progettazione in quanto il risultato ottenuto non per forza può essere come era stato progettato.</w:t>
+      </w:r>
+    </w:p>
+    <w:p>
+      <w:r>
+        <w:t xml:space="preserve">Sulla base di queste informazioni il lavoro svolto dovrà essere riproducibile. </w:t>
+      </w:r>
+    </w:p>
+    <w:p>
+      <w:r>
+        <w:t>In questa parte è richiesto l’inserimento di codice sorgente</w:t>
+      </w:r>
+      <w:r>
+        <w:t xml:space="preserve"> - </w:t>
+      </w:r>
+      <w:r>
+        <w:t>P</w:t>
+      </w:r>
+      <w:r>
+        <w:t xml:space="preserve">rint </w:t>
+      </w:r>
+      <w:r>
+        <w:t>S</w:t>
+      </w:r>
+      <w:r>
+        <w:t xml:space="preserve">creen </w:t>
+      </w:r>
+      <w:r>
+        <w:t xml:space="preserve">- </w:t>
+      </w:r>
+      <w:r>
+        <w:t>di maschere solamente per quei passaggi particolarmente significativi e/o critici.</w:t>
+      </w:r>
+    </w:p>
+    <w:p>
+      <w:r>
+        <w:t>Inoltre,</w:t>
+      </w:r>
+      <w:r>
+        <w:t xml:space="preserve"> dovranno essere descritte eventuali varianti di soluzione o scelte di prodotti con motivazione delle scelte.</w:t>
+      </w:r>
+    </w:p>
+    <w:p>
+      <w:r>
+        <w:t>Non deve apparire nessuna forma di guida d’uso di librerie o di componenti utilizzati. Eventualmente questa va allegata.</w:t>
+      </w:r>
+    </w:p>
+    <w:p>
+      <w:r>
+        <w:t>Per eventuali dettagli si possono inserire riferimenti ai diari.</w:t>
+      </w:r>
+    </w:p>
+    <w:p>
+      <w:pPr>
+        <w:pStyle w:val="Titolo1"/>
+        <w:rPr>
+          <w:color w:val="FF0000"/>
+        </w:rPr>
+      </w:pPr>
+      <w:bookmarkStart w:id="41" w:name="_Toc461179223"/>
+      <w:bookmarkStart w:id="42" w:name="_Toc240960177"/>
+      <w:r>
+        <w:rPr>
+          <w:color w:val="FF0000"/>
+        </w:rPr>
+        <w:t>Test</w:t>
+      </w:r>
       <w:bookmarkEnd w:id="41"/>
       <w:bookmarkEnd w:id="42"/>
     </w:p>
     <w:p>
-      <w:r>
-        <w:t>In questo capitolo dovrà essere mostrato come è stato realizzato il lavoro. Questa parte può differenziarsi dalla progettazione in quanto il risultato ottenuto non per forza può essere come era stato progettato.</w:t>
-      </w:r>
-    </w:p>
-    <w:p>
-      <w:r>
-        <w:t xml:space="preserve">Sulla base di queste informazioni il lavoro svolto dovrà essere riproducibile. </w:t>
-      </w:r>
-    </w:p>
-    <w:p>
-      <w:r>
-        <w:t>In questa parte è richiesto l’inserimento di codice sorgente</w:t>
-      </w:r>
-      <w:r>
-        <w:t xml:space="preserve"> - </w:t>
-      </w:r>
-      <w:r>
-        <w:t>P</w:t>
-      </w:r>
-      <w:r>
-        <w:t xml:space="preserve">rint </w:t>
-      </w:r>
-      <w:r>
-        <w:t>S</w:t>
-      </w:r>
-      <w:r>
-        <w:t xml:space="preserve">creen </w:t>
-      </w:r>
-      <w:r>
-        <w:t xml:space="preserve">- </w:t>
-      </w:r>
-      <w:r>
-        <w:t>di maschere solamente per quei passaggi particolarmente significativi e/o critici.</w:t>
-      </w:r>
-    </w:p>
-    <w:p>
-      <w:r>
-        <w:t>Inoltre,</w:t>
-      </w:r>
-      <w:r>
-        <w:t xml:space="preserve"> dovranno essere descritte eventuali varianti di soluzione o scelte di prodotti con motivazione delle scelte.</w:t>
-      </w:r>
-    </w:p>
-    <w:p>
-      <w:r>
-        <w:t>Non deve apparire nessuna forma di guida d’uso di librerie o di componenti utilizzati. Eventualmente questa va allegata.</w:t>
-      </w:r>
-    </w:p>
-    <w:p>
-      <w:r>
-        <w:t>Per eventuali dettagli si possono inserire riferimenti ai diari.</w:t>
-      </w:r>
-    </w:p>
-    <w:p>
-      <w:pPr>
-        <w:pStyle w:val="Titolo1"/>
+      <w:pPr>
+        <w:pStyle w:val="Titolo2"/>
         <w:rPr>
           <w:color w:val="FF0000"/>
-        </w:rPr>
-      </w:pPr>
-      <w:bookmarkStart w:id="43" w:name="_Toc461179223"/>
-      <w:bookmarkStart w:id="44" w:name="_Toc240960177"/>
+          <w:lang w:val="it-CH"/>
+        </w:rPr>
+      </w:pPr>
+      <w:bookmarkStart w:id="43" w:name="_Toc461179224"/>
+      <w:bookmarkStart w:id="44" w:name="_Toc240960178"/>
       <w:r>
         <w:rPr>
           <w:color w:val="FF0000"/>
-        </w:rPr>
-        <w:t>Test</w:t>
+          <w:lang w:val="it-CH"/>
+        </w:rPr>
+        <w:t>Protocollo di test</w:t>
       </w:r>
       <w:bookmarkEnd w:id="43"/>
       <w:bookmarkEnd w:id="44"/>
-    </w:p>
-    <w:p>
-      <w:pPr>
-        <w:pStyle w:val="Titolo2"/>
-        <w:rPr>
-          <w:color w:val="FF0000"/>
-          <w:lang w:val="it-CH"/>
-        </w:rPr>
-      </w:pPr>
-      <w:bookmarkStart w:id="45" w:name="_Toc461179224"/>
-      <w:bookmarkStart w:id="46" w:name="_Toc240960178"/>
-      <w:r>
-        <w:rPr>
-          <w:color w:val="FF0000"/>
-          <w:lang w:val="it-CH"/>
-        </w:rPr>
-        <w:t>Protocollo di test</w:t>
-      </w:r>
-      <w:bookmarkEnd w:id="45"/>
-      <w:bookmarkEnd w:id="46"/>
     </w:p>
     <w:p>
       <w:pPr>
@@ -12664,27 +12545,7 @@
                 <w:szCs w:val="24"/>
                 <w:lang w:val="fr-CH"/>
               </w:rPr>
-              <w:t xml:space="preserve">Store on local </w:t>
-            </w:r>
-            <w:proofErr w:type="gramStart"/>
-            <w:r>
-              <w:rPr>
-                <w:color w:val="FF0000"/>
-                <w:sz w:val="24"/>
-                <w:szCs w:val="24"/>
-                <w:lang w:val="fr-CH"/>
-              </w:rPr>
-              <w:t>PC:</w:t>
-            </w:r>
-            <w:proofErr w:type="gramEnd"/>
-            <w:r>
-              <w:rPr>
-                <w:color w:val="FF0000"/>
-                <w:sz w:val="24"/>
-                <w:szCs w:val="24"/>
-                <w:lang w:val="fr-CH"/>
-              </w:rPr>
-              <w:t xml:space="preserve"> Profile_1.2.001.xml (</w:t>
+              <w:t>Store on local PC: Profile_1.2.001.xml (</w:t>
             </w:r>
             <w:proofErr w:type="spellStart"/>
             <w:r>
@@ -13322,9 +13183,8 @@
                 <w:szCs w:val="24"/>
                 <w:lang w:val="fr-CH" w:eastAsia="ja-JP"/>
               </w:rPr>
-              <w:t xml:space="preserve"> the </w:t>
-            </w:r>
-            <w:proofErr w:type="gramStart"/>
+              <w:t xml:space="preserve"> the SQL:</w:t>
+            </w:r>
             <w:r>
               <w:rPr>
                 <w:rFonts w:eastAsia="MS Mincho"/>
@@ -13333,17 +13193,6 @@
                 <w:szCs w:val="24"/>
                 <w:lang w:val="fr-CH" w:eastAsia="ja-JP"/>
               </w:rPr>
-              <w:t>SQL:</w:t>
-            </w:r>
-            <w:proofErr w:type="gramEnd"/>
-            <w:r>
-              <w:rPr>
-                <w:rFonts w:eastAsia="MS Mincho"/>
-                <w:color w:val="FF0000"/>
-                <w:sz w:val="24"/>
-                <w:szCs w:val="24"/>
-                <w:lang w:val="fr-CH" w:eastAsia="ja-JP"/>
-              </w:rPr>
               <w:br/>
             </w:r>
             <w:r>
@@ -13743,6 +13592,7 @@
                 <w:szCs w:val="24"/>
                 <w:lang w:val="it-CH"/>
               </w:rPr>
+              <w:lastRenderedPageBreak/>
               <w:t>Risultati attesi</w:t>
             </w:r>
           </w:p>
@@ -13909,7 +13759,7 @@
           <w:color w:val="FF0000"/>
         </w:rPr>
       </w:pPr>
-      <w:bookmarkStart w:id="47" w:name="_Toc461179225"/>
+      <w:bookmarkStart w:id="45" w:name="_Toc461179225"/>
       <w:r>
         <w:rPr>
           <w:color w:val="FF0000"/>
@@ -13925,7 +13775,7 @@
           <w:lang w:val="it-CH"/>
         </w:rPr>
       </w:pPr>
-      <w:bookmarkStart w:id="48" w:name="_Toc240960179"/>
+      <w:bookmarkStart w:id="46" w:name="_Toc240960179"/>
       <w:r>
         <w:rPr>
           <w:color w:val="FF0000"/>
@@ -13934,8 +13784,8 @@
         <w:lastRenderedPageBreak/>
         <w:t>Risultati test</w:t>
       </w:r>
-      <w:bookmarkEnd w:id="47"/>
-      <w:bookmarkEnd w:id="48"/>
+      <w:bookmarkEnd w:id="45"/>
+      <w:bookmarkEnd w:id="46"/>
     </w:p>
     <w:p>
       <w:pPr>
@@ -14309,8 +14159,8 @@
           <w:lang w:val="it-CH"/>
         </w:rPr>
       </w:pPr>
-      <w:bookmarkStart w:id="49" w:name="_Toc461179226"/>
-      <w:bookmarkStart w:id="50" w:name="_Toc240960180"/>
+      <w:bookmarkStart w:id="47" w:name="_Toc461179226"/>
+      <w:bookmarkStart w:id="48" w:name="_Toc240960180"/>
       <w:r>
         <w:rPr>
           <w:color w:val="FF0000"/>
@@ -14318,39 +14168,39 @@
         </w:rPr>
         <w:t>Mancanze/limitazioni conosciute</w:t>
       </w:r>
+      <w:bookmarkEnd w:id="47"/>
+      <w:bookmarkEnd w:id="48"/>
+    </w:p>
+    <w:p>
+      <w:pPr>
+        <w:rPr>
+          <w:color w:val="FF0000"/>
+        </w:rPr>
+      </w:pPr>
+      <w:r>
+        <w:rPr>
+          <w:color w:val="FF0000"/>
+        </w:rPr>
+        <w:t>Descrizione con motivazione di eventuali elementi mancanti o non completamente implementati, al di fuori dei test case. Non devono essere riportati gli errori e i problemi riscontrati e poi risolti durante il progetto.</w:t>
+      </w:r>
+    </w:p>
+    <w:p>
+      <w:pPr>
+        <w:pStyle w:val="Titolo1"/>
+        <w:rPr>
+          <w:color w:val="FF0000"/>
+        </w:rPr>
+      </w:pPr>
+      <w:bookmarkStart w:id="49" w:name="_Toc461179227"/>
+      <w:bookmarkStart w:id="50" w:name="_Toc240960181"/>
+      <w:r>
+        <w:rPr>
+          <w:color w:val="FF0000"/>
+        </w:rPr>
+        <w:t>Consuntivo</w:t>
+      </w:r>
       <w:bookmarkEnd w:id="49"/>
       <w:bookmarkEnd w:id="50"/>
-    </w:p>
-    <w:p>
-      <w:pPr>
-        <w:rPr>
-          <w:color w:val="FF0000"/>
-        </w:rPr>
-      </w:pPr>
-      <w:r>
-        <w:rPr>
-          <w:color w:val="FF0000"/>
-        </w:rPr>
-        <w:t>Descrizione con motivazione di eventuali elementi mancanti o non completamente implementati, al di fuori dei test case. Non devono essere riportati gli errori e i problemi riscontrati e poi risolti durante il progetto.</w:t>
-      </w:r>
-    </w:p>
-    <w:p>
-      <w:pPr>
-        <w:pStyle w:val="Titolo1"/>
-        <w:rPr>
-          <w:color w:val="FF0000"/>
-        </w:rPr>
-      </w:pPr>
-      <w:bookmarkStart w:id="51" w:name="_Toc461179227"/>
-      <w:bookmarkStart w:id="52" w:name="_Toc240960181"/>
-      <w:r>
-        <w:rPr>
-          <w:color w:val="FF0000"/>
-        </w:rPr>
-        <w:t>Consuntivo</w:t>
-      </w:r>
-      <w:bookmarkEnd w:id="51"/>
-      <w:bookmarkEnd w:id="52"/>
     </w:p>
     <w:p>
       <w:r>
@@ -14614,8 +14464,8 @@
           <w:color w:val="FF0000"/>
         </w:rPr>
       </w:pPr>
-      <w:bookmarkStart w:id="53" w:name="_Toc461179228"/>
-      <w:bookmarkStart w:id="54" w:name="_Toc240960182"/>
+      <w:bookmarkStart w:id="51" w:name="_Toc461179228"/>
+      <w:bookmarkStart w:id="52" w:name="_Toc240960182"/>
       <w:r>
         <w:rPr>
           <w:color w:val="FF0000"/>
@@ -14623,6 +14473,45 @@
         <w:lastRenderedPageBreak/>
         <w:t>Conclusioni</w:t>
       </w:r>
+      <w:bookmarkEnd w:id="51"/>
+      <w:bookmarkEnd w:id="52"/>
+    </w:p>
+    <w:p>
+      <w:pPr>
+        <w:rPr>
+          <w:color w:val="FF0000"/>
+        </w:rPr>
+      </w:pPr>
+      <w:r>
+        <w:rPr>
+          <w:color w:val="FF0000"/>
+        </w:rPr>
+        <w:t>Quali sono le implicazioni della mia soluzione? Che impatto avrà? Cambierà il mondo? È un successo importante? È solo un’aggiunta marginale o è semplicemente servita per scoprire che questo percorso è stato una perdita di tempo? I risultati ottenuti sono generali, facilmente generalizzabili o sono specifici di un caso particolare? ecc</w:t>
+      </w:r>
+      <w:r>
+        <w:rPr>
+          <w:color w:val="FF0000"/>
+        </w:rPr>
+        <w:t>.</w:t>
+      </w:r>
+    </w:p>
+    <w:p>
+      <w:pPr>
+        <w:pStyle w:val="Titolo2"/>
+        <w:rPr>
+          <w:color w:val="FF0000"/>
+          <w:lang w:val="it-CH"/>
+        </w:rPr>
+      </w:pPr>
+      <w:bookmarkStart w:id="53" w:name="_Toc461179229"/>
+      <w:bookmarkStart w:id="54" w:name="_Toc240960183"/>
+      <w:r>
+        <w:rPr>
+          <w:color w:val="FF0000"/>
+          <w:lang w:val="it-CH"/>
+        </w:rPr>
+        <w:t>Sviluppi futuri</w:t>
+      </w:r>
       <w:bookmarkEnd w:id="53"/>
       <w:bookmarkEnd w:id="54"/>
     </w:p>
@@ -14636,13 +14525,7 @@
         <w:rPr>
           <w:color w:val="FF0000"/>
         </w:rPr>
-        <w:t>Quali sono le implicazioni della mia soluzione? Che impatto avrà? Cambierà il mondo? È un successo importante? È solo un’aggiunta marginale o è semplicemente servita per scoprire che questo percorso è stato una perdita di tempo? I risultati ottenuti sono generali, facilmente generalizzabili o sono specifici di un caso particolare? ecc</w:t>
-      </w:r>
-      <w:r>
-        <w:rPr>
-          <w:color w:val="FF0000"/>
-        </w:rPr>
-        <w:t>.</w:t>
+        <w:t>Migliorie o estensioni che possono essere sviluppate sul prodotto.</w:t>
       </w:r>
     </w:p>
     <w:p>
@@ -14653,14 +14536,14 @@
           <w:lang w:val="it-CH"/>
         </w:rPr>
       </w:pPr>
-      <w:bookmarkStart w:id="55" w:name="_Toc461179229"/>
-      <w:bookmarkStart w:id="56" w:name="_Toc240960183"/>
+      <w:bookmarkStart w:id="55" w:name="_Toc461179230"/>
+      <w:bookmarkStart w:id="56" w:name="_Toc240960184"/>
       <w:r>
         <w:rPr>
           <w:color w:val="FF0000"/>
           <w:lang w:val="it-CH"/>
         </w:rPr>
-        <w:t>Sviluppi futuri</w:t>
+        <w:t>Considerazioni personali</w:t>
       </w:r>
       <w:bookmarkEnd w:id="55"/>
       <w:bookmarkEnd w:id="56"/>
@@ -14675,8 +14558,44 @@
         <w:rPr>
           <w:color w:val="FF0000"/>
         </w:rPr>
-        <w:t>Migliorie o estensioni che possono essere sviluppate sul prodotto.</w:t>
-      </w:r>
+        <w:t>Cosa ho imparato in questo progetto? ecc</w:t>
+      </w:r>
+      <w:r>
+        <w:rPr>
+          <w:color w:val="FF0000"/>
+        </w:rPr>
+        <w:t>.</w:t>
+      </w:r>
+    </w:p>
+    <w:p/>
+    <w:p>
+      <w:pPr>
+        <w:rPr>
+          <w:b/>
+        </w:rPr>
+      </w:pPr>
+      <w:bookmarkStart w:id="57" w:name="_Toc461179231"/>
+      <w:r>
+        <w:br w:type="page"/>
+      </w:r>
+    </w:p>
+    <w:p>
+      <w:pPr>
+        <w:pStyle w:val="Titolo1"/>
+        <w:rPr>
+          <w:color w:val="FF0000"/>
+        </w:rPr>
+      </w:pPr>
+      <w:bookmarkStart w:id="58" w:name="_Toc240960185"/>
+      <w:r>
+        <w:rPr>
+          <w:color w:val="FF0000"/>
+        </w:rPr>
+        <w:lastRenderedPageBreak/>
+        <w:t>Bibliografia</w:t>
+      </w:r>
+      <w:bookmarkEnd w:id="57"/>
+      <w:bookmarkEnd w:id="58"/>
     </w:p>
     <w:p>
       <w:pPr>
@@ -14686,86 +14605,17 @@
           <w:lang w:val="it-CH"/>
         </w:rPr>
       </w:pPr>
-      <w:bookmarkStart w:id="57" w:name="_Toc461179230"/>
-      <w:bookmarkStart w:id="58" w:name="_Toc240960184"/>
+      <w:bookmarkStart w:id="59" w:name="_Toc461179234"/>
+      <w:bookmarkStart w:id="60" w:name="_Toc240960186"/>
       <w:r>
         <w:rPr>
           <w:color w:val="FF0000"/>
           <w:lang w:val="it-CH"/>
         </w:rPr>
-        <w:t>Considerazioni personali</w:t>
-      </w:r>
-      <w:bookmarkEnd w:id="57"/>
-      <w:bookmarkEnd w:id="58"/>
-    </w:p>
-    <w:p>
-      <w:pPr>
-        <w:rPr>
-          <w:color w:val="FF0000"/>
-        </w:rPr>
-      </w:pPr>
-      <w:r>
-        <w:rPr>
-          <w:color w:val="FF0000"/>
-        </w:rPr>
-        <w:t>Cosa ho imparato in questo progetto? ecc</w:t>
-      </w:r>
-      <w:r>
-        <w:rPr>
-          <w:color w:val="FF0000"/>
-        </w:rPr>
-        <w:t>.</w:t>
-      </w:r>
-    </w:p>
-    <w:p/>
-    <w:p>
-      <w:pPr>
-        <w:rPr>
-          <w:b/>
-        </w:rPr>
-      </w:pPr>
-      <w:bookmarkStart w:id="59" w:name="_Toc461179231"/>
-      <w:r>
-        <w:br w:type="page"/>
-      </w:r>
-    </w:p>
-    <w:p>
-      <w:pPr>
-        <w:pStyle w:val="Titolo1"/>
-        <w:rPr>
-          <w:color w:val="FF0000"/>
-        </w:rPr>
-      </w:pPr>
-      <w:bookmarkStart w:id="60" w:name="_Toc240960185"/>
-      <w:r>
-        <w:rPr>
-          <w:color w:val="FF0000"/>
-        </w:rPr>
-        <w:lastRenderedPageBreak/>
-        <w:t>Bibliografia</w:t>
+        <w:t>Sitografia</w:t>
       </w:r>
       <w:bookmarkEnd w:id="59"/>
       <w:bookmarkEnd w:id="60"/>
-    </w:p>
-    <w:p>
-      <w:pPr>
-        <w:pStyle w:val="Titolo2"/>
-        <w:rPr>
-          <w:color w:val="FF0000"/>
-          <w:lang w:val="it-CH"/>
-        </w:rPr>
-      </w:pPr>
-      <w:bookmarkStart w:id="61" w:name="_Toc461179234"/>
-      <w:bookmarkStart w:id="62" w:name="_Toc240960186"/>
-      <w:r>
-        <w:rPr>
-          <w:color w:val="FF0000"/>
-          <w:lang w:val="it-CH"/>
-        </w:rPr>
-        <w:t>Sitografia</w:t>
-      </w:r>
-      <w:bookmarkEnd w:id="61"/>
-      <w:bookmarkEnd w:id="62"/>
     </w:p>
     <w:p>
       <w:pPr>
@@ -14896,7 +14746,7 @@
           <w:lang w:val="fr-CH"/>
         </w:rPr>
       </w:pPr>
-      <w:bookmarkStart w:id="63" w:name="_Toc461179235"/>
+      <w:bookmarkStart w:id="61" w:name="_Toc461179235"/>
     </w:p>
     <w:p>
       <w:pPr>
@@ -14922,7 +14772,7 @@
           <w:color w:val="FF0000"/>
         </w:rPr>
       </w:pPr>
-      <w:bookmarkStart w:id="64" w:name="_Toc240960187"/>
+      <w:bookmarkStart w:id="62" w:name="_Toc240960187"/>
       <w:r>
         <w:rPr>
           <w:color w:val="FF0000"/>
@@ -14930,7 +14780,7 @@
         <w:lastRenderedPageBreak/>
         <w:t>Glossario</w:t>
       </w:r>
-      <w:bookmarkEnd w:id="64"/>
+      <w:bookmarkEnd w:id="62"/>
     </w:p>
     <w:tbl>
       <w:tblPr>
@@ -15216,11 +15066,11 @@
       <w:pPr>
         <w:pStyle w:val="Titolo1"/>
       </w:pPr>
-      <w:bookmarkStart w:id="65" w:name="_Toc240960188"/>
+      <w:bookmarkStart w:id="63" w:name="_Toc240960188"/>
       <w:r>
         <w:t>Indice delle figure</w:t>
       </w:r>
-      <w:bookmarkEnd w:id="65"/>
+      <w:bookmarkEnd w:id="63"/>
     </w:p>
     <w:p>
       <w:pPr>
@@ -15835,15 +15685,15 @@
           <w:color w:val="FF0000"/>
         </w:rPr>
       </w:pPr>
-      <w:bookmarkStart w:id="66" w:name="_Toc240960189"/>
+      <w:bookmarkStart w:id="64" w:name="_Toc240960189"/>
       <w:r>
         <w:rPr>
           <w:color w:val="FF0000"/>
         </w:rPr>
         <w:t>Allegati</w:t>
       </w:r>
-      <w:bookmarkEnd w:id="63"/>
-      <w:bookmarkEnd w:id="66"/>
+      <w:bookmarkEnd w:id="61"/>
+      <w:bookmarkEnd w:id="64"/>
     </w:p>
     <w:p>
       <w:pPr>
@@ -16133,7 +15983,7 @@
         <w:noProof/>
         <w:sz w:val="20"/>
       </w:rPr>
-      <w:t>22.09.2026</w:t>
+      <w:t>28.09.2026</w:t>
     </w:r>
     <w:r>
       <w:rPr>
@@ -16642,7 +16492,7 @@
         <w:noProof/>
         <w:sz w:val="20"/>
       </w:rPr>
-      <w:t>15.09.2026</w:t>
+      <w:t>22.09.2026</w:t>
     </w:r>
     <w:r>
       <w:rPr>
@@ -16870,7 +16720,7 @@
         <w:noProof/>
         <w:sz w:val="20"/>
       </w:rPr>
-      <w:t>15.09.2026</w:t>
+      <w:t>22.09.2026</w:t>
     </w:r>
     <w:r>
       <w:rPr>

</xml_diff>